<commit_message>
docs: address final deliverable review
</commit_message>
<xml_diff>
--- a/docx/final/12_结题报告.docx
+++ b/docx/final/12_结题报告.docx
@@ -1399,6 +1399,40 @@
                 <w:rFonts w:ascii="宋体" w:hAnsi="宋体" w:eastAsia="宋体"/>
                 <w:sz w:val="19"/>
               </w:rPr>
+              <w:t xml:space="preserve">失效概率/生存分析</w:t>
+            </w:r>
+          </w:p>
+        </w:tc>
+        <w:tc>
+          <w:p>
+            <w:pPr>
+              <w:pStyle w:val="Compact"/>
+              <w:ind w:firstLine="0"/>
+              <w:jc w:val="left"/>
+            </w:pPr>
+            <w:r>
+              <w:rPr>
+                <w:rFonts w:ascii="宋体" w:hAnsi="宋体" w:eastAsia="宋体"/>
+                <w:sz w:val="19"/>
+              </w:rPr>
+              <w:t xml:space="preserve">保留 Kaplan-Meier、Cox 等基础接口和文档说明，未作为本轮结题主验收路线</w:t>
+            </w:r>
+          </w:p>
+        </w:tc>
+      </w:tr>
+      <w:tr>
+        <w:tc>
+          <w:p>
+            <w:pPr>
+              <w:pStyle w:val="Compact"/>
+              <w:ind w:firstLine="0"/>
+              <w:jc w:val="left"/>
+            </w:pPr>
+            <w:r>
+              <w:rPr>
+                <w:rFonts w:ascii="宋体" w:hAnsi="宋体" w:eastAsia="宋体"/>
+                <w:sz w:val="19"/>
+              </w:rPr>
               <w:t xml:space="preserve">文档交付</w:t>
             </w:r>
           </w:p>
@@ -2195,6 +2229,447 @@
         <w:t xml:space="preserve">、方向性偏差和相对变化列。</w:t>
       </w:r>
     </w:p>
+    <w:tbl>
+      <w:tblPr>
+        <w:tblStyle w:val="Table"/>
+        <w:tblW w:type="pct" w:w="0.0"/>
+        <w:tblLook w:firstRow="1" w:lastRow="0" w:firstColumn="0" w:lastColumn="0" w:noHBand="0" w:noVBand="0" w:val="0020"/>
+        <w:tblBorders>
+          <w:top w:val="single" w:sz="4" w:space="0" w:color="BFBFBF"/>
+          <w:left w:val="single" w:sz="4" w:space="0" w:color="BFBFBF"/>
+          <w:bottom w:val="single" w:sz="4" w:space="0" w:color="BFBFBF"/>
+          <w:right w:val="single" w:sz="4" w:space="0" w:color="BFBFBF"/>
+          <w:insideH w:val="single" w:sz="4" w:space="0" w:color="BFBFBF"/>
+          <w:insideV w:val="single" w:sz="4" w:space="0" w:color="BFBFBF"/>
+        </w:tblBorders>
+      </w:tblPr>
+      <w:tblGrid/>
+      <w:tr>
+        <w:tc>
+          <w:tcPr>
+            <w:shd w:fill="EAEAEA"/>
+          </w:tcPr>
+          <w:p>
+            <w:pPr>
+              <w:pStyle w:val="Compact"/>
+              <w:ind w:firstLine="0"/>
+              <w:jc w:val="left"/>
+            </w:pPr>
+            <w:r>
+              <w:rPr>
+                <w:rFonts w:ascii="宋体" w:hAnsi="宋体" w:eastAsia="宋体"/>
+                <w:sz w:val="19"/>
+              </w:rPr>
+              <w:t xml:space="preserve">数据集与轴承</w:t>
+            </w:r>
+          </w:p>
+        </w:tc>
+        <w:tc>
+          <w:tcPr>
+            <w:shd w:fill="EAEAEA"/>
+          </w:tcPr>
+          <w:p>
+            <w:pPr>
+              <w:pStyle w:val="Compact"/>
+              <w:ind w:firstLine="0"/>
+              <w:jc w:val="left"/>
+            </w:pPr>
+            <w:r>
+              <w:rPr>
+                <w:rFonts w:ascii="宋体" w:hAnsi="宋体" w:eastAsia="宋体"/>
+                <w:sz w:val="19"/>
+              </w:rPr>
+              <w:t xml:space="preserve">模型</w:t>
+            </w:r>
+          </w:p>
+        </w:tc>
+        <w:tc>
+          <w:tcPr>
+            <w:shd w:fill="EAEAEA"/>
+          </w:tcPr>
+          <w:p>
+            <w:pPr>
+              <w:pStyle w:val="Compact"/>
+              <w:ind w:firstLine="0"/>
+              <w:jc w:val="right"/>
+            </w:pPr>
+            <w:r>
+              <w:rPr>
+                <w:rFonts w:ascii="宋体" w:hAnsi="宋体" w:eastAsia="宋体"/>
+                <w:sz w:val="19"/>
+              </w:rPr>
+              <w:t xml:space="preserve">RMSE</w:t>
+            </w:r>
+          </w:p>
+        </w:tc>
+        <w:tc>
+          <w:tcPr>
+            <w:shd w:fill="EAEAEA"/>
+          </w:tcPr>
+          <w:p>
+            <w:pPr>
+              <w:pStyle w:val="Compact"/>
+              <w:ind w:firstLine="0"/>
+              <w:jc w:val="right"/>
+            </w:pPr>
+            <w:r>
+              <w:rPr>
+                <w:rFonts w:ascii="宋体" w:hAnsi="宋体" w:eastAsia="宋体"/>
+                <w:sz w:val="19"/>
+              </w:rPr>
+              <w:t xml:space="preserve">NormalizedRMSE</w:t>
+            </w:r>
+          </w:p>
+        </w:tc>
+        <w:tc>
+          <w:tcPr>
+            <w:shd w:fill="EAEAEA"/>
+          </w:tcPr>
+          <w:p>
+            <w:pPr>
+              <w:pStyle w:val="Compact"/>
+              <w:ind w:firstLine="0"/>
+              <w:jc w:val="right"/>
+            </w:pPr>
+            <w:r>
+              <w:rPr>
+                <w:rFonts w:ascii="宋体" w:hAnsi="宋体" w:eastAsia="宋体"/>
+                <w:sz w:val="19"/>
+              </w:rPr>
+              <w:t xml:space="preserve">Huang RUL Score</w:t>
+            </w:r>
+          </w:p>
+        </w:tc>
+      </w:tr>
+      <w:tr>
+        <w:tc>
+          <w:p>
+            <w:pPr>
+              <w:pStyle w:val="Compact"/>
+              <w:ind w:firstLine="0"/>
+              <w:jc w:val="left"/>
+            </w:pPr>
+            <w:r>
+              <w:rPr>
+                <w:rFonts w:ascii="宋体" w:hAnsi="宋体" w:eastAsia="宋体"/>
+                <w:sz w:val="19"/>
+              </w:rPr>
+              <w:t xml:space="preserve">XJTU-SY Bearing1_5</w:t>
+            </w:r>
+          </w:p>
+        </w:tc>
+        <w:tc>
+          <w:p>
+            <w:pPr>
+              <w:pStyle w:val="Compact"/>
+              <w:ind w:firstLine="0"/>
+              <w:jc w:val="left"/>
+            </w:pPr>
+            <w:r>
+              <w:rPr>
+                <w:rFonts w:ascii="宋体" w:hAnsi="宋体" w:eastAsia="宋体"/>
+                <w:sz w:val="19"/>
+              </w:rPr>
+              <w:t xml:space="preserve">CNN-LSTM-AM</w:t>
+            </w:r>
+          </w:p>
+        </w:tc>
+        <w:tc>
+          <w:p>
+            <w:pPr>
+              <w:pStyle w:val="Compact"/>
+              <w:ind w:firstLine="0"/>
+              <w:jc w:val="right"/>
+            </w:pPr>
+            <w:r>
+              <w:rPr>
+                <w:rFonts w:ascii="宋体" w:hAnsi="宋体" w:eastAsia="宋体"/>
+                <w:sz w:val="19"/>
+              </w:rPr>
+              <w:t xml:space="preserve">406.302</w:t>
+            </w:r>
+          </w:p>
+        </w:tc>
+        <w:tc>
+          <w:p>
+            <w:pPr>
+              <w:pStyle w:val="Compact"/>
+              <w:ind w:firstLine="0"/>
+              <w:jc w:val="right"/>
+            </w:pPr>
+            <w:r>
+              <w:rPr>
+                <w:rFonts w:ascii="宋体" w:hAnsi="宋体" w:eastAsia="宋体"/>
+                <w:sz w:val="19"/>
+              </w:rPr>
+              <w:t xml:space="preserve">0.615609</w:t>
+            </w:r>
+          </w:p>
+        </w:tc>
+        <w:tc>
+          <w:p>
+            <w:pPr>
+              <w:pStyle w:val="Compact"/>
+              <w:ind w:firstLine="0"/>
+              <w:jc w:val="right"/>
+            </w:pPr>
+            <w:r>
+              <w:rPr>
+                <w:rFonts w:ascii="宋体" w:hAnsi="宋体" w:eastAsia="宋体"/>
+                <w:sz w:val="19"/>
+              </w:rPr>
+              <w:t xml:space="preserve">29.001612</w:t>
+            </w:r>
+          </w:p>
+        </w:tc>
+      </w:tr>
+      <w:tr>
+        <w:tc>
+          <w:p>
+            <w:pPr>
+              <w:pStyle w:val="Compact"/>
+              <w:ind w:firstLine="0"/>
+              <w:jc w:val="left"/>
+            </w:pPr>
+            <w:r>
+              <w:rPr>
+                <w:rFonts w:ascii="宋体" w:hAnsi="宋体" w:eastAsia="宋体"/>
+                <w:sz w:val="19"/>
+              </w:rPr>
+              <w:t xml:space="preserve">XJTU-SY Bearing1_5</w:t>
+            </w:r>
+          </w:p>
+        </w:tc>
+        <w:tc>
+          <w:p>
+            <w:pPr>
+              <w:pStyle w:val="Compact"/>
+              <w:ind w:firstLine="0"/>
+              <w:jc w:val="left"/>
+            </w:pPr>
+            <w:r>
+              <w:rPr>
+                <w:rFonts w:ascii="宋体" w:hAnsi="宋体" w:eastAsia="宋体"/>
+                <w:sz w:val="19"/>
+              </w:rPr>
+              <w:t xml:space="preserve">CNN-LSTM</w:t>
+            </w:r>
+          </w:p>
+        </w:tc>
+        <w:tc>
+          <w:p>
+            <w:pPr>
+              <w:pStyle w:val="Compact"/>
+              <w:ind w:firstLine="0"/>
+              <w:jc w:val="right"/>
+            </w:pPr>
+            <w:r>
+              <w:rPr>
+                <w:rFonts w:ascii="宋体" w:hAnsi="宋体" w:eastAsia="宋体"/>
+                <w:sz w:val="19"/>
+              </w:rPr>
+              <w:t xml:space="preserve">406.503</w:t>
+            </w:r>
+          </w:p>
+        </w:tc>
+        <w:tc>
+          <w:p>
+            <w:pPr>
+              <w:pStyle w:val="Compact"/>
+              <w:ind w:firstLine="0"/>
+              <w:jc w:val="right"/>
+            </w:pPr>
+            <w:r>
+              <w:rPr>
+                <w:rFonts w:ascii="宋体" w:hAnsi="宋体" w:eastAsia="宋体"/>
+                <w:sz w:val="19"/>
+              </w:rPr>
+              <w:t xml:space="preserve">0.615913</w:t>
+            </w:r>
+          </w:p>
+        </w:tc>
+        <w:tc>
+          <w:p>
+            <w:pPr>
+              <w:pStyle w:val="Compact"/>
+              <w:ind w:firstLine="0"/>
+              <w:jc w:val="right"/>
+            </w:pPr>
+            <w:r>
+              <w:rPr>
+                <w:rFonts w:ascii="宋体" w:hAnsi="宋体" w:eastAsia="宋体"/>
+                <w:sz w:val="19"/>
+              </w:rPr>
+              <w:t xml:space="preserve">29.127879</w:t>
+            </w:r>
+          </w:p>
+        </w:tc>
+      </w:tr>
+      <w:tr>
+        <w:tc>
+          <w:p>
+            <w:pPr>
+              <w:pStyle w:val="Compact"/>
+              <w:ind w:firstLine="0"/>
+              <w:jc w:val="left"/>
+            </w:pPr>
+            <w:r>
+              <w:rPr>
+                <w:rFonts w:ascii="宋体" w:hAnsi="宋体" w:eastAsia="宋体"/>
+                <w:sz w:val="19"/>
+              </w:rPr>
+              <w:t xml:space="preserve">PHM2012 Bearing3_1</w:t>
+            </w:r>
+          </w:p>
+        </w:tc>
+        <w:tc>
+          <w:p>
+            <w:pPr>
+              <w:pStyle w:val="Compact"/>
+              <w:ind w:firstLine="0"/>
+              <w:jc w:val="left"/>
+            </w:pPr>
+            <w:r>
+              <w:rPr>
+                <w:rFonts w:ascii="宋体" w:hAnsi="宋体" w:eastAsia="宋体"/>
+                <w:sz w:val="19"/>
+              </w:rPr>
+              <w:t xml:space="preserve">CNN-LSTM-AM</w:t>
+            </w:r>
+          </w:p>
+        </w:tc>
+        <w:tc>
+          <w:p>
+            <w:pPr>
+              <w:pStyle w:val="Compact"/>
+              <w:ind w:firstLine="0"/>
+              <w:jc w:val="right"/>
+            </w:pPr>
+            <w:r>
+              <w:rPr>
+                <w:rFonts w:ascii="宋体" w:hAnsi="宋体" w:eastAsia="宋体"/>
+                <w:sz w:val="19"/>
+              </w:rPr>
+              <w:t xml:space="preserve">651.036</w:t>
+            </w:r>
+          </w:p>
+        </w:tc>
+        <w:tc>
+          <w:p>
+            <w:pPr>
+              <w:pStyle w:val="Compact"/>
+              <w:ind w:firstLine="0"/>
+              <w:jc w:val="right"/>
+            </w:pPr>
+            <w:r>
+              <w:rPr>
+                <w:rFonts w:ascii="宋体" w:hAnsi="宋体" w:eastAsia="宋体"/>
+                <w:sz w:val="19"/>
+              </w:rPr>
+              <w:t xml:space="preserve">0.591850</w:t>
+            </w:r>
+          </w:p>
+        </w:tc>
+        <w:tc>
+          <w:p>
+            <w:pPr>
+              <w:pStyle w:val="Compact"/>
+              <w:ind w:firstLine="0"/>
+              <w:jc w:val="right"/>
+            </w:pPr>
+            <w:r>
+              <w:rPr>
+                <w:rFonts w:ascii="宋体" w:hAnsi="宋体" w:eastAsia="宋体"/>
+                <w:sz w:val="19"/>
+              </w:rPr>
+              <w:t xml:space="preserve">29.447255</w:t>
+            </w:r>
+          </w:p>
+        </w:tc>
+      </w:tr>
+      <w:tr>
+        <w:tc>
+          <w:p>
+            <w:pPr>
+              <w:pStyle w:val="Compact"/>
+              <w:ind w:firstLine="0"/>
+              <w:jc w:val="left"/>
+            </w:pPr>
+            <w:r>
+              <w:rPr>
+                <w:rFonts w:ascii="宋体" w:hAnsi="宋体" w:eastAsia="宋体"/>
+                <w:sz w:val="19"/>
+              </w:rPr>
+              <w:t xml:space="preserve">PHM2012 Bearing3_1</w:t>
+            </w:r>
+          </w:p>
+        </w:tc>
+        <w:tc>
+          <w:p>
+            <w:pPr>
+              <w:pStyle w:val="Compact"/>
+              <w:ind w:firstLine="0"/>
+              <w:jc w:val="left"/>
+            </w:pPr>
+            <w:r>
+              <w:rPr>
+                <w:rFonts w:ascii="宋体" w:hAnsi="宋体" w:eastAsia="宋体"/>
+                <w:sz w:val="19"/>
+              </w:rPr>
+              <w:t xml:space="preserve">CNN-LSTM</w:t>
+            </w:r>
+          </w:p>
+        </w:tc>
+        <w:tc>
+          <w:p>
+            <w:pPr>
+              <w:pStyle w:val="Compact"/>
+              <w:ind w:firstLine="0"/>
+              <w:jc w:val="right"/>
+            </w:pPr>
+            <w:r>
+              <w:rPr>
+                <w:rFonts w:ascii="宋体" w:hAnsi="宋体" w:eastAsia="宋体"/>
+                <w:sz w:val="19"/>
+              </w:rPr>
+              <w:t xml:space="preserve">650.700</w:t>
+            </w:r>
+          </w:p>
+        </w:tc>
+        <w:tc>
+          <w:p>
+            <w:pPr>
+              <w:pStyle w:val="Compact"/>
+              <w:ind w:firstLine="0"/>
+              <w:jc w:val="right"/>
+            </w:pPr>
+            <w:r>
+              <w:rPr>
+                <w:rFonts w:ascii="宋体" w:hAnsi="宋体" w:eastAsia="宋体"/>
+                <w:sz w:val="19"/>
+              </w:rPr>
+              <w:t xml:space="preserve">0.591545</w:t>
+            </w:r>
+          </w:p>
+        </w:tc>
+        <w:tc>
+          <w:p>
+            <w:pPr>
+              <w:pStyle w:val="Compact"/>
+              <w:ind w:firstLine="0"/>
+              <w:jc w:val="right"/>
+            </w:pPr>
+            <w:r>
+              <w:rPr>
+                <w:rFonts w:ascii="宋体" w:hAnsi="宋体" w:eastAsia="宋体"/>
+                <w:sz w:val="19"/>
+              </w:rPr>
+              <w:t xml:space="preserve">29.098391</w:t>
+            </w:r>
+          </w:p>
+        </w:tc>
+      </w:tr>
+    </w:tbl>
     <w:bookmarkEnd w:id="26"/>
     <w:bookmarkStart w:id="27" w:name="xlstm-transformer-复现"/>
     <w:p>
@@ -2310,6 +2785,622 @@
           <w:rFonts w:ascii="宋体" w:hAnsi="宋体" w:eastAsia="宋体"/>
         </w:rPr>
         <w:t xml:space="preserve">三类模型，并输出 RMSE、NormalizedRMSE、R2、PHM2012 Score、Huang RUL Score 和相对 baseline 变化列。</w:t>
+      </w:r>
+    </w:p>
+    <w:tbl>
+      <w:tblPr>
+        <w:tblStyle w:val="Table"/>
+        <w:tblW w:type="pct" w:w="0.0"/>
+        <w:tblLook w:firstRow="1" w:lastRow="0" w:firstColumn="0" w:lastColumn="0" w:noHBand="0" w:noVBand="0" w:val="0020"/>
+        <w:tblBorders>
+          <w:top w:val="single" w:sz="4" w:space="0" w:color="BFBFBF"/>
+          <w:left w:val="single" w:sz="4" w:space="0" w:color="BFBFBF"/>
+          <w:bottom w:val="single" w:sz="4" w:space="0" w:color="BFBFBF"/>
+          <w:right w:val="single" w:sz="4" w:space="0" w:color="BFBFBF"/>
+          <w:insideH w:val="single" w:sz="4" w:space="0" w:color="BFBFBF"/>
+          <w:insideV w:val="single" w:sz="4" w:space="0" w:color="BFBFBF"/>
+        </w:tblBorders>
+      </w:tblPr>
+      <w:tblGrid/>
+      <w:tr>
+        <w:tc>
+          <w:tcPr>
+            <w:shd w:fill="EAEAEA"/>
+          </w:tcPr>
+          <w:p>
+            <w:pPr>
+              <w:pStyle w:val="Compact"/>
+              <w:ind w:firstLine="0"/>
+              <w:jc w:val="left"/>
+            </w:pPr>
+            <w:r>
+              <w:rPr>
+                <w:rFonts w:ascii="宋体" w:hAnsi="宋体" w:eastAsia="宋体"/>
+                <w:sz w:val="19"/>
+              </w:rPr>
+              <w:t xml:space="preserve">数据集/工况</w:t>
+            </w:r>
+          </w:p>
+        </w:tc>
+        <w:tc>
+          <w:tcPr>
+            <w:shd w:fill="EAEAEA"/>
+          </w:tcPr>
+          <w:p>
+            <w:pPr>
+              <w:pStyle w:val="Compact"/>
+              <w:ind w:firstLine="0"/>
+              <w:jc w:val="right"/>
+            </w:pPr>
+            <w:r>
+              <w:rPr>
+                <w:rFonts w:ascii="宋体" w:hAnsi="宋体" w:eastAsia="宋体"/>
+                <w:sz w:val="19"/>
+              </w:rPr>
+              <w:t xml:space="preserve">XLSTM-Transformer RMSE</w:t>
+            </w:r>
+          </w:p>
+        </w:tc>
+        <w:tc>
+          <w:tcPr>
+            <w:shd w:fill="EAEAEA"/>
+          </w:tcPr>
+          <w:p>
+            <w:pPr>
+              <w:pStyle w:val="Compact"/>
+              <w:ind w:firstLine="0"/>
+              <w:jc w:val="right"/>
+            </w:pPr>
+            <w:r>
+              <w:rPr>
+                <w:rFonts w:ascii="宋体" w:hAnsi="宋体" w:eastAsia="宋体"/>
+                <w:sz w:val="19"/>
+              </w:rPr>
+              <w:t xml:space="preserve">NormalizedRMSE</w:t>
+            </w:r>
+          </w:p>
+        </w:tc>
+        <w:tc>
+          <w:tcPr>
+            <w:shd w:fill="EAEAEA"/>
+          </w:tcPr>
+          <w:p>
+            <w:pPr>
+              <w:pStyle w:val="Compact"/>
+              <w:ind w:firstLine="0"/>
+              <w:jc w:val="right"/>
+            </w:pPr>
+            <w:r>
+              <w:rPr>
+                <w:rFonts w:ascii="宋体" w:hAnsi="宋体" w:eastAsia="宋体"/>
+                <w:sz w:val="19"/>
+              </w:rPr>
+              <w:t xml:space="preserve">R2</w:t>
+            </w:r>
+          </w:p>
+        </w:tc>
+        <w:tc>
+          <w:tcPr>
+            <w:shd w:fill="EAEAEA"/>
+          </w:tcPr>
+          <w:p>
+            <w:pPr>
+              <w:pStyle w:val="Compact"/>
+              <w:ind w:firstLine="0"/>
+              <w:jc w:val="right"/>
+            </w:pPr>
+            <w:r>
+              <w:rPr>
+                <w:rFonts w:ascii="宋体" w:hAnsi="宋体" w:eastAsia="宋体"/>
+                <w:sz w:val="19"/>
+              </w:rPr>
+              <w:t xml:space="preserve">Huang RUL Score</w:t>
+            </w:r>
+          </w:p>
+        </w:tc>
+      </w:tr>
+      <w:tr>
+        <w:tc>
+          <w:p>
+            <w:pPr>
+              <w:pStyle w:val="Compact"/>
+              <w:ind w:firstLine="0"/>
+              <w:jc w:val="left"/>
+            </w:pPr>
+            <w:r>
+              <w:rPr>
+                <w:rFonts w:ascii="宋体" w:hAnsi="宋体" w:eastAsia="宋体"/>
+                <w:sz w:val="19"/>
+              </w:rPr>
+              <w:t xml:space="preserve">XJTU-SY Condition 1</w:t>
+            </w:r>
+          </w:p>
+        </w:tc>
+        <w:tc>
+          <w:p>
+            <w:pPr>
+              <w:pStyle w:val="Compact"/>
+              <w:ind w:firstLine="0"/>
+              <w:jc w:val="right"/>
+            </w:pPr>
+            <w:r>
+              <w:rPr>
+                <w:rFonts w:ascii="宋体" w:hAnsi="宋体" w:eastAsia="宋体"/>
+                <w:sz w:val="19"/>
+              </w:rPr>
+              <w:t xml:space="preserve">2280.512</w:t>
+            </w:r>
+          </w:p>
+        </w:tc>
+        <w:tc>
+          <w:p>
+            <w:pPr>
+              <w:pStyle w:val="Compact"/>
+              <w:ind w:firstLine="0"/>
+              <w:jc w:val="right"/>
+            </w:pPr>
+            <w:r>
+              <w:rPr>
+                <w:rFonts w:ascii="宋体" w:hAnsi="宋体" w:eastAsia="宋体"/>
+                <w:sz w:val="19"/>
+              </w:rPr>
+              <w:t xml:space="preserve">0.603310</w:t>
+            </w:r>
+          </w:p>
+        </w:tc>
+        <w:tc>
+          <w:p>
+            <w:pPr>
+              <w:pStyle w:val="Compact"/>
+              <w:ind w:firstLine="0"/>
+              <w:jc w:val="right"/>
+            </w:pPr>
+            <w:r>
+              <w:rPr>
+                <w:rFonts w:ascii="宋体" w:hAnsi="宋体" w:eastAsia="宋体"/>
+                <w:sz w:val="19"/>
+              </w:rPr>
+              <w:t xml:space="preserve">-2.275391</w:t>
+            </w:r>
+          </w:p>
+        </w:tc>
+        <w:tc>
+          <w:p>
+            <w:pPr>
+              <w:pStyle w:val="Compact"/>
+              <w:ind w:firstLine="0"/>
+              <w:jc w:val="right"/>
+            </w:pPr>
+            <w:r>
+              <w:rPr>
+                <w:rFonts w:ascii="宋体" w:hAnsi="宋体" w:eastAsia="宋体"/>
+                <w:sz w:val="19"/>
+              </w:rPr>
+              <w:t xml:space="preserve">27.303331</w:t>
+            </w:r>
+          </w:p>
+        </w:tc>
+      </w:tr>
+      <w:tr>
+        <w:tc>
+          <w:p>
+            <w:pPr>
+              <w:pStyle w:val="Compact"/>
+              <w:ind w:firstLine="0"/>
+              <w:jc w:val="left"/>
+            </w:pPr>
+            <w:r>
+              <w:rPr>
+                <w:rFonts w:ascii="宋体" w:hAnsi="宋体" w:eastAsia="宋体"/>
+                <w:sz w:val="19"/>
+              </w:rPr>
+              <w:t xml:space="preserve">XJTU-SY Condition 2</w:t>
+            </w:r>
+          </w:p>
+        </w:tc>
+        <w:tc>
+          <w:p>
+            <w:pPr>
+              <w:pStyle w:val="Compact"/>
+              <w:ind w:firstLine="0"/>
+              <w:jc w:val="right"/>
+            </w:pPr>
+            <w:r>
+              <w:rPr>
+                <w:rFonts w:ascii="宋体" w:hAnsi="宋体" w:eastAsia="宋体"/>
+                <w:sz w:val="19"/>
+              </w:rPr>
+              <w:t xml:space="preserve">7688.563</w:t>
+            </w:r>
+          </w:p>
+        </w:tc>
+        <w:tc>
+          <w:p>
+            <w:pPr>
+              <w:pStyle w:val="Compact"/>
+              <w:ind w:firstLine="0"/>
+              <w:jc w:val="right"/>
+            </w:pPr>
+            <w:r>
+              <w:rPr>
+                <w:rFonts w:ascii="宋体" w:hAnsi="宋体" w:eastAsia="宋体"/>
+                <w:sz w:val="19"/>
+              </w:rPr>
+              <w:t xml:space="preserve">0.601609</w:t>
+            </w:r>
+          </w:p>
+        </w:tc>
+        <w:tc>
+          <w:p>
+            <w:pPr>
+              <w:pStyle w:val="Compact"/>
+              <w:ind w:firstLine="0"/>
+              <w:jc w:val="right"/>
+            </w:pPr>
+            <w:r>
+              <w:rPr>
+                <w:rFonts w:ascii="宋体" w:hAnsi="宋体" w:eastAsia="宋体"/>
+                <w:sz w:val="19"/>
+              </w:rPr>
+              <w:t xml:space="preserve">-2.257361</w:t>
+            </w:r>
+          </w:p>
+        </w:tc>
+        <w:tc>
+          <w:p>
+            <w:pPr>
+              <w:pStyle w:val="Compact"/>
+              <w:ind w:firstLine="0"/>
+              <w:jc w:val="right"/>
+            </w:pPr>
+            <w:r>
+              <w:rPr>
+                <w:rFonts w:ascii="宋体" w:hAnsi="宋体" w:eastAsia="宋体"/>
+                <w:sz w:val="19"/>
+              </w:rPr>
+              <w:t xml:space="preserve">27.385834</w:t>
+            </w:r>
+          </w:p>
+        </w:tc>
+      </w:tr>
+      <w:tr>
+        <w:tc>
+          <w:p>
+            <w:pPr>
+              <w:pStyle w:val="Compact"/>
+              <w:ind w:firstLine="0"/>
+              <w:jc w:val="left"/>
+            </w:pPr>
+            <w:r>
+              <w:rPr>
+                <w:rFonts w:ascii="宋体" w:hAnsi="宋体" w:eastAsia="宋体"/>
+                <w:sz w:val="19"/>
+              </w:rPr>
+              <w:t xml:space="preserve">XJTU-SY Condition 3</w:t>
+            </w:r>
+          </w:p>
+        </w:tc>
+        <w:tc>
+          <w:p>
+            <w:pPr>
+              <w:pStyle w:val="Compact"/>
+              <w:ind w:firstLine="0"/>
+              <w:jc w:val="right"/>
+            </w:pPr>
+            <w:r>
+              <w:rPr>
+                <w:rFonts w:ascii="宋体" w:hAnsi="宋体" w:eastAsia="宋体"/>
+                <w:sz w:val="19"/>
+              </w:rPr>
+              <w:t xml:space="preserve">5348.922</w:t>
+            </w:r>
+          </w:p>
+        </w:tc>
+        <w:tc>
+          <w:p>
+            <w:pPr>
+              <w:pStyle w:val="Compact"/>
+              <w:ind w:firstLine="0"/>
+              <w:jc w:val="right"/>
+            </w:pPr>
+            <w:r>
+              <w:rPr>
+                <w:rFonts w:ascii="宋体" w:hAnsi="宋体" w:eastAsia="宋体"/>
+                <w:sz w:val="19"/>
+              </w:rPr>
+              <w:t xml:space="preserve">0.602356</w:t>
+            </w:r>
+          </w:p>
+        </w:tc>
+        <w:tc>
+          <w:p>
+            <w:pPr>
+              <w:pStyle w:val="Compact"/>
+              <w:ind w:firstLine="0"/>
+              <w:jc w:val="right"/>
+            </w:pPr>
+            <w:r>
+              <w:rPr>
+                <w:rFonts w:ascii="宋体" w:hAnsi="宋体" w:eastAsia="宋体"/>
+                <w:sz w:val="19"/>
+              </w:rPr>
+              <w:t xml:space="preserve">-2.262244</w:t>
+            </w:r>
+          </w:p>
+        </w:tc>
+        <w:tc>
+          <w:p>
+            <w:pPr>
+              <w:pStyle w:val="Compact"/>
+              <w:ind w:firstLine="0"/>
+              <w:jc w:val="right"/>
+            </w:pPr>
+            <w:r>
+              <w:rPr>
+                <w:rFonts w:ascii="宋体" w:hAnsi="宋体" w:eastAsia="宋体"/>
+                <w:sz w:val="19"/>
+              </w:rPr>
+              <w:t xml:space="preserve">27.354392</w:t>
+            </w:r>
+          </w:p>
+        </w:tc>
+      </w:tr>
+      <w:tr>
+        <w:tc>
+          <w:p>
+            <w:pPr>
+              <w:pStyle w:val="Compact"/>
+              <w:ind w:firstLine="0"/>
+              <w:jc w:val="left"/>
+            </w:pPr>
+            <w:r>
+              <w:rPr>
+                <w:rFonts w:ascii="宋体" w:hAnsi="宋体" w:eastAsia="宋体"/>
+                <w:sz w:val="19"/>
+              </w:rPr>
+              <w:t xml:space="preserve">PHM2012 Condition 1</w:t>
+            </w:r>
+          </w:p>
+        </w:tc>
+        <w:tc>
+          <w:p>
+            <w:pPr>
+              <w:pStyle w:val="Compact"/>
+              <w:ind w:firstLine="0"/>
+              <w:jc w:val="right"/>
+            </w:pPr>
+            <w:r>
+              <w:rPr>
+                <w:rFonts w:ascii="宋体" w:hAnsi="宋体" w:eastAsia="宋体"/>
+                <w:sz w:val="19"/>
+              </w:rPr>
+              <w:t xml:space="preserve">9641.803</w:t>
+            </w:r>
+          </w:p>
+        </w:tc>
+        <w:tc>
+          <w:p>
+            <w:pPr>
+              <w:pStyle w:val="Compact"/>
+              <w:ind w:firstLine="0"/>
+              <w:jc w:val="right"/>
+            </w:pPr>
+            <w:r>
+              <w:rPr>
+                <w:rFonts w:ascii="宋体" w:hAnsi="宋体" w:eastAsia="宋体"/>
+                <w:sz w:val="19"/>
+              </w:rPr>
+              <w:t xml:space="preserve">1.337282</w:t>
+            </w:r>
+          </w:p>
+        </w:tc>
+        <w:tc>
+          <w:p>
+            <w:pPr>
+              <w:pStyle w:val="Compact"/>
+              <w:ind w:firstLine="0"/>
+              <w:jc w:val="right"/>
+            </w:pPr>
+            <w:r>
+              <w:rPr>
+                <w:rFonts w:ascii="宋体" w:hAnsi="宋体" w:eastAsia="宋体"/>
+                <w:sz w:val="19"/>
+              </w:rPr>
+              <w:t xml:space="preserve">-15.110842</w:t>
+            </w:r>
+          </w:p>
+        </w:tc>
+        <w:tc>
+          <w:p>
+            <w:pPr>
+              <w:pStyle w:val="Compact"/>
+              <w:ind w:firstLine="0"/>
+              <w:jc w:val="right"/>
+            </w:pPr>
+            <w:r>
+              <w:rPr>
+                <w:rFonts w:ascii="宋体" w:hAnsi="宋体" w:eastAsia="宋体"/>
+                <w:sz w:val="19"/>
+              </w:rPr>
+              <w:t xml:space="preserve">31.989850</w:t>
+            </w:r>
+          </w:p>
+        </w:tc>
+      </w:tr>
+      <w:tr>
+        <w:tc>
+          <w:p>
+            <w:pPr>
+              <w:pStyle w:val="Compact"/>
+              <w:ind w:firstLine="0"/>
+              <w:jc w:val="left"/>
+            </w:pPr>
+            <w:r>
+              <w:rPr>
+                <w:rFonts w:ascii="宋体" w:hAnsi="宋体" w:eastAsia="宋体"/>
+                <w:sz w:val="19"/>
+              </w:rPr>
+              <w:t xml:space="preserve">PHM2012 Condition 2</w:t>
+            </w:r>
+          </w:p>
+        </w:tc>
+        <w:tc>
+          <w:p>
+            <w:pPr>
+              <w:pStyle w:val="Compact"/>
+              <w:ind w:firstLine="0"/>
+              <w:jc w:val="right"/>
+            </w:pPr>
+            <w:r>
+              <w:rPr>
+                <w:rFonts w:ascii="宋体" w:hAnsi="宋体" w:eastAsia="宋体"/>
+                <w:sz w:val="19"/>
+              </w:rPr>
+              <w:t xml:space="preserve">10065.537</w:t>
+            </w:r>
+          </w:p>
+        </w:tc>
+        <w:tc>
+          <w:p>
+            <w:pPr>
+              <w:pStyle w:val="Compact"/>
+              <w:ind w:firstLine="0"/>
+              <w:jc w:val="right"/>
+            </w:pPr>
+            <w:r>
+              <w:rPr>
+                <w:rFonts w:ascii="宋体" w:hAnsi="宋体" w:eastAsia="宋体"/>
+                <w:sz w:val="19"/>
+              </w:rPr>
+              <w:t xml:space="preserve">2.092627</w:t>
+            </w:r>
+          </w:p>
+        </w:tc>
+        <w:tc>
+          <w:p>
+            <w:pPr>
+              <w:pStyle w:val="Compact"/>
+              <w:ind w:firstLine="0"/>
+              <w:jc w:val="right"/>
+            </w:pPr>
+            <w:r>
+              <w:rPr>
+                <w:rFonts w:ascii="宋体" w:hAnsi="宋体" w:eastAsia="宋体"/>
+                <w:sz w:val="19"/>
+              </w:rPr>
+              <w:t xml:space="preserve">-38.470269</w:t>
+            </w:r>
+          </w:p>
+        </w:tc>
+        <w:tc>
+          <w:p>
+            <w:pPr>
+              <w:pStyle w:val="Compact"/>
+              <w:ind w:firstLine="0"/>
+              <w:jc w:val="right"/>
+            </w:pPr>
+            <w:r>
+              <w:rPr>
+                <w:rFonts w:ascii="宋体" w:hAnsi="宋体" w:eastAsia="宋体"/>
+                <w:sz w:val="19"/>
+              </w:rPr>
+              <w:t xml:space="preserve">31.984371</w:t>
+            </w:r>
+          </w:p>
+        </w:tc>
+      </w:tr>
+      <w:tr>
+        <w:tc>
+          <w:p>
+            <w:pPr>
+              <w:pStyle w:val="Compact"/>
+              <w:ind w:firstLine="0"/>
+              <w:jc w:val="left"/>
+            </w:pPr>
+            <w:r>
+              <w:rPr>
+                <w:rFonts w:ascii="宋体" w:hAnsi="宋体" w:eastAsia="宋体"/>
+                <w:sz w:val="19"/>
+              </w:rPr>
+              <w:t xml:space="preserve">PHM2012 Condition 3</w:t>
+            </w:r>
+          </w:p>
+        </w:tc>
+        <w:tc>
+          <w:p>
+            <w:pPr>
+              <w:pStyle w:val="Compact"/>
+              <w:ind w:firstLine="0"/>
+              <w:jc w:val="right"/>
+            </w:pPr>
+            <w:r>
+              <w:rPr>
+                <w:rFonts w:ascii="宋体" w:hAnsi="宋体" w:eastAsia="宋体"/>
+                <w:sz w:val="19"/>
+              </w:rPr>
+              <w:t xml:space="preserve">1594.675</w:t>
+            </w:r>
+          </w:p>
+        </w:tc>
+        <w:tc>
+          <w:p>
+            <w:pPr>
+              <w:pStyle w:val="Compact"/>
+              <w:ind w:firstLine="0"/>
+              <w:jc w:val="right"/>
+            </w:pPr>
+            <w:r>
+              <w:rPr>
+                <w:rFonts w:ascii="宋体" w:hAnsi="宋体" w:eastAsia="宋体"/>
+                <w:sz w:val="19"/>
+              </w:rPr>
+              <w:t xml:space="preserve">1.130975</w:t>
+            </w:r>
+          </w:p>
+        </w:tc>
+        <w:tc>
+          <w:p>
+            <w:pPr>
+              <w:pStyle w:val="Compact"/>
+              <w:ind w:firstLine="0"/>
+              <w:jc w:val="right"/>
+            </w:pPr>
+            <w:r>
+              <w:rPr>
+                <w:rFonts w:ascii="宋体" w:hAnsi="宋体" w:eastAsia="宋体"/>
+                <w:sz w:val="19"/>
+              </w:rPr>
+              <w:t xml:space="preserve">-10.581817</w:t>
+            </w:r>
+          </w:p>
+        </w:tc>
+        <w:tc>
+          <w:p>
+            <w:pPr>
+              <w:pStyle w:val="Compact"/>
+              <w:ind w:firstLine="0"/>
+              <w:jc w:val="right"/>
+            </w:pPr>
+            <w:r>
+              <w:rPr>
+                <w:rFonts w:ascii="宋体" w:hAnsi="宋体" w:eastAsia="宋体"/>
+                <w:sz w:val="19"/>
+              </w:rPr>
+              <w:t xml:space="preserve">31.883923</w:t>
+            </w:r>
+          </w:p>
+        </w:tc>
+      </w:tr>
+    </w:tbl>
+    <w:p>
+      <w:pPr>
+        <w:pStyle w:val="BodyText"/>
+      </w:pPr>
+      <w:r>
+        <w:rPr>
+          <w:rFonts w:ascii="宋体" w:hAnsi="宋体" w:eastAsia="宋体"/>
+        </w:rPr>
+        <w:t xml:space="preserve">上述结果用于证明复现 workflow 真实运行并输出论文指标。由于本地训练采用小样本和 8 epoch，PHM2012 上 R2 为负，说明当前设置下模型拟合不足，这一点在复现文档中作为限制保留。</w:t>
       </w:r>
     </w:p>
     <w:bookmarkEnd w:id="27"/>
@@ -2820,7 +3911,7 @@
         <w:rPr>
           <w:rFonts w:ascii="宋体" w:hAnsi="宋体" w:eastAsia="宋体"/>
         </w:rPr>
-        <w:t xml:space="preserve">当前重点是 RUL 预测和生存分析接口，离散状态划分仅作为退化阶段辅助，不作为结题主线。</w:t>
+        <w:t xml:space="preserve">当前重点是 RUL 预测；失效概率/生存分析保留基础接口和文档说明，尚未作为结题主线进行充分实验验证。</w:t>
       </w:r>
     </w:p>
     <w:p>

</xml_diff>

<commit_message>
docs: restyle course document exports
</commit_message>
<xml_diff>
--- a/docx/final/12_结题报告.docx
+++ b/docx/final/12_结题报告.docx
@@ -36,9 +36,9 @@
       </w:pPr>
       <w:r>
         <w:rPr>
-          <w:rFonts w:ascii="黑体" w:hAnsi="黑体" w:eastAsia="黑体"/>
+          <w:rFonts w:ascii="宋体" w:hAnsi="宋体" w:eastAsia="宋体"/>
           <w:b/>
-          <w:sz w:val="40"/>
+          <w:sz w:val="48"/>
         </w:rPr>
         <w:t xml:space="preserve">工业轴承设备剩余寿命预测系统的实现：结题报告</w:t>
       </w:r>
@@ -50,7 +50,7 @@
       </w:pPr>
       <w:r>
         <w:rPr>
-          <w:rFonts w:ascii="黑体" w:hAnsi="黑体" w:eastAsia="黑体"/>
+          <w:rFonts w:ascii="宋体" w:hAnsi="宋体" w:eastAsia="宋体"/>
         </w:rPr>
         <w:t xml:space="preserve">文档信息</w:t>
       </w:r>
@@ -61,19 +61,19 @@
         <w:tblW w:type="pct" w:w="0.0"/>
         <w:tblLook w:firstRow="1" w:lastRow="0" w:firstColumn="0" w:lastColumn="0" w:noHBand="0" w:noVBand="0" w:val="0020"/>
         <w:tblBorders>
-          <w:top w:val="single" w:sz="4" w:space="0" w:color="BFBFBF"/>
-          <w:left w:val="single" w:sz="4" w:space="0" w:color="BFBFBF"/>
-          <w:bottom w:val="single" w:sz="4" w:space="0" w:color="BFBFBF"/>
-          <w:right w:val="single" w:sz="4" w:space="0" w:color="BFBFBF"/>
-          <w:insideH w:val="single" w:sz="4" w:space="0" w:color="BFBFBF"/>
-          <w:insideV w:val="single" w:sz="4" w:space="0" w:color="BFBFBF"/>
+          <w:top w:val="single" w:sz="4" w:space="0" w:color="000000"/>
+          <w:left w:val="single" w:sz="4" w:space="0" w:color="000000"/>
+          <w:bottom w:val="single" w:sz="4" w:space="0" w:color="000000"/>
+          <w:right w:val="single" w:sz="4" w:space="0" w:color="000000"/>
+          <w:insideH w:val="single" w:sz="4" w:space="0" w:color="000000"/>
+          <w:insideV w:val="single" w:sz="4" w:space="0" w:color="000000"/>
         </w:tblBorders>
       </w:tblPr>
       <w:tblGrid/>
       <w:tr>
         <w:tc>
           <w:tcPr>
-            <w:shd w:fill="EAEAEA"/>
+            <w:shd w:fill="FFFFFF"/>
           </w:tcPr>
           <w:p>
             <w:pPr>
@@ -84,7 +84,8 @@
             <w:r>
               <w:rPr>
                 <w:rFonts w:ascii="宋体" w:hAnsi="宋体" w:eastAsia="宋体"/>
-                <w:sz w:val="19"/>
+                <w:b/>
+                <w:sz w:val="21"/>
               </w:rPr>
               <w:t xml:space="preserve">项目</w:t>
             </w:r>
@@ -92,7 +93,7 @@
         </w:tc>
         <w:tc>
           <w:tcPr>
-            <w:shd w:fill="EAEAEA"/>
+            <w:shd w:fill="FFFFFF"/>
           </w:tcPr>
           <w:p>
             <w:pPr>
@@ -103,7 +104,8 @@
             <w:r>
               <w:rPr>
                 <w:rFonts w:ascii="宋体" w:hAnsi="宋体" w:eastAsia="宋体"/>
-                <w:sz w:val="19"/>
+                <w:b/>
+                <w:sz w:val="21"/>
               </w:rPr>
               <w:t xml:space="preserve">内容</w:t>
             </w:r>
@@ -121,7 +123,7 @@
             <w:r>
               <w:rPr>
                 <w:rFonts w:ascii="宋体" w:hAnsi="宋体" w:eastAsia="宋体"/>
-                <w:sz w:val="19"/>
+                <w:sz w:val="21"/>
               </w:rPr>
               <w:t xml:space="preserve">文档名称</w:t>
             </w:r>
@@ -137,7 +139,7 @@
             <w:r>
               <w:rPr>
                 <w:rFonts w:ascii="宋体" w:hAnsi="宋体" w:eastAsia="宋体"/>
-                <w:sz w:val="19"/>
+                <w:sz w:val="21"/>
               </w:rPr>
               <w:t xml:space="preserve">结题报告</w:t>
             </w:r>
@@ -155,7 +157,7 @@
             <w:r>
               <w:rPr>
                 <w:rFonts w:ascii="宋体" w:hAnsi="宋体" w:eastAsia="宋体"/>
-                <w:sz w:val="19"/>
+                <w:sz w:val="21"/>
               </w:rPr>
               <w:t xml:space="preserve">文档编号</w:t>
             </w:r>
@@ -171,7 +173,7 @@
             <w:r>
               <w:rPr>
                 <w:rFonts w:ascii="宋体" w:hAnsi="宋体" w:eastAsia="宋体"/>
-                <w:sz w:val="19"/>
+                <w:sz w:val="21"/>
               </w:rPr>
               <w:t xml:space="preserve">SE-PHM-FINAL-12</w:t>
             </w:r>
@@ -189,7 +191,7 @@
             <w:r>
               <w:rPr>
                 <w:rFonts w:ascii="宋体" w:hAnsi="宋体" w:eastAsia="宋体"/>
-                <w:sz w:val="19"/>
+                <w:sz w:val="21"/>
               </w:rPr>
               <w:t xml:space="preserve">文档阶段</w:t>
             </w:r>
@@ -205,7 +207,7 @@
             <w:r>
               <w:rPr>
                 <w:rFonts w:ascii="宋体" w:hAnsi="宋体" w:eastAsia="宋体"/>
-                <w:sz w:val="19"/>
+                <w:sz w:val="21"/>
               </w:rPr>
               <w:t xml:space="preserve">结题</w:t>
             </w:r>
@@ -223,7 +225,7 @@
             <w:r>
               <w:rPr>
                 <w:rFonts w:ascii="宋体" w:hAnsi="宋体" w:eastAsia="宋体"/>
-                <w:sz w:val="19"/>
+                <w:sz w:val="21"/>
               </w:rPr>
               <w:t xml:space="preserve">项目名称</w:t>
             </w:r>
@@ -239,7 +241,7 @@
             <w:r>
               <w:rPr>
                 <w:rFonts w:ascii="宋体" w:hAnsi="宋体" w:eastAsia="宋体"/>
-                <w:sz w:val="19"/>
+                <w:sz w:val="21"/>
               </w:rPr>
               <w:t xml:space="preserve">工业轴承设备剩余寿命预测系统的实现</w:t>
             </w:r>
@@ -257,7 +259,7 @@
             <w:r>
               <w:rPr>
                 <w:rFonts w:ascii="宋体" w:hAnsi="宋体" w:eastAsia="宋体"/>
-                <w:sz w:val="19"/>
+                <w:sz w:val="21"/>
               </w:rPr>
               <w:t xml:space="preserve">课程</w:t>
             </w:r>
@@ -273,7 +275,7 @@
             <w:r>
               <w:rPr>
                 <w:rFonts w:ascii="宋体" w:hAnsi="宋体" w:eastAsia="宋体"/>
-                <w:sz w:val="19"/>
+                <w:sz w:val="21"/>
               </w:rPr>
               <w:t xml:space="preserve">中国科学技术大学软件学院《软件工程》</w:t>
             </w:r>
@@ -291,7 +293,7 @@
             <w:r>
               <w:rPr>
                 <w:rFonts w:ascii="宋体" w:hAnsi="宋体" w:eastAsia="宋体"/>
-                <w:sz w:val="19"/>
+                <w:sz w:val="21"/>
               </w:rPr>
               <w:t xml:space="preserve">指导老师</w:t>
             </w:r>
@@ -307,7 +309,7 @@
             <w:r>
               <w:rPr>
                 <w:rFonts w:ascii="宋体" w:hAnsi="宋体" w:eastAsia="宋体"/>
-                <w:sz w:val="19"/>
+                <w:sz w:val="21"/>
               </w:rPr>
               <w:t xml:space="preserve">zjf</w:t>
             </w:r>
@@ -325,7 +327,7 @@
             <w:r>
               <w:rPr>
                 <w:rFonts w:ascii="宋体" w:hAnsi="宋体" w:eastAsia="宋体"/>
-                <w:sz w:val="19"/>
+                <w:sz w:val="21"/>
               </w:rPr>
               <w:t xml:space="preserve">小组成员</w:t>
             </w:r>
@@ -341,7 +343,7 @@
             <w:r>
               <w:rPr>
                 <w:rFonts w:ascii="宋体" w:hAnsi="宋体" w:eastAsia="宋体"/>
-                <w:sz w:val="19"/>
+                <w:sz w:val="21"/>
               </w:rPr>
               <w:t xml:space="preserve">zyj、cyy、zdh、zy</w:t>
             </w:r>
@@ -359,7 +361,7 @@
             <w:r>
               <w:rPr>
                 <w:rFonts w:ascii="宋体" w:hAnsi="宋体" w:eastAsia="宋体"/>
-                <w:sz w:val="19"/>
+                <w:sz w:val="21"/>
               </w:rPr>
               <w:t xml:space="preserve">文档负责人</w:t>
             </w:r>
@@ -375,7 +377,7 @@
             <w:r>
               <w:rPr>
                 <w:rFonts w:ascii="宋体" w:hAnsi="宋体" w:eastAsia="宋体"/>
-                <w:sz w:val="19"/>
+                <w:sz w:val="21"/>
               </w:rPr>
               <w:t xml:space="preserve">zyj</w:t>
             </w:r>
@@ -393,7 +395,7 @@
             <w:r>
               <w:rPr>
                 <w:rFonts w:ascii="宋体" w:hAnsi="宋体" w:eastAsia="宋体"/>
-                <w:sz w:val="19"/>
+                <w:sz w:val="21"/>
               </w:rPr>
               <w:t xml:space="preserve">参与编写</w:t>
             </w:r>
@@ -409,7 +411,7 @@
             <w:r>
               <w:rPr>
                 <w:rFonts w:ascii="宋体" w:hAnsi="宋体" w:eastAsia="宋体"/>
-                <w:sz w:val="19"/>
+                <w:sz w:val="21"/>
               </w:rPr>
               <w:t xml:space="preserve">cyy、zdh、zy</w:t>
             </w:r>
@@ -427,7 +429,7 @@
             <w:r>
               <w:rPr>
                 <w:rFonts w:ascii="宋体" w:hAnsi="宋体" w:eastAsia="宋体"/>
-                <w:sz w:val="19"/>
+                <w:sz w:val="21"/>
               </w:rPr>
               <w:t xml:space="preserve">版本</w:t>
             </w:r>
@@ -443,7 +445,7 @@
             <w:r>
               <w:rPr>
                 <w:rFonts w:ascii="宋体" w:hAnsi="宋体" w:eastAsia="宋体"/>
-                <w:sz w:val="19"/>
+                <w:sz w:val="21"/>
               </w:rPr>
               <w:t xml:space="preserve">V3.0</w:t>
             </w:r>
@@ -461,7 +463,7 @@
             <w:r>
               <w:rPr>
                 <w:rFonts w:ascii="宋体" w:hAnsi="宋体" w:eastAsia="宋体"/>
-                <w:sz w:val="19"/>
+                <w:sz w:val="21"/>
               </w:rPr>
               <w:t xml:space="preserve">修订日期</w:t>
             </w:r>
@@ -477,7 +479,7 @@
             <w:r>
               <w:rPr>
                 <w:rFonts w:ascii="宋体" w:hAnsi="宋体" w:eastAsia="宋体"/>
-                <w:sz w:val="19"/>
+                <w:sz w:val="21"/>
               </w:rPr>
               <w:t xml:space="preserve">2026-06-14</w:t>
             </w:r>
@@ -495,7 +497,7 @@
             <w:r>
               <w:rPr>
                 <w:rFonts w:ascii="宋体" w:hAnsi="宋体" w:eastAsia="宋体"/>
-                <w:sz w:val="19"/>
+                <w:sz w:val="21"/>
               </w:rPr>
               <w:t xml:space="preserve">归档形式</w:t>
             </w:r>
@@ -511,7 +513,7 @@
             <w:r>
               <w:rPr>
                 <w:rFonts w:ascii="宋体" w:hAnsi="宋体" w:eastAsia="宋体"/>
-                <w:sz w:val="19"/>
+                <w:sz w:val="21"/>
               </w:rPr>
               <w:t xml:space="preserve">Markdown 源文件、PDF、DOCX</w:t>
             </w:r>
@@ -529,7 +531,7 @@
             <w:r>
               <w:rPr>
                 <w:rFonts w:ascii="宋体" w:hAnsi="宋体" w:eastAsia="宋体"/>
-                <w:sz w:val="19"/>
+                <w:sz w:val="21"/>
               </w:rPr>
               <w:t xml:space="preserve">内容基线</w:t>
             </w:r>
@@ -545,7 +547,7 @@
             <w:r>
               <w:rPr>
                 <w:rFonts w:ascii="宋体" w:hAnsi="宋体" w:eastAsia="宋体"/>
-                <w:sz w:val="19"/>
+                <w:sz w:val="21"/>
               </w:rPr>
               <w:t xml:space="preserve">最终成果、数据理解、技术难点、测试和验收总结</w:t>
             </w:r>
@@ -561,7 +563,7 @@
       </w:pPr>
       <w:r>
         <w:rPr>
-          <w:rFonts w:ascii="黑体" w:hAnsi="黑体" w:eastAsia="黑体"/>
+          <w:rFonts w:ascii="宋体" w:hAnsi="宋体" w:eastAsia="宋体"/>
         </w:rPr>
         <w:t xml:space="preserve">修订记录</w:t>
       </w:r>
@@ -572,19 +574,19 @@
         <w:tblW w:type="pct" w:w="0.0"/>
         <w:tblLook w:firstRow="1" w:lastRow="0" w:firstColumn="0" w:lastColumn="0" w:noHBand="0" w:noVBand="0" w:val="0020"/>
         <w:tblBorders>
-          <w:top w:val="single" w:sz="4" w:space="0" w:color="BFBFBF"/>
-          <w:left w:val="single" w:sz="4" w:space="0" w:color="BFBFBF"/>
-          <w:bottom w:val="single" w:sz="4" w:space="0" w:color="BFBFBF"/>
-          <w:right w:val="single" w:sz="4" w:space="0" w:color="BFBFBF"/>
-          <w:insideH w:val="single" w:sz="4" w:space="0" w:color="BFBFBF"/>
-          <w:insideV w:val="single" w:sz="4" w:space="0" w:color="BFBFBF"/>
+          <w:top w:val="single" w:sz="4" w:space="0" w:color="000000"/>
+          <w:left w:val="single" w:sz="4" w:space="0" w:color="000000"/>
+          <w:bottom w:val="single" w:sz="4" w:space="0" w:color="000000"/>
+          <w:right w:val="single" w:sz="4" w:space="0" w:color="000000"/>
+          <w:insideH w:val="single" w:sz="4" w:space="0" w:color="000000"/>
+          <w:insideV w:val="single" w:sz="4" w:space="0" w:color="000000"/>
         </w:tblBorders>
       </w:tblPr>
       <w:tblGrid/>
       <w:tr>
         <w:tc>
           <w:tcPr>
-            <w:shd w:fill="EAEAEA"/>
+            <w:shd w:fill="FFFFFF"/>
           </w:tcPr>
           <w:p>
             <w:pPr>
@@ -595,7 +597,8 @@
             <w:r>
               <w:rPr>
                 <w:rFonts w:ascii="宋体" w:hAnsi="宋体" w:eastAsia="宋体"/>
-                <w:sz w:val="19"/>
+                <w:b/>
+                <w:sz w:val="21"/>
               </w:rPr>
               <w:t xml:space="preserve">版本</w:t>
             </w:r>
@@ -603,7 +606,7 @@
         </w:tc>
         <w:tc>
           <w:tcPr>
-            <w:shd w:fill="EAEAEA"/>
+            <w:shd w:fill="FFFFFF"/>
           </w:tcPr>
           <w:p>
             <w:pPr>
@@ -614,7 +617,8 @@
             <w:r>
               <w:rPr>
                 <w:rFonts w:ascii="宋体" w:hAnsi="宋体" w:eastAsia="宋体"/>
-                <w:sz w:val="19"/>
+                <w:b/>
+                <w:sz w:val="21"/>
               </w:rPr>
               <w:t xml:space="preserve">日期</w:t>
             </w:r>
@@ -622,7 +626,7 @@
         </w:tc>
         <w:tc>
           <w:tcPr>
-            <w:shd w:fill="EAEAEA"/>
+            <w:shd w:fill="FFFFFF"/>
           </w:tcPr>
           <w:p>
             <w:pPr>
@@ -633,7 +637,8 @@
             <w:r>
               <w:rPr>
                 <w:rFonts w:ascii="宋体" w:hAnsi="宋体" w:eastAsia="宋体"/>
-                <w:sz w:val="19"/>
+                <w:b/>
+                <w:sz w:val="21"/>
               </w:rPr>
               <w:t xml:space="preserve">编写人</w:t>
             </w:r>
@@ -641,7 +646,7 @@
         </w:tc>
         <w:tc>
           <w:tcPr>
-            <w:shd w:fill="EAEAEA"/>
+            <w:shd w:fill="FFFFFF"/>
           </w:tcPr>
           <w:p>
             <w:pPr>
@@ -652,7 +657,8 @@
             <w:r>
               <w:rPr>
                 <w:rFonts w:ascii="宋体" w:hAnsi="宋体" w:eastAsia="宋体"/>
-                <w:sz w:val="19"/>
+                <w:b/>
+                <w:sz w:val="21"/>
               </w:rPr>
               <w:t xml:space="preserve">说明</w:t>
             </w:r>
@@ -670,7 +676,7 @@
             <w:r>
               <w:rPr>
                 <w:rFonts w:ascii="宋体" w:hAnsi="宋体" w:eastAsia="宋体"/>
-                <w:sz w:val="19"/>
+                <w:sz w:val="21"/>
               </w:rPr>
               <w:t xml:space="preserve">V1.0</w:t>
             </w:r>
@@ -686,7 +692,7 @@
             <w:r>
               <w:rPr>
                 <w:rFonts w:ascii="宋体" w:hAnsi="宋体" w:eastAsia="宋体"/>
-                <w:sz w:val="19"/>
+                <w:sz w:val="21"/>
               </w:rPr>
               <w:t xml:space="preserve">2025-11-10</w:t>
             </w:r>
@@ -702,7 +708,7 @@
             <w:r>
               <w:rPr>
                 <w:rFonts w:ascii="宋体" w:hAnsi="宋体" w:eastAsia="宋体"/>
-                <w:sz w:val="19"/>
+                <w:sz w:val="21"/>
               </w:rPr>
               <w:t xml:space="preserve">项目组</w:t>
             </w:r>
@@ -718,7 +724,7 @@
             <w:r>
               <w:rPr>
                 <w:rFonts w:ascii="宋体" w:hAnsi="宋体" w:eastAsia="宋体"/>
-                <w:sz w:val="19"/>
+                <w:sz w:val="21"/>
               </w:rPr>
               <w:t xml:space="preserve">完成初版课程文档</w:t>
             </w:r>
@@ -736,7 +742,7 @@
             <w:r>
               <w:rPr>
                 <w:rFonts w:ascii="宋体" w:hAnsi="宋体" w:eastAsia="宋体"/>
-                <w:sz w:val="19"/>
+                <w:sz w:val="21"/>
               </w:rPr>
               <w:t xml:space="preserve">V2.0</w:t>
             </w:r>
@@ -752,7 +758,7 @@
             <w:r>
               <w:rPr>
                 <w:rFonts w:ascii="宋体" w:hAnsi="宋体" w:eastAsia="宋体"/>
-                <w:sz w:val="19"/>
+                <w:sz w:val="21"/>
               </w:rPr>
               <w:t xml:space="preserve">2026-03-12</w:t>
             </w:r>
@@ -768,7 +774,7 @@
             <w:r>
               <w:rPr>
                 <w:rFonts w:ascii="宋体" w:hAnsi="宋体" w:eastAsia="宋体"/>
-                <w:sz w:val="19"/>
+                <w:sz w:val="21"/>
               </w:rPr>
               <w:t xml:space="preserve">项目组</w:t>
             </w:r>
@@ -784,7 +790,7 @@
             <w:r>
               <w:rPr>
                 <w:rFonts w:ascii="宋体" w:hAnsi="宋体" w:eastAsia="宋体"/>
-                <w:sz w:val="19"/>
+                <w:sz w:val="21"/>
               </w:rPr>
               <w:t xml:space="preserve">统一项目名称、技术基线和阶段交付内容</w:t>
             </w:r>
@@ -802,7 +808,7 @@
             <w:r>
               <w:rPr>
                 <w:rFonts w:ascii="宋体" w:hAnsi="宋体" w:eastAsia="宋体"/>
-                <w:sz w:val="19"/>
+                <w:sz w:val="21"/>
               </w:rPr>
               <w:t xml:space="preserve">V3.0</w:t>
             </w:r>
@@ -818,7 +824,7 @@
             <w:r>
               <w:rPr>
                 <w:rFonts w:ascii="宋体" w:hAnsi="宋体" w:eastAsia="宋体"/>
-                <w:sz w:val="19"/>
+                <w:sz w:val="21"/>
               </w:rPr>
               <w:t xml:space="preserve">2026-06-14</w:t>
             </w:r>
@@ -834,7 +840,7 @@
             <w:r>
               <w:rPr>
                 <w:rFonts w:ascii="宋体" w:hAnsi="宋体" w:eastAsia="宋体"/>
-                <w:sz w:val="19"/>
+                <w:sz w:val="21"/>
               </w:rPr>
               <w:t xml:space="preserve">项目组</w:t>
             </w:r>
@@ -850,7 +856,7 @@
             <w:r>
               <w:rPr>
                 <w:rFonts w:ascii="宋体" w:hAnsi="宋体" w:eastAsia="宋体"/>
-                <w:sz w:val="19"/>
+                <w:sz w:val="21"/>
               </w:rPr>
               <w:t xml:space="preserve">参考课程交付样例统一封面与归档格式，补充数据理解、技术难点、测试验收和 DOCX 交付信息</w:t>
             </w:r>
@@ -866,7 +872,7 @@
       </w:pPr>
       <w:r>
         <w:rPr>
-          <w:rFonts w:ascii="黑体" w:hAnsi="黑体" w:eastAsia="黑体"/>
+          <w:rFonts w:ascii="宋体" w:hAnsi="宋体" w:eastAsia="宋体"/>
         </w:rPr>
         <w:t xml:space="preserve">1. 项目概述</w:t>
       </w:r>
@@ -874,6 +880,8 @@
     <w:p>
       <w:pPr>
         <w:pStyle w:val="FirstParagraph"/>
+        <w:spacing w:line="276" w:lineRule="auto" w:after="0"/>
+        <w:ind w:firstLine="420"/>
       </w:pPr>
       <w:r>
         <w:rPr>
@@ -885,6 +893,8 @@
     <w:p>
       <w:pPr>
         <w:pStyle w:val="BodyText"/>
+        <w:spacing w:line="276" w:lineRule="auto" w:after="0"/>
+        <w:ind w:firstLine="420"/>
       </w:pPr>
       <w:r>
         <w:rPr>
@@ -951,7 +961,7 @@
       </w:pPr>
       <w:r>
         <w:rPr>
-          <w:rFonts w:ascii="黑体" w:hAnsi="黑体" w:eastAsia="黑体"/>
+          <w:rFonts w:ascii="宋体" w:hAnsi="宋体" w:eastAsia="宋体"/>
         </w:rPr>
         <w:t xml:space="preserve">2. 完成情况</w:t>
       </w:r>
@@ -959,6 +969,8 @@
     <w:p>
       <w:pPr>
         <w:pStyle w:val="FirstParagraph"/>
+        <w:spacing w:line="276" w:lineRule="auto" w:after="0"/>
+        <w:ind w:firstLine="420"/>
       </w:pPr>
       <w:r>
         <w:rPr>
@@ -973,12 +985,12 @@
         <w:tblW w:type="pct" w:w="5000.0"/>
         <w:tblLook w:firstRow="1" w:lastRow="0" w:firstColumn="0" w:lastColumn="0" w:noHBand="0" w:noVBand="0" w:val="0020"/>
         <w:tblBorders>
-          <w:top w:val="single" w:sz="4" w:space="0" w:color="BFBFBF"/>
-          <w:left w:val="single" w:sz="4" w:space="0" w:color="BFBFBF"/>
-          <w:bottom w:val="single" w:sz="4" w:space="0" w:color="BFBFBF"/>
-          <w:right w:val="single" w:sz="4" w:space="0" w:color="BFBFBF"/>
-          <w:insideH w:val="single" w:sz="4" w:space="0" w:color="BFBFBF"/>
-          <w:insideV w:val="single" w:sz="4" w:space="0" w:color="BFBFBF"/>
+          <w:top w:val="single" w:sz="4" w:space="0" w:color="000000"/>
+          <w:left w:val="single" w:sz="4" w:space="0" w:color="000000"/>
+          <w:bottom w:val="single" w:sz="4" w:space="0" w:color="000000"/>
+          <w:right w:val="single" w:sz="4" w:space="0" w:color="000000"/>
+          <w:insideH w:val="single" w:sz="4" w:space="0" w:color="000000"/>
+          <w:insideV w:val="single" w:sz="4" w:space="0" w:color="000000"/>
         </w:tblBorders>
       </w:tblPr>
       <w:tblGrid>
@@ -988,7 +1000,7 @@
       <w:tr>
         <w:tc>
           <w:tcPr>
-            <w:shd w:fill="EAEAEA"/>
+            <w:shd w:fill="FFFFFF"/>
           </w:tcPr>
           <w:p>
             <w:pPr>
@@ -999,7 +1011,8 @@
             <w:r>
               <w:rPr>
                 <w:rFonts w:ascii="宋体" w:hAnsi="宋体" w:eastAsia="宋体"/>
-                <w:sz w:val="19"/>
+                <w:b/>
+                <w:sz w:val="21"/>
               </w:rPr>
               <w:t xml:space="preserve">模块</w:t>
             </w:r>
@@ -1007,7 +1020,7 @@
         </w:tc>
         <w:tc>
           <w:tcPr>
-            <w:shd w:fill="EAEAEA"/>
+            <w:shd w:fill="FFFFFF"/>
           </w:tcPr>
           <w:p>
             <w:pPr>
@@ -1018,7 +1031,8 @@
             <w:r>
               <w:rPr>
                 <w:rFonts w:ascii="宋体" w:hAnsi="宋体" w:eastAsia="宋体"/>
-                <w:sz w:val="19"/>
+                <w:b/>
+                <w:sz w:val="21"/>
               </w:rPr>
               <w:t xml:space="preserve">完成内容</w:t>
             </w:r>
@@ -1036,7 +1050,7 @@
             <w:r>
               <w:rPr>
                 <w:rFonts w:ascii="宋体" w:hAnsi="宋体" w:eastAsia="宋体"/>
-                <w:sz w:val="19"/>
+                <w:sz w:val="21"/>
               </w:rPr>
               <w:t xml:space="preserve">数据管理</w:t>
             </w:r>
@@ -1052,14 +1066,14 @@
             <w:r>
               <w:rPr>
                 <w:rFonts w:ascii="宋体" w:hAnsi="宋体" w:eastAsia="宋体"/>
-                <w:sz w:val="19"/>
+                <w:sz w:val="21"/>
               </w:rPr>
               <w:t xml:space="preserve">支持</w:t>
             </w:r>
             <w:r>
               <w:rPr>
                 <w:rFonts w:ascii="宋体" w:hAnsi="宋体" w:eastAsia="宋体"/>
-                <w:sz w:val="19"/>
+                <w:sz w:val="21"/>
               </w:rPr>
               <w:t xml:space="preserve"> </w:t>
             </w:r>
@@ -1067,14 +1081,14 @@
               <w:rPr>
                 <w:rStyle w:val="VerbatimChar"/>
                 <w:rFonts w:ascii="宋体" w:hAnsi="宋体" w:eastAsia="宋体"/>
-                <w:sz w:val="19"/>
+                <w:sz w:val="21"/>
               </w:rPr>
               <w:t xml:space="preserve">XJTULoader</w:t>
             </w:r>
             <w:r>
               <w:rPr>
                 <w:rFonts w:ascii="宋体" w:hAnsi="宋体" w:eastAsia="宋体"/>
-                <w:sz w:val="19"/>
+                <w:sz w:val="21"/>
               </w:rPr>
               <w:t xml:space="preserve">、</w:t>
             </w:r>
@@ -1082,14 +1096,14 @@
               <w:rPr>
                 <w:rStyle w:val="VerbatimChar"/>
                 <w:rFonts w:ascii="宋体" w:hAnsi="宋体" w:eastAsia="宋体"/>
-                <w:sz w:val="19"/>
+                <w:sz w:val="21"/>
               </w:rPr>
               <w:t xml:space="preserve">PHM2012Loader</w:t>
             </w:r>
             <w:r>
               <w:rPr>
                 <w:rFonts w:ascii="宋体" w:hAnsi="宋体" w:eastAsia="宋体"/>
-                <w:sz w:val="19"/>
+                <w:sz w:val="21"/>
               </w:rPr>
               <w:t xml:space="preserve">、</w:t>
             </w:r>
@@ -1097,14 +1111,14 @@
               <w:rPr>
                 <w:rStyle w:val="VerbatimChar"/>
                 <w:rFonts w:ascii="宋体" w:hAnsi="宋体" w:eastAsia="宋体"/>
-                <w:sz w:val="19"/>
+                <w:sz w:val="21"/>
               </w:rPr>
               <w:t xml:space="preserve">SyntheticBearingFactory</w:t>
             </w:r>
             <w:r>
               <w:rPr>
                 <w:rFonts w:ascii="宋体" w:hAnsi="宋体" w:eastAsia="宋体"/>
-                <w:sz w:val="19"/>
+                <w:sz w:val="21"/>
               </w:rPr>
               <w:t xml:space="preserve">，并补充真实数据抽样加载能力</w:t>
             </w:r>
@@ -1122,7 +1136,7 @@
             <w:r>
               <w:rPr>
                 <w:rFonts w:ascii="宋体" w:hAnsi="宋体" w:eastAsia="宋体"/>
-                <w:sz w:val="19"/>
+                <w:sz w:val="21"/>
               </w:rPr>
               <w:t xml:space="preserve">预处理</w:t>
             </w:r>
@@ -1138,7 +1152,7 @@
             <w:r>
               <w:rPr>
                 <w:rFonts w:ascii="宋体" w:hAnsi="宋体" w:eastAsia="宋体"/>
-                <w:sz w:val="19"/>
+                <w:sz w:val="21"/>
               </w:rPr>
               <w:t xml:space="preserve">支持鲁棒裁剪、Z-score、Min-Max、滑动窗口切分</w:t>
             </w:r>
@@ -1156,7 +1170,7 @@
             <w:r>
               <w:rPr>
                 <w:rFonts w:ascii="宋体" w:hAnsi="宋体" w:eastAsia="宋体"/>
-                <w:sz w:val="19"/>
+                <w:sz w:val="21"/>
               </w:rPr>
               <w:t xml:space="preserve">特征工程</w:t>
             </w:r>
@@ -1172,7 +1186,7 @@
             <w:r>
               <w:rPr>
                 <w:rFonts w:ascii="宋体" w:hAnsi="宋体" w:eastAsia="宋体"/>
-                <w:sz w:val="19"/>
+                <w:sz w:val="21"/>
               </w:rPr>
               <w:t xml:space="preserve">支持 19 维时域/频域特征，覆盖论文复现所需基础特征</w:t>
             </w:r>
@@ -1190,7 +1204,7 @@
             <w:r>
               <w:rPr>
                 <w:rFonts w:ascii="宋体" w:hAnsi="宋体" w:eastAsia="宋体"/>
-                <w:sz w:val="19"/>
+                <w:sz w:val="21"/>
               </w:rPr>
               <w:t xml:space="preserve">标签构造</w:t>
             </w:r>
@@ -1206,7 +1220,7 @@
             <w:r>
               <w:rPr>
                 <w:rFonts w:ascii="宋体" w:hAnsi="宋体" w:eastAsia="宋体"/>
-                <w:sz w:val="19"/>
+                <w:sz w:val="21"/>
               </w:rPr>
               <w:t xml:space="preserve">支持 RUL 窗口标签、特征序列 RUL 标签、健康指标序列标签、退化阶段标签</w:t>
             </w:r>
@@ -1224,7 +1238,7 @@
             <w:r>
               <w:rPr>
                 <w:rFonts w:ascii="宋体" w:hAnsi="宋体" w:eastAsia="宋体"/>
-                <w:sz w:val="19"/>
+                <w:sz w:val="21"/>
               </w:rPr>
               <w:t xml:space="preserve">模型</w:t>
             </w:r>
@@ -1240,7 +1254,7 @@
             <w:r>
               <w:rPr>
                 <w:rFonts w:ascii="宋体" w:hAnsi="宋体" w:eastAsia="宋体"/>
-                <w:sz w:val="19"/>
+                <w:sz w:val="21"/>
               </w:rPr>
               <w:t xml:space="preserve">支持 CNN、RNN、MLP、Transformer、CNN-LSTM-AM、XLSTM-Transformer 等模型</w:t>
             </w:r>
@@ -1258,7 +1272,7 @@
             <w:r>
               <w:rPr>
                 <w:rFonts w:ascii="宋体" w:hAnsi="宋体" w:eastAsia="宋体"/>
-                <w:sz w:val="19"/>
+                <w:sz w:val="21"/>
               </w:rPr>
               <w:t xml:space="preserve">训练测试</w:t>
             </w:r>
@@ -1274,14 +1288,14 @@
             <w:r>
               <w:rPr>
                 <w:rFonts w:ascii="宋体" w:hAnsi="宋体" w:eastAsia="宋体"/>
-                <w:sz w:val="19"/>
+                <w:sz w:val="21"/>
               </w:rPr>
               <w:t xml:space="preserve">支持统一</w:t>
             </w:r>
             <w:r>
               <w:rPr>
                 <w:rFonts w:ascii="宋体" w:hAnsi="宋体" w:eastAsia="宋体"/>
-                <w:sz w:val="19"/>
+                <w:sz w:val="21"/>
               </w:rPr>
               <w:t xml:space="preserve"> </w:t>
             </w:r>
@@ -1289,14 +1303,14 @@
               <w:rPr>
                 <w:rStyle w:val="VerbatimChar"/>
                 <w:rFonts w:ascii="宋体" w:hAnsi="宋体" w:eastAsia="宋体"/>
-                <w:sz w:val="19"/>
+                <w:sz w:val="21"/>
               </w:rPr>
               <w:t xml:space="preserve">BaseTrainer</w:t>
             </w:r>
             <w:r>
               <w:rPr>
                 <w:rFonts w:ascii="宋体" w:hAnsi="宋体" w:eastAsia="宋体"/>
-                <w:sz w:val="19"/>
+                <w:sz w:val="21"/>
               </w:rPr>
               <w:t xml:space="preserve">、</w:t>
             </w:r>
@@ -1304,14 +1318,14 @@
               <w:rPr>
                 <w:rStyle w:val="VerbatimChar"/>
                 <w:rFonts w:ascii="宋体" w:hAnsi="宋体" w:eastAsia="宋体"/>
-                <w:sz w:val="19"/>
+                <w:sz w:val="21"/>
               </w:rPr>
               <w:t xml:space="preserve">BaseTester</w:t>
             </w:r>
             <w:r>
               <w:rPr>
                 <w:rFonts w:ascii="宋体" w:hAnsi="宋体" w:eastAsia="宋体"/>
-                <w:sz w:val="19"/>
+                <w:sz w:val="21"/>
               </w:rPr>
               <w:t xml:space="preserve">、实验配置记录、历史记录和预测结果导出</w:t>
             </w:r>
@@ -1329,7 +1343,7 @@
             <w:r>
               <w:rPr>
                 <w:rFonts w:ascii="宋体" w:hAnsi="宋体" w:eastAsia="宋体"/>
-                <w:sz w:val="19"/>
+                <w:sz w:val="21"/>
               </w:rPr>
               <w:t xml:space="preserve">评价指标</w:t>
             </w:r>
@@ -1345,7 +1359,7 @@
             <w:r>
               <w:rPr>
                 <w:rFonts w:ascii="宋体" w:hAnsi="宋体" w:eastAsia="宋体"/>
-                <w:sz w:val="19"/>
+                <w:sz w:val="21"/>
               </w:rPr>
               <w:t xml:space="preserve">支持 MAE、RMSE、NormalizedRMSE、R2、SMAPE、Huang RUL Score、PHM/RUL 非对称惩罚 score 和方向性偏差指标</w:t>
             </w:r>
@@ -1363,7 +1377,7 @@
             <w:r>
               <w:rPr>
                 <w:rFonts w:ascii="宋体" w:hAnsi="宋体" w:eastAsia="宋体"/>
-                <w:sz w:val="19"/>
+                <w:sz w:val="21"/>
               </w:rPr>
               <w:t xml:space="preserve">论文复现</w:t>
             </w:r>
@@ -1379,7 +1393,7 @@
             <w:r>
               <w:rPr>
                 <w:rFonts w:ascii="宋体" w:hAnsi="宋体" w:eastAsia="宋体"/>
-                <w:sz w:val="19"/>
+                <w:sz w:val="21"/>
               </w:rPr>
               <w:t xml:space="preserve">完成 CNN-LSTM-AM 与 xLSTM-Transformer 两篇 RUL 论文的工程化复现</w:t>
             </w:r>
@@ -1397,7 +1411,7 @@
             <w:r>
               <w:rPr>
                 <w:rFonts w:ascii="宋体" w:hAnsi="宋体" w:eastAsia="宋体"/>
-                <w:sz w:val="19"/>
+                <w:sz w:val="21"/>
               </w:rPr>
               <w:t xml:space="preserve">失效概率/生存分析</w:t>
             </w:r>
@@ -1413,7 +1427,7 @@
             <w:r>
               <w:rPr>
                 <w:rFonts w:ascii="宋体" w:hAnsi="宋体" w:eastAsia="宋体"/>
-                <w:sz w:val="19"/>
+                <w:sz w:val="21"/>
               </w:rPr>
               <w:t xml:space="preserve">保留 Kaplan-Meier、Cox 等基础接口和文档说明，未作为本轮结题主验收路线</w:t>
             </w:r>
@@ -1431,7 +1445,7 @@
             <w:r>
               <w:rPr>
                 <w:rFonts w:ascii="宋体" w:hAnsi="宋体" w:eastAsia="宋体"/>
-                <w:sz w:val="19"/>
+                <w:sz w:val="21"/>
               </w:rPr>
               <w:t xml:space="preserve">文档交付</w:t>
             </w:r>
@@ -1447,7 +1461,7 @@
             <w:r>
               <w:rPr>
                 <w:rFonts w:ascii="宋体" w:hAnsi="宋体" w:eastAsia="宋体"/>
-                <w:sz w:val="19"/>
+                <w:sz w:val="21"/>
               </w:rPr>
               <w:t xml:space="preserve">完成开题、中期、结题、测试、用户、安装、技术论文和贡献说明文档</w:t>
             </w:r>
@@ -1462,7 +1476,7 @@
       </w:pPr>
       <w:r>
         <w:rPr>
-          <w:rFonts w:ascii="黑体" w:hAnsi="黑体" w:eastAsia="黑体"/>
+          <w:rFonts w:ascii="宋体" w:hAnsi="宋体" w:eastAsia="宋体"/>
         </w:rPr>
         <w:t xml:space="preserve">2.1 数据理解与特征分析成果</w:t>
       </w:r>
@@ -1470,6 +1484,8 @@
     <w:p>
       <w:pPr>
         <w:pStyle w:val="FirstParagraph"/>
+        <w:spacing w:line="276" w:lineRule="auto" w:after="0"/>
+        <w:ind w:firstLine="420"/>
       </w:pPr>
       <w:r>
         <w:rPr>
@@ -1484,12 +1500,12 @@
         <w:tblW w:type="pct" w:w="5000.0"/>
         <w:tblLook w:firstRow="1" w:lastRow="0" w:firstColumn="0" w:lastColumn="0" w:noHBand="0" w:noVBand="0" w:val="0020"/>
         <w:tblBorders>
-          <w:top w:val="single" w:sz="4" w:space="0" w:color="BFBFBF"/>
-          <w:left w:val="single" w:sz="4" w:space="0" w:color="BFBFBF"/>
-          <w:bottom w:val="single" w:sz="4" w:space="0" w:color="BFBFBF"/>
-          <w:right w:val="single" w:sz="4" w:space="0" w:color="BFBFBF"/>
-          <w:insideH w:val="single" w:sz="4" w:space="0" w:color="BFBFBF"/>
-          <w:insideV w:val="single" w:sz="4" w:space="0" w:color="BFBFBF"/>
+          <w:top w:val="single" w:sz="4" w:space="0" w:color="000000"/>
+          <w:left w:val="single" w:sz="4" w:space="0" w:color="000000"/>
+          <w:bottom w:val="single" w:sz="4" w:space="0" w:color="000000"/>
+          <w:right w:val="single" w:sz="4" w:space="0" w:color="000000"/>
+          <w:insideH w:val="single" w:sz="4" w:space="0" w:color="000000"/>
+          <w:insideV w:val="single" w:sz="4" w:space="0" w:color="000000"/>
         </w:tblBorders>
       </w:tblPr>
       <w:tblGrid>
@@ -1501,7 +1517,7 @@
       <w:tr>
         <w:tc>
           <w:tcPr>
-            <w:shd w:fill="EAEAEA"/>
+            <w:shd w:fill="FFFFFF"/>
           </w:tcPr>
           <w:p>
             <w:pPr>
@@ -1512,7 +1528,8 @@
             <w:r>
               <w:rPr>
                 <w:rFonts w:ascii="宋体" w:hAnsi="宋体" w:eastAsia="宋体"/>
-                <w:sz w:val="19"/>
+                <w:b/>
+                <w:sz w:val="21"/>
               </w:rPr>
               <w:t xml:space="preserve">数据集</w:t>
             </w:r>
@@ -1520,7 +1537,7 @@
         </w:tc>
         <w:tc>
           <w:tcPr>
-            <w:shd w:fill="EAEAEA"/>
+            <w:shd w:fill="FFFFFF"/>
           </w:tcPr>
           <w:p>
             <w:pPr>
@@ -1531,7 +1548,8 @@
             <w:r>
               <w:rPr>
                 <w:rFonts w:ascii="宋体" w:hAnsi="宋体" w:eastAsia="宋体"/>
-                <w:sz w:val="19"/>
+                <w:b/>
+                <w:sz w:val="21"/>
               </w:rPr>
               <w:t xml:space="preserve">数据特点</w:t>
             </w:r>
@@ -1539,7 +1557,7 @@
         </w:tc>
         <w:tc>
           <w:tcPr>
-            <w:shd w:fill="EAEAEA"/>
+            <w:shd w:fill="FFFFFF"/>
           </w:tcPr>
           <w:p>
             <w:pPr>
@@ -1550,7 +1568,8 @@
             <w:r>
               <w:rPr>
                 <w:rFonts w:ascii="宋体" w:hAnsi="宋体" w:eastAsia="宋体"/>
-                <w:sz w:val="19"/>
+                <w:b/>
+                <w:sz w:val="21"/>
               </w:rPr>
               <w:t xml:space="preserve">观察到的退化规律</w:t>
             </w:r>
@@ -1558,7 +1577,7 @@
         </w:tc>
         <w:tc>
           <w:tcPr>
-            <w:shd w:fill="EAEAEA"/>
+            <w:shd w:fill="FFFFFF"/>
           </w:tcPr>
           <w:p>
             <w:pPr>
@@ -1569,7 +1588,8 @@
             <w:r>
               <w:rPr>
                 <w:rFonts w:ascii="宋体" w:hAnsi="宋体" w:eastAsia="宋体"/>
-                <w:sz w:val="19"/>
+                <w:b/>
+                <w:sz w:val="21"/>
               </w:rPr>
               <w:t xml:space="preserve">对建模的影响</w:t>
             </w:r>
@@ -1587,7 +1607,7 @@
             <w:r>
               <w:rPr>
                 <w:rFonts w:ascii="宋体" w:hAnsi="宋体" w:eastAsia="宋体"/>
-                <w:sz w:val="19"/>
+                <w:sz w:val="21"/>
               </w:rPr>
               <w:t xml:space="preserve">XJTU-SY</w:t>
             </w:r>
@@ -1603,7 +1623,7 @@
             <w:r>
               <w:rPr>
                 <w:rFonts w:ascii="宋体" w:hAnsi="宋体" w:eastAsia="宋体"/>
-                <w:sz w:val="19"/>
+                <w:sz w:val="21"/>
               </w:rPr>
               <w:t xml:space="preserve">三工况、多个轴承全寿命序列，单快照长，分钟级间隔</w:t>
             </w:r>
@@ -1619,7 +1639,7 @@
             <w:r>
               <w:rPr>
                 <w:rFonts w:ascii="宋体" w:hAnsi="宋体" w:eastAsia="宋体"/>
-                <w:sz w:val="19"/>
+                <w:sz w:val="21"/>
               </w:rPr>
               <w:t xml:space="preserve">以 Bearing1_1 为例，寿命后期 RMS、峰值和综合健康指标明显抬升</w:t>
             </w:r>
@@ -1635,7 +1655,7 @@
             <w:r>
               <w:rPr>
                 <w:rFonts w:ascii="宋体" w:hAnsi="宋体" w:eastAsia="宋体"/>
-                <w:sz w:val="19"/>
+                <w:sz w:val="21"/>
               </w:rPr>
               <w:t xml:space="preserve">适合展示完整退化曲线，训练划分应按轴承或时间顺序组织</w:t>
             </w:r>
@@ -1653,7 +1673,7 @@
             <w:r>
               <w:rPr>
                 <w:rFonts w:ascii="宋体" w:hAnsi="宋体" w:eastAsia="宋体"/>
-                <w:sz w:val="19"/>
+                <w:sz w:val="21"/>
               </w:rPr>
               <w:t xml:space="preserve">PHM2012/FEMTO</w:t>
             </w:r>
@@ -1669,7 +1689,7 @@
             <w:r>
               <w:rPr>
                 <w:rFonts w:ascii="宋体" w:hAnsi="宋体" w:eastAsia="宋体"/>
-                <w:sz w:val="19"/>
+                <w:sz w:val="21"/>
               </w:rPr>
               <w:t xml:space="preserve">文件更密，包含加速度和温度信息，Learning/Test/Full_Test 语义明确</w:t>
             </w:r>
@@ -1685,7 +1705,7 @@
             <w:r>
               <w:rPr>
                 <w:rFonts w:ascii="宋体" w:hAnsi="宋体" w:eastAsia="宋体"/>
-                <w:sz w:val="19"/>
+                <w:sz w:val="21"/>
               </w:rPr>
               <w:t xml:space="preserve">以 Bearing1_1 为例，后期振动强度增强，但曲线更密集、波动更明显</w:t>
             </w:r>
@@ -1701,7 +1721,7 @@
             <w:r>
               <w:rPr>
                 <w:rFonts w:ascii="宋体" w:hAnsi="宋体" w:eastAsia="宋体"/>
-                <w:sz w:val="19"/>
+                <w:sz w:val="21"/>
               </w:rPr>
               <w:t xml:space="preserve">需要 loader 解释 split 语义，并对官方终止 RUL 信息保持可追溯</w:t>
             </w:r>
@@ -1712,6 +1732,8 @@
     <w:p>
       <w:pPr>
         <w:pStyle w:val="BodyText"/>
+        <w:spacing w:line="276" w:lineRule="auto" w:after="0"/>
+        <w:ind w:firstLine="420"/>
       </w:pPr>
       <w:r>
         <w:rPr>
@@ -1728,7 +1750,7 @@
       </w:pPr>
       <w:r>
         <w:rPr>
-          <w:rFonts w:ascii="黑体" w:hAnsi="黑体" w:eastAsia="黑体"/>
+          <w:rFonts w:ascii="宋体" w:hAnsi="宋体" w:eastAsia="宋体"/>
         </w:rPr>
         <w:t xml:space="preserve">2.2 项目难点与解决方案</w:t>
       </w:r>
@@ -1739,19 +1761,19 @@
         <w:tblW w:type="pct" w:w="0.0"/>
         <w:tblLook w:firstRow="1" w:lastRow="0" w:firstColumn="0" w:lastColumn="0" w:noHBand="0" w:noVBand="0" w:val="0020"/>
         <w:tblBorders>
-          <w:top w:val="single" w:sz="4" w:space="0" w:color="BFBFBF"/>
-          <w:left w:val="single" w:sz="4" w:space="0" w:color="BFBFBF"/>
-          <w:bottom w:val="single" w:sz="4" w:space="0" w:color="BFBFBF"/>
-          <w:right w:val="single" w:sz="4" w:space="0" w:color="BFBFBF"/>
-          <w:insideH w:val="single" w:sz="4" w:space="0" w:color="BFBFBF"/>
-          <w:insideV w:val="single" w:sz="4" w:space="0" w:color="BFBFBF"/>
+          <w:top w:val="single" w:sz="4" w:space="0" w:color="000000"/>
+          <w:left w:val="single" w:sz="4" w:space="0" w:color="000000"/>
+          <w:bottom w:val="single" w:sz="4" w:space="0" w:color="000000"/>
+          <w:right w:val="single" w:sz="4" w:space="0" w:color="000000"/>
+          <w:insideH w:val="single" w:sz="4" w:space="0" w:color="000000"/>
+          <w:insideV w:val="single" w:sz="4" w:space="0" w:color="000000"/>
         </w:tblBorders>
       </w:tblPr>
       <w:tblGrid/>
       <w:tr>
         <w:tc>
           <w:tcPr>
-            <w:shd w:fill="EAEAEA"/>
+            <w:shd w:fill="FFFFFF"/>
           </w:tcPr>
           <w:p>
             <w:pPr>
@@ -1762,7 +1784,8 @@
             <w:r>
               <w:rPr>
                 <w:rFonts w:ascii="宋体" w:hAnsi="宋体" w:eastAsia="宋体"/>
-                <w:sz w:val="19"/>
+                <w:b/>
+                <w:sz w:val="21"/>
               </w:rPr>
               <w:t xml:space="preserve">难点</w:t>
             </w:r>
@@ -1770,7 +1793,7 @@
         </w:tc>
         <w:tc>
           <w:tcPr>
-            <w:shd w:fill="EAEAEA"/>
+            <w:shd w:fill="FFFFFF"/>
           </w:tcPr>
           <w:p>
             <w:pPr>
@@ -1781,7 +1804,8 @@
             <w:r>
               <w:rPr>
                 <w:rFonts w:ascii="宋体" w:hAnsi="宋体" w:eastAsia="宋体"/>
-                <w:sz w:val="19"/>
+                <w:b/>
+                <w:sz w:val="21"/>
               </w:rPr>
               <w:t xml:space="preserve">解决原则</w:t>
             </w:r>
@@ -1789,7 +1813,7 @@
         </w:tc>
         <w:tc>
           <w:tcPr>
-            <w:shd w:fill="EAEAEA"/>
+            <w:shd w:fill="FFFFFF"/>
           </w:tcPr>
           <w:p>
             <w:pPr>
@@ -1800,7 +1824,8 @@
             <w:r>
               <w:rPr>
                 <w:rFonts w:ascii="宋体" w:hAnsi="宋体" w:eastAsia="宋体"/>
-                <w:sz w:val="19"/>
+                <w:b/>
+                <w:sz w:val="21"/>
               </w:rPr>
               <w:t xml:space="preserve">实现结果</w:t>
             </w:r>
@@ -1818,7 +1843,7 @@
             <w:r>
               <w:rPr>
                 <w:rFonts w:ascii="宋体" w:hAnsi="宋体" w:eastAsia="宋体"/>
-                <w:sz w:val="19"/>
+                <w:sz w:val="21"/>
               </w:rPr>
               <w:t xml:space="preserve">两个数据集格式不同</w:t>
             </w:r>
@@ -1834,7 +1859,7 @@
             <w:r>
               <w:rPr>
                 <w:rFonts w:ascii="宋体" w:hAnsi="宋体" w:eastAsia="宋体"/>
-                <w:sz w:val="19"/>
+                <w:sz w:val="21"/>
               </w:rPr>
               <w:t xml:space="preserve">将目录差异收敛在 loader 层</w:t>
             </w:r>
@@ -1851,28 +1876,28 @@
               <w:rPr>
                 <w:rStyle w:val="VerbatimChar"/>
                 <w:rFonts w:ascii="宋体" w:hAnsi="宋体" w:eastAsia="宋体"/>
-                <w:sz w:val="19"/>
+                <w:sz w:val="21"/>
               </w:rPr>
               <w:t xml:space="preserve">XJTULoader</w:t>
             </w:r>
             <w:r>
               <w:rPr>
                 <w:rFonts w:ascii="宋体" w:hAnsi="宋体" w:eastAsia="宋体"/>
-                <w:sz w:val="19"/>
+                <w:sz w:val="21"/>
               </w:rPr>
               <w:t xml:space="preserve"> </w:t>
             </w:r>
             <w:r>
               <w:rPr>
                 <w:rFonts w:ascii="宋体" w:hAnsi="宋体" w:eastAsia="宋体"/>
-                <w:sz w:val="19"/>
+                <w:sz w:val="21"/>
               </w:rPr>
               <w:t xml:space="preserve">和</w:t>
             </w:r>
             <w:r>
               <w:rPr>
                 <w:rFonts w:ascii="宋体" w:hAnsi="宋体" w:eastAsia="宋体"/>
-                <w:sz w:val="19"/>
+                <w:sz w:val="21"/>
               </w:rPr>
               <w:t xml:space="preserve"> </w:t>
             </w:r>
@@ -1880,21 +1905,21 @@
               <w:rPr>
                 <w:rStyle w:val="VerbatimChar"/>
                 <w:rFonts w:ascii="宋体" w:hAnsi="宋体" w:eastAsia="宋体"/>
-                <w:sz w:val="19"/>
+                <w:sz w:val="21"/>
               </w:rPr>
               <w:t xml:space="preserve">PHM2012Loader</w:t>
             </w:r>
             <w:r>
               <w:rPr>
                 <w:rFonts w:ascii="宋体" w:hAnsi="宋体" w:eastAsia="宋体"/>
-                <w:sz w:val="19"/>
+                <w:sz w:val="21"/>
               </w:rPr>
               <w:t xml:space="preserve"> </w:t>
             </w:r>
             <w:r>
               <w:rPr>
                 <w:rFonts w:ascii="宋体" w:hAnsi="宋体" w:eastAsia="宋体"/>
-                <w:sz w:val="19"/>
+                <w:sz w:val="21"/>
               </w:rPr>
               <w:t xml:space="preserve">输出统一实体</w:t>
             </w:r>
@@ -1912,7 +1937,7 @@
             <w:r>
               <w:rPr>
                 <w:rFonts w:ascii="宋体" w:hAnsi="宋体" w:eastAsia="宋体"/>
-                <w:sz w:val="19"/>
+                <w:sz w:val="21"/>
               </w:rPr>
               <w:t xml:space="preserve">原始信号长度不同</w:t>
             </w:r>
@@ -1928,7 +1953,7 @@
             <w:r>
               <w:rPr>
                 <w:rFonts w:ascii="宋体" w:hAnsi="宋体" w:eastAsia="宋体"/>
-                <w:sz w:val="19"/>
+                <w:sz w:val="21"/>
               </w:rPr>
               <w:t xml:space="preserve">先提取可解释特征，再组织序列</w:t>
             </w:r>
@@ -1944,14 +1969,14 @@
             <w:r>
               <w:rPr>
                 <w:rFonts w:ascii="宋体" w:hAnsi="宋体" w:eastAsia="宋体"/>
-                <w:sz w:val="19"/>
+                <w:sz w:val="21"/>
               </w:rPr>
               <w:t xml:space="preserve">支持 19 维特征和</w:t>
             </w:r>
             <w:r>
               <w:rPr>
                 <w:rFonts w:ascii="宋体" w:hAnsi="宋体" w:eastAsia="宋体"/>
-                <w:sz w:val="19"/>
+                <w:sz w:val="21"/>
               </w:rPr>
               <w:t xml:space="preserve"> </w:t>
             </w:r>
@@ -1959,7 +1984,7 @@
               <w:rPr>
                 <w:rStyle w:val="VerbatimChar"/>
                 <w:rFonts w:ascii="宋体" w:hAnsi="宋体" w:eastAsia="宋体"/>
-                <w:sz w:val="19"/>
+                <w:sz w:val="21"/>
               </w:rPr>
               <w:t xml:space="preserve">FeatureSequenceRulLabeler</w:t>
             </w:r>
@@ -1977,7 +2002,7 @@
             <w:r>
               <w:rPr>
                 <w:rFonts w:ascii="宋体" w:hAnsi="宋体" w:eastAsia="宋体"/>
-                <w:sz w:val="19"/>
+                <w:sz w:val="21"/>
               </w:rPr>
               <w:t xml:space="preserve">RUL 标签和时间单位易混淆</w:t>
             </w:r>
@@ -1993,7 +2018,7 @@
             <w:r>
               <w:rPr>
                 <w:rFonts w:ascii="宋体" w:hAnsi="宋体" w:eastAsia="宋体"/>
-                <w:sz w:val="19"/>
+                <w:sz w:val="21"/>
               </w:rPr>
               <w:t xml:space="preserve">在标签构造和文档中保留单位说明</w:t>
             </w:r>
@@ -2009,7 +2034,7 @@
             <w:r>
               <w:rPr>
                 <w:rFonts w:ascii="宋体" w:hAnsi="宋体" w:eastAsia="宋体"/>
-                <w:sz w:val="19"/>
+                <w:sz w:val="21"/>
               </w:rPr>
               <w:t xml:space="preserve">notebook 和测试均检查 prediction_count 与 target</w:t>
             </w:r>
@@ -2027,7 +2052,7 @@
             <w:r>
               <w:rPr>
                 <w:rFonts w:ascii="宋体" w:hAnsi="宋体" w:eastAsia="宋体"/>
-                <w:sz w:val="19"/>
+                <w:sz w:val="21"/>
               </w:rPr>
               <w:t xml:space="preserve">论文 score 口径不同</w:t>
             </w:r>
@@ -2043,7 +2068,7 @@
             <w:r>
               <w:rPr>
                 <w:rFonts w:ascii="宋体" w:hAnsi="宋体" w:eastAsia="宋体"/>
-                <w:sz w:val="19"/>
+                <w:sz w:val="21"/>
               </w:rPr>
               <w:t xml:space="preserve">区分论文原版 Score、PHM/RUL 惩罚 Score 和普通误差</w:t>
             </w:r>
@@ -2059,7 +2084,7 @@
             <w:r>
               <w:rPr>
                 <w:rFonts w:ascii="宋体" w:hAnsi="宋体" w:eastAsia="宋体"/>
-                <w:sz w:val="19"/>
+                <w:sz w:val="21"/>
               </w:rPr>
               <w:t xml:space="preserve">新增 RUL 指标体系并写入复现文档</w:t>
             </w:r>
@@ -2077,7 +2102,7 @@
             <w:r>
               <w:rPr>
                 <w:rFonts w:ascii="宋体" w:hAnsi="宋体" w:eastAsia="宋体"/>
-                <w:sz w:val="19"/>
+                <w:sz w:val="21"/>
               </w:rPr>
               <w:t xml:space="preserve">课程验收需要可复跑</w:t>
             </w:r>
@@ -2093,7 +2118,7 @@
             <w:r>
               <w:rPr>
                 <w:rFonts w:ascii="宋体" w:hAnsi="宋体" w:eastAsia="宋体"/>
-                <w:sz w:val="19"/>
+                <w:sz w:val="21"/>
               </w:rPr>
               <w:t xml:space="preserve">将 notebook、pytest、真实训练输出分层验证</w:t>
             </w:r>
@@ -2109,7 +2134,7 @@
             <w:r>
               <w:rPr>
                 <w:rFonts w:ascii="宋体" w:hAnsi="宋体" w:eastAsia="宋体"/>
-                <w:sz w:val="19"/>
+                <w:sz w:val="21"/>
               </w:rPr>
               <w:t xml:space="preserve">8 个 notebook smoke、31 个测试和真实训练记录</w:t>
             </w:r>
@@ -2126,7 +2151,7 @@
       </w:pPr>
       <w:r>
         <w:rPr>
-          <w:rFonts w:ascii="黑体" w:hAnsi="黑体" w:eastAsia="黑体"/>
+          <w:rFonts w:ascii="宋体" w:hAnsi="宋体" w:eastAsia="宋体"/>
         </w:rPr>
         <w:t xml:space="preserve">3. 论文复现成果</w:t>
       </w:r>
@@ -2138,7 +2163,7 @@
       </w:pPr>
       <w:r>
         <w:rPr>
-          <w:rFonts w:ascii="黑体" w:hAnsi="黑体" w:eastAsia="黑体"/>
+          <w:rFonts w:ascii="宋体" w:hAnsi="宋体" w:eastAsia="宋体"/>
         </w:rPr>
         <w:t xml:space="preserve">3.1 CNN-LSTM-AM 复现</w:t>
       </w:r>
@@ -2146,6 +2171,8 @@
     <w:p>
       <w:pPr>
         <w:pStyle w:val="FirstParagraph"/>
+        <w:spacing w:line="276" w:lineRule="auto" w:after="0"/>
+        <w:ind w:firstLine="420"/>
       </w:pPr>
       <w:r>
         <w:rPr>
@@ -2176,6 +2203,8 @@
     <w:p>
       <w:pPr>
         <w:pStyle w:val="BodyText"/>
+        <w:spacing w:line="276" w:lineRule="auto" w:after="0"/>
+        <w:ind w:firstLine="420"/>
       </w:pPr>
       <w:r>
         <w:rPr>
@@ -2235,19 +2264,19 @@
         <w:tblW w:type="pct" w:w="0.0"/>
         <w:tblLook w:firstRow="1" w:lastRow="0" w:firstColumn="0" w:lastColumn="0" w:noHBand="0" w:noVBand="0" w:val="0020"/>
         <w:tblBorders>
-          <w:top w:val="single" w:sz="4" w:space="0" w:color="BFBFBF"/>
-          <w:left w:val="single" w:sz="4" w:space="0" w:color="BFBFBF"/>
-          <w:bottom w:val="single" w:sz="4" w:space="0" w:color="BFBFBF"/>
-          <w:right w:val="single" w:sz="4" w:space="0" w:color="BFBFBF"/>
-          <w:insideH w:val="single" w:sz="4" w:space="0" w:color="BFBFBF"/>
-          <w:insideV w:val="single" w:sz="4" w:space="0" w:color="BFBFBF"/>
+          <w:top w:val="single" w:sz="4" w:space="0" w:color="000000"/>
+          <w:left w:val="single" w:sz="4" w:space="0" w:color="000000"/>
+          <w:bottom w:val="single" w:sz="4" w:space="0" w:color="000000"/>
+          <w:right w:val="single" w:sz="4" w:space="0" w:color="000000"/>
+          <w:insideH w:val="single" w:sz="4" w:space="0" w:color="000000"/>
+          <w:insideV w:val="single" w:sz="4" w:space="0" w:color="000000"/>
         </w:tblBorders>
       </w:tblPr>
       <w:tblGrid/>
       <w:tr>
         <w:tc>
           <w:tcPr>
-            <w:shd w:fill="EAEAEA"/>
+            <w:shd w:fill="FFFFFF"/>
           </w:tcPr>
           <w:p>
             <w:pPr>
@@ -2258,7 +2287,8 @@
             <w:r>
               <w:rPr>
                 <w:rFonts w:ascii="宋体" w:hAnsi="宋体" w:eastAsia="宋体"/>
-                <w:sz w:val="19"/>
+                <w:b/>
+                <w:sz w:val="21"/>
               </w:rPr>
               <w:t xml:space="preserve">数据集与轴承</w:t>
             </w:r>
@@ -2266,7 +2296,7 @@
         </w:tc>
         <w:tc>
           <w:tcPr>
-            <w:shd w:fill="EAEAEA"/>
+            <w:shd w:fill="FFFFFF"/>
           </w:tcPr>
           <w:p>
             <w:pPr>
@@ -2277,7 +2307,8 @@
             <w:r>
               <w:rPr>
                 <w:rFonts w:ascii="宋体" w:hAnsi="宋体" w:eastAsia="宋体"/>
-                <w:sz w:val="19"/>
+                <w:b/>
+                <w:sz w:val="21"/>
               </w:rPr>
               <w:t xml:space="preserve">模型</w:t>
             </w:r>
@@ -2285,7 +2316,7 @@
         </w:tc>
         <w:tc>
           <w:tcPr>
-            <w:shd w:fill="EAEAEA"/>
+            <w:shd w:fill="FFFFFF"/>
           </w:tcPr>
           <w:p>
             <w:pPr>
@@ -2296,7 +2327,8 @@
             <w:r>
               <w:rPr>
                 <w:rFonts w:ascii="宋体" w:hAnsi="宋体" w:eastAsia="宋体"/>
-                <w:sz w:val="19"/>
+                <w:b/>
+                <w:sz w:val="21"/>
               </w:rPr>
               <w:t xml:space="preserve">RMSE</w:t>
             </w:r>
@@ -2304,7 +2336,7 @@
         </w:tc>
         <w:tc>
           <w:tcPr>
-            <w:shd w:fill="EAEAEA"/>
+            <w:shd w:fill="FFFFFF"/>
           </w:tcPr>
           <w:p>
             <w:pPr>
@@ -2315,7 +2347,8 @@
             <w:r>
               <w:rPr>
                 <w:rFonts w:ascii="宋体" w:hAnsi="宋体" w:eastAsia="宋体"/>
-                <w:sz w:val="19"/>
+                <w:b/>
+                <w:sz w:val="21"/>
               </w:rPr>
               <w:t xml:space="preserve">NormalizedRMSE</w:t>
             </w:r>
@@ -2323,7 +2356,7 @@
         </w:tc>
         <w:tc>
           <w:tcPr>
-            <w:shd w:fill="EAEAEA"/>
+            <w:shd w:fill="FFFFFF"/>
           </w:tcPr>
           <w:p>
             <w:pPr>
@@ -2334,7 +2367,8 @@
             <w:r>
               <w:rPr>
                 <w:rFonts w:ascii="宋体" w:hAnsi="宋体" w:eastAsia="宋体"/>
-                <w:sz w:val="19"/>
+                <w:b/>
+                <w:sz w:val="21"/>
               </w:rPr>
               <w:t xml:space="preserve">Huang RUL Score</w:t>
             </w:r>
@@ -2352,7 +2386,7 @@
             <w:r>
               <w:rPr>
                 <w:rFonts w:ascii="宋体" w:hAnsi="宋体" w:eastAsia="宋体"/>
-                <w:sz w:val="19"/>
+                <w:sz w:val="21"/>
               </w:rPr>
               <w:t xml:space="preserve">XJTU-SY Bearing1_5</w:t>
             </w:r>
@@ -2368,7 +2402,7 @@
             <w:r>
               <w:rPr>
                 <w:rFonts w:ascii="宋体" w:hAnsi="宋体" w:eastAsia="宋体"/>
-                <w:sz w:val="19"/>
+                <w:sz w:val="21"/>
               </w:rPr>
               <w:t xml:space="preserve">CNN-LSTM-AM</w:t>
             </w:r>
@@ -2384,7 +2418,7 @@
             <w:r>
               <w:rPr>
                 <w:rFonts w:ascii="宋体" w:hAnsi="宋体" w:eastAsia="宋体"/>
-                <w:sz w:val="19"/>
+                <w:sz w:val="21"/>
               </w:rPr>
               <w:t xml:space="preserve">406.302</w:t>
             </w:r>
@@ -2400,7 +2434,7 @@
             <w:r>
               <w:rPr>
                 <w:rFonts w:ascii="宋体" w:hAnsi="宋体" w:eastAsia="宋体"/>
-                <w:sz w:val="19"/>
+                <w:sz w:val="21"/>
               </w:rPr>
               <w:t xml:space="preserve">0.615609</w:t>
             </w:r>
@@ -2416,7 +2450,7 @@
             <w:r>
               <w:rPr>
                 <w:rFonts w:ascii="宋体" w:hAnsi="宋体" w:eastAsia="宋体"/>
-                <w:sz w:val="19"/>
+                <w:sz w:val="21"/>
               </w:rPr>
               <w:t xml:space="preserve">29.001612</w:t>
             </w:r>
@@ -2434,7 +2468,7 @@
             <w:r>
               <w:rPr>
                 <w:rFonts w:ascii="宋体" w:hAnsi="宋体" w:eastAsia="宋体"/>
-                <w:sz w:val="19"/>
+                <w:sz w:val="21"/>
               </w:rPr>
               <w:t xml:space="preserve">XJTU-SY Bearing1_5</w:t>
             </w:r>
@@ -2450,7 +2484,7 @@
             <w:r>
               <w:rPr>
                 <w:rFonts w:ascii="宋体" w:hAnsi="宋体" w:eastAsia="宋体"/>
-                <w:sz w:val="19"/>
+                <w:sz w:val="21"/>
               </w:rPr>
               <w:t xml:space="preserve">CNN-LSTM</w:t>
             </w:r>
@@ -2466,7 +2500,7 @@
             <w:r>
               <w:rPr>
                 <w:rFonts w:ascii="宋体" w:hAnsi="宋体" w:eastAsia="宋体"/>
-                <w:sz w:val="19"/>
+                <w:sz w:val="21"/>
               </w:rPr>
               <w:t xml:space="preserve">406.503</w:t>
             </w:r>
@@ -2482,7 +2516,7 @@
             <w:r>
               <w:rPr>
                 <w:rFonts w:ascii="宋体" w:hAnsi="宋体" w:eastAsia="宋体"/>
-                <w:sz w:val="19"/>
+                <w:sz w:val="21"/>
               </w:rPr>
               <w:t xml:space="preserve">0.615913</w:t>
             </w:r>
@@ -2498,7 +2532,7 @@
             <w:r>
               <w:rPr>
                 <w:rFonts w:ascii="宋体" w:hAnsi="宋体" w:eastAsia="宋体"/>
-                <w:sz w:val="19"/>
+                <w:sz w:val="21"/>
               </w:rPr>
               <w:t xml:space="preserve">29.127879</w:t>
             </w:r>
@@ -2516,7 +2550,7 @@
             <w:r>
               <w:rPr>
                 <w:rFonts w:ascii="宋体" w:hAnsi="宋体" w:eastAsia="宋体"/>
-                <w:sz w:val="19"/>
+                <w:sz w:val="21"/>
               </w:rPr>
               <w:t xml:space="preserve">PHM2012 Bearing3_1</w:t>
             </w:r>
@@ -2532,7 +2566,7 @@
             <w:r>
               <w:rPr>
                 <w:rFonts w:ascii="宋体" w:hAnsi="宋体" w:eastAsia="宋体"/>
-                <w:sz w:val="19"/>
+                <w:sz w:val="21"/>
               </w:rPr>
               <w:t xml:space="preserve">CNN-LSTM-AM</w:t>
             </w:r>
@@ -2548,7 +2582,7 @@
             <w:r>
               <w:rPr>
                 <w:rFonts w:ascii="宋体" w:hAnsi="宋体" w:eastAsia="宋体"/>
-                <w:sz w:val="19"/>
+                <w:sz w:val="21"/>
               </w:rPr>
               <w:t xml:space="preserve">651.036</w:t>
             </w:r>
@@ -2564,7 +2598,7 @@
             <w:r>
               <w:rPr>
                 <w:rFonts w:ascii="宋体" w:hAnsi="宋体" w:eastAsia="宋体"/>
-                <w:sz w:val="19"/>
+                <w:sz w:val="21"/>
               </w:rPr>
               <w:t xml:space="preserve">0.591850</w:t>
             </w:r>
@@ -2580,7 +2614,7 @@
             <w:r>
               <w:rPr>
                 <w:rFonts w:ascii="宋体" w:hAnsi="宋体" w:eastAsia="宋体"/>
-                <w:sz w:val="19"/>
+                <w:sz w:val="21"/>
               </w:rPr>
               <w:t xml:space="preserve">29.447255</w:t>
             </w:r>
@@ -2598,7 +2632,7 @@
             <w:r>
               <w:rPr>
                 <w:rFonts w:ascii="宋体" w:hAnsi="宋体" w:eastAsia="宋体"/>
-                <w:sz w:val="19"/>
+                <w:sz w:val="21"/>
               </w:rPr>
               <w:t xml:space="preserve">PHM2012 Bearing3_1</w:t>
             </w:r>
@@ -2614,7 +2648,7 @@
             <w:r>
               <w:rPr>
                 <w:rFonts w:ascii="宋体" w:hAnsi="宋体" w:eastAsia="宋体"/>
-                <w:sz w:val="19"/>
+                <w:sz w:val="21"/>
               </w:rPr>
               <w:t xml:space="preserve">CNN-LSTM</w:t>
             </w:r>
@@ -2630,7 +2664,7 @@
             <w:r>
               <w:rPr>
                 <w:rFonts w:ascii="宋体" w:hAnsi="宋体" w:eastAsia="宋体"/>
-                <w:sz w:val="19"/>
+                <w:sz w:val="21"/>
               </w:rPr>
               <w:t xml:space="preserve">650.700</w:t>
             </w:r>
@@ -2646,7 +2680,7 @@
             <w:r>
               <w:rPr>
                 <w:rFonts w:ascii="宋体" w:hAnsi="宋体" w:eastAsia="宋体"/>
-                <w:sz w:val="19"/>
+                <w:sz w:val="21"/>
               </w:rPr>
               <w:t xml:space="preserve">0.591545</w:t>
             </w:r>
@@ -2662,7 +2696,7 @@
             <w:r>
               <w:rPr>
                 <w:rFonts w:ascii="宋体" w:hAnsi="宋体" w:eastAsia="宋体"/>
-                <w:sz w:val="19"/>
+                <w:sz w:val="21"/>
               </w:rPr>
               <w:t xml:space="preserve">29.098391</w:t>
             </w:r>
@@ -2678,7 +2712,7 @@
       </w:pPr>
       <w:r>
         <w:rPr>
-          <w:rFonts w:ascii="黑体" w:hAnsi="黑体" w:eastAsia="黑体"/>
+          <w:rFonts w:ascii="宋体" w:hAnsi="宋体" w:eastAsia="宋体"/>
         </w:rPr>
         <w:t xml:space="preserve">3.2 xLSTM-Transformer 复现</w:t>
       </w:r>
@@ -2686,6 +2720,8 @@
     <w:p>
       <w:pPr>
         <w:pStyle w:val="FirstParagraph"/>
+        <w:spacing w:line="276" w:lineRule="auto" w:after="0"/>
+        <w:ind w:firstLine="420"/>
       </w:pPr>
       <w:r>
         <w:rPr>
@@ -2716,6 +2752,8 @@
     <w:p>
       <w:pPr>
         <w:pStyle w:val="BodyText"/>
+        <w:spacing w:line="276" w:lineRule="auto" w:after="0"/>
+        <w:ind w:firstLine="420"/>
       </w:pPr>
       <w:r>
         <w:rPr>
@@ -2793,19 +2831,19 @@
         <w:tblW w:type="pct" w:w="0.0"/>
         <w:tblLook w:firstRow="1" w:lastRow="0" w:firstColumn="0" w:lastColumn="0" w:noHBand="0" w:noVBand="0" w:val="0020"/>
         <w:tblBorders>
-          <w:top w:val="single" w:sz="4" w:space="0" w:color="BFBFBF"/>
-          <w:left w:val="single" w:sz="4" w:space="0" w:color="BFBFBF"/>
-          <w:bottom w:val="single" w:sz="4" w:space="0" w:color="BFBFBF"/>
-          <w:right w:val="single" w:sz="4" w:space="0" w:color="BFBFBF"/>
-          <w:insideH w:val="single" w:sz="4" w:space="0" w:color="BFBFBF"/>
-          <w:insideV w:val="single" w:sz="4" w:space="0" w:color="BFBFBF"/>
+          <w:top w:val="single" w:sz="4" w:space="0" w:color="000000"/>
+          <w:left w:val="single" w:sz="4" w:space="0" w:color="000000"/>
+          <w:bottom w:val="single" w:sz="4" w:space="0" w:color="000000"/>
+          <w:right w:val="single" w:sz="4" w:space="0" w:color="000000"/>
+          <w:insideH w:val="single" w:sz="4" w:space="0" w:color="000000"/>
+          <w:insideV w:val="single" w:sz="4" w:space="0" w:color="000000"/>
         </w:tblBorders>
       </w:tblPr>
       <w:tblGrid/>
       <w:tr>
         <w:tc>
           <w:tcPr>
-            <w:shd w:fill="EAEAEA"/>
+            <w:shd w:fill="FFFFFF"/>
           </w:tcPr>
           <w:p>
             <w:pPr>
@@ -2816,7 +2854,8 @@
             <w:r>
               <w:rPr>
                 <w:rFonts w:ascii="宋体" w:hAnsi="宋体" w:eastAsia="宋体"/>
-                <w:sz w:val="19"/>
+                <w:b/>
+                <w:sz w:val="21"/>
               </w:rPr>
               <w:t xml:space="preserve">数据集/工况</w:t>
             </w:r>
@@ -2824,7 +2863,7 @@
         </w:tc>
         <w:tc>
           <w:tcPr>
-            <w:shd w:fill="EAEAEA"/>
+            <w:shd w:fill="FFFFFF"/>
           </w:tcPr>
           <w:p>
             <w:pPr>
@@ -2835,7 +2874,8 @@
             <w:r>
               <w:rPr>
                 <w:rFonts w:ascii="宋体" w:hAnsi="宋体" w:eastAsia="宋体"/>
-                <w:sz w:val="19"/>
+                <w:b/>
+                <w:sz w:val="21"/>
               </w:rPr>
               <w:t xml:space="preserve">XLSTM-Transformer RMSE</w:t>
             </w:r>
@@ -2843,7 +2883,7 @@
         </w:tc>
         <w:tc>
           <w:tcPr>
-            <w:shd w:fill="EAEAEA"/>
+            <w:shd w:fill="FFFFFF"/>
           </w:tcPr>
           <w:p>
             <w:pPr>
@@ -2854,7 +2894,8 @@
             <w:r>
               <w:rPr>
                 <w:rFonts w:ascii="宋体" w:hAnsi="宋体" w:eastAsia="宋体"/>
-                <w:sz w:val="19"/>
+                <w:b/>
+                <w:sz w:val="21"/>
               </w:rPr>
               <w:t xml:space="preserve">NormalizedRMSE</w:t>
             </w:r>
@@ -2862,7 +2903,7 @@
         </w:tc>
         <w:tc>
           <w:tcPr>
-            <w:shd w:fill="EAEAEA"/>
+            <w:shd w:fill="FFFFFF"/>
           </w:tcPr>
           <w:p>
             <w:pPr>
@@ -2873,7 +2914,8 @@
             <w:r>
               <w:rPr>
                 <w:rFonts w:ascii="宋体" w:hAnsi="宋体" w:eastAsia="宋体"/>
-                <w:sz w:val="19"/>
+                <w:b/>
+                <w:sz w:val="21"/>
               </w:rPr>
               <w:t xml:space="preserve">R2</w:t>
             </w:r>
@@ -2881,7 +2923,7 @@
         </w:tc>
         <w:tc>
           <w:tcPr>
-            <w:shd w:fill="EAEAEA"/>
+            <w:shd w:fill="FFFFFF"/>
           </w:tcPr>
           <w:p>
             <w:pPr>
@@ -2892,7 +2934,8 @@
             <w:r>
               <w:rPr>
                 <w:rFonts w:ascii="宋体" w:hAnsi="宋体" w:eastAsia="宋体"/>
-                <w:sz w:val="19"/>
+                <w:b/>
+                <w:sz w:val="21"/>
               </w:rPr>
               <w:t xml:space="preserve">Huang RUL Score</w:t>
             </w:r>
@@ -2910,7 +2953,7 @@
             <w:r>
               <w:rPr>
                 <w:rFonts w:ascii="宋体" w:hAnsi="宋体" w:eastAsia="宋体"/>
-                <w:sz w:val="19"/>
+                <w:sz w:val="21"/>
               </w:rPr>
               <w:t xml:space="preserve">XJTU-SY Condition 1</w:t>
             </w:r>
@@ -2926,7 +2969,7 @@
             <w:r>
               <w:rPr>
                 <w:rFonts w:ascii="宋体" w:hAnsi="宋体" w:eastAsia="宋体"/>
-                <w:sz w:val="19"/>
+                <w:sz w:val="21"/>
               </w:rPr>
               <w:t xml:space="preserve">2280.512</w:t>
             </w:r>
@@ -2942,7 +2985,7 @@
             <w:r>
               <w:rPr>
                 <w:rFonts w:ascii="宋体" w:hAnsi="宋体" w:eastAsia="宋体"/>
-                <w:sz w:val="19"/>
+                <w:sz w:val="21"/>
               </w:rPr>
               <w:t xml:space="preserve">0.603310</w:t>
             </w:r>
@@ -2958,7 +3001,7 @@
             <w:r>
               <w:rPr>
                 <w:rFonts w:ascii="宋体" w:hAnsi="宋体" w:eastAsia="宋体"/>
-                <w:sz w:val="19"/>
+                <w:sz w:val="21"/>
               </w:rPr>
               <w:t xml:space="preserve">-2.275391</w:t>
             </w:r>
@@ -2974,7 +3017,7 @@
             <w:r>
               <w:rPr>
                 <w:rFonts w:ascii="宋体" w:hAnsi="宋体" w:eastAsia="宋体"/>
-                <w:sz w:val="19"/>
+                <w:sz w:val="21"/>
               </w:rPr>
               <w:t xml:space="preserve">27.303331</w:t>
             </w:r>
@@ -2992,7 +3035,7 @@
             <w:r>
               <w:rPr>
                 <w:rFonts w:ascii="宋体" w:hAnsi="宋体" w:eastAsia="宋体"/>
-                <w:sz w:val="19"/>
+                <w:sz w:val="21"/>
               </w:rPr>
               <w:t xml:space="preserve">XJTU-SY Condition 2</w:t>
             </w:r>
@@ -3008,7 +3051,7 @@
             <w:r>
               <w:rPr>
                 <w:rFonts w:ascii="宋体" w:hAnsi="宋体" w:eastAsia="宋体"/>
-                <w:sz w:val="19"/>
+                <w:sz w:val="21"/>
               </w:rPr>
               <w:t xml:space="preserve">7688.563</w:t>
             </w:r>
@@ -3024,7 +3067,7 @@
             <w:r>
               <w:rPr>
                 <w:rFonts w:ascii="宋体" w:hAnsi="宋体" w:eastAsia="宋体"/>
-                <w:sz w:val="19"/>
+                <w:sz w:val="21"/>
               </w:rPr>
               <w:t xml:space="preserve">0.601609</w:t>
             </w:r>
@@ -3040,7 +3083,7 @@
             <w:r>
               <w:rPr>
                 <w:rFonts w:ascii="宋体" w:hAnsi="宋体" w:eastAsia="宋体"/>
-                <w:sz w:val="19"/>
+                <w:sz w:val="21"/>
               </w:rPr>
               <w:t xml:space="preserve">-2.257361</w:t>
             </w:r>
@@ -3056,7 +3099,7 @@
             <w:r>
               <w:rPr>
                 <w:rFonts w:ascii="宋体" w:hAnsi="宋体" w:eastAsia="宋体"/>
-                <w:sz w:val="19"/>
+                <w:sz w:val="21"/>
               </w:rPr>
               <w:t xml:space="preserve">27.385834</w:t>
             </w:r>
@@ -3074,7 +3117,7 @@
             <w:r>
               <w:rPr>
                 <w:rFonts w:ascii="宋体" w:hAnsi="宋体" w:eastAsia="宋体"/>
-                <w:sz w:val="19"/>
+                <w:sz w:val="21"/>
               </w:rPr>
               <w:t xml:space="preserve">XJTU-SY Condition 3</w:t>
             </w:r>
@@ -3090,7 +3133,7 @@
             <w:r>
               <w:rPr>
                 <w:rFonts w:ascii="宋体" w:hAnsi="宋体" w:eastAsia="宋体"/>
-                <w:sz w:val="19"/>
+                <w:sz w:val="21"/>
               </w:rPr>
               <w:t xml:space="preserve">5348.922</w:t>
             </w:r>
@@ -3106,7 +3149,7 @@
             <w:r>
               <w:rPr>
                 <w:rFonts w:ascii="宋体" w:hAnsi="宋体" w:eastAsia="宋体"/>
-                <w:sz w:val="19"/>
+                <w:sz w:val="21"/>
               </w:rPr>
               <w:t xml:space="preserve">0.602356</w:t>
             </w:r>
@@ -3122,7 +3165,7 @@
             <w:r>
               <w:rPr>
                 <w:rFonts w:ascii="宋体" w:hAnsi="宋体" w:eastAsia="宋体"/>
-                <w:sz w:val="19"/>
+                <w:sz w:val="21"/>
               </w:rPr>
               <w:t xml:space="preserve">-2.262244</w:t>
             </w:r>
@@ -3138,7 +3181,7 @@
             <w:r>
               <w:rPr>
                 <w:rFonts w:ascii="宋体" w:hAnsi="宋体" w:eastAsia="宋体"/>
-                <w:sz w:val="19"/>
+                <w:sz w:val="21"/>
               </w:rPr>
               <w:t xml:space="preserve">27.354392</w:t>
             </w:r>
@@ -3156,7 +3199,7 @@
             <w:r>
               <w:rPr>
                 <w:rFonts w:ascii="宋体" w:hAnsi="宋体" w:eastAsia="宋体"/>
-                <w:sz w:val="19"/>
+                <w:sz w:val="21"/>
               </w:rPr>
               <w:t xml:space="preserve">PHM2012 Condition 1</w:t>
             </w:r>
@@ -3172,7 +3215,7 @@
             <w:r>
               <w:rPr>
                 <w:rFonts w:ascii="宋体" w:hAnsi="宋体" w:eastAsia="宋体"/>
-                <w:sz w:val="19"/>
+                <w:sz w:val="21"/>
               </w:rPr>
               <w:t xml:space="preserve">9641.803</w:t>
             </w:r>
@@ -3188,7 +3231,7 @@
             <w:r>
               <w:rPr>
                 <w:rFonts w:ascii="宋体" w:hAnsi="宋体" w:eastAsia="宋体"/>
-                <w:sz w:val="19"/>
+                <w:sz w:val="21"/>
               </w:rPr>
               <w:t xml:space="preserve">1.337282</w:t>
             </w:r>
@@ -3204,7 +3247,7 @@
             <w:r>
               <w:rPr>
                 <w:rFonts w:ascii="宋体" w:hAnsi="宋体" w:eastAsia="宋体"/>
-                <w:sz w:val="19"/>
+                <w:sz w:val="21"/>
               </w:rPr>
               <w:t xml:space="preserve">-15.110842</w:t>
             </w:r>
@@ -3220,7 +3263,7 @@
             <w:r>
               <w:rPr>
                 <w:rFonts w:ascii="宋体" w:hAnsi="宋体" w:eastAsia="宋体"/>
-                <w:sz w:val="19"/>
+                <w:sz w:val="21"/>
               </w:rPr>
               <w:t xml:space="preserve">31.989850</w:t>
             </w:r>
@@ -3238,7 +3281,7 @@
             <w:r>
               <w:rPr>
                 <w:rFonts w:ascii="宋体" w:hAnsi="宋体" w:eastAsia="宋体"/>
-                <w:sz w:val="19"/>
+                <w:sz w:val="21"/>
               </w:rPr>
               <w:t xml:space="preserve">PHM2012 Condition 2</w:t>
             </w:r>
@@ -3254,7 +3297,7 @@
             <w:r>
               <w:rPr>
                 <w:rFonts w:ascii="宋体" w:hAnsi="宋体" w:eastAsia="宋体"/>
-                <w:sz w:val="19"/>
+                <w:sz w:val="21"/>
               </w:rPr>
               <w:t xml:space="preserve">10065.537</w:t>
             </w:r>
@@ -3270,7 +3313,7 @@
             <w:r>
               <w:rPr>
                 <w:rFonts w:ascii="宋体" w:hAnsi="宋体" w:eastAsia="宋体"/>
-                <w:sz w:val="19"/>
+                <w:sz w:val="21"/>
               </w:rPr>
               <w:t xml:space="preserve">2.092627</w:t>
             </w:r>
@@ -3286,7 +3329,7 @@
             <w:r>
               <w:rPr>
                 <w:rFonts w:ascii="宋体" w:hAnsi="宋体" w:eastAsia="宋体"/>
-                <w:sz w:val="19"/>
+                <w:sz w:val="21"/>
               </w:rPr>
               <w:t xml:space="preserve">-38.470269</w:t>
             </w:r>
@@ -3302,7 +3345,7 @@
             <w:r>
               <w:rPr>
                 <w:rFonts w:ascii="宋体" w:hAnsi="宋体" w:eastAsia="宋体"/>
-                <w:sz w:val="19"/>
+                <w:sz w:val="21"/>
               </w:rPr>
               <w:t xml:space="preserve">31.984371</w:t>
             </w:r>
@@ -3320,7 +3363,7 @@
             <w:r>
               <w:rPr>
                 <w:rFonts w:ascii="宋体" w:hAnsi="宋体" w:eastAsia="宋体"/>
-                <w:sz w:val="19"/>
+                <w:sz w:val="21"/>
               </w:rPr>
               <w:t xml:space="preserve">PHM2012 Condition 3</w:t>
             </w:r>
@@ -3336,7 +3379,7 @@
             <w:r>
               <w:rPr>
                 <w:rFonts w:ascii="宋体" w:hAnsi="宋体" w:eastAsia="宋体"/>
-                <w:sz w:val="19"/>
+                <w:sz w:val="21"/>
               </w:rPr>
               <w:t xml:space="preserve">1594.675</w:t>
             </w:r>
@@ -3352,7 +3395,7 @@
             <w:r>
               <w:rPr>
                 <w:rFonts w:ascii="宋体" w:hAnsi="宋体" w:eastAsia="宋体"/>
-                <w:sz w:val="19"/>
+                <w:sz w:val="21"/>
               </w:rPr>
               <w:t xml:space="preserve">1.130975</w:t>
             </w:r>
@@ -3368,7 +3411,7 @@
             <w:r>
               <w:rPr>
                 <w:rFonts w:ascii="宋体" w:hAnsi="宋体" w:eastAsia="宋体"/>
-                <w:sz w:val="19"/>
+                <w:sz w:val="21"/>
               </w:rPr>
               <w:t xml:space="preserve">-10.581817</w:t>
             </w:r>
@@ -3384,7 +3427,7 @@
             <w:r>
               <w:rPr>
                 <w:rFonts w:ascii="宋体" w:hAnsi="宋体" w:eastAsia="宋体"/>
-                <w:sz w:val="19"/>
+                <w:sz w:val="21"/>
               </w:rPr>
               <w:t xml:space="preserve">31.883923</w:t>
             </w:r>
@@ -3395,6 +3438,8 @@
     <w:p>
       <w:pPr>
         <w:pStyle w:val="BodyText"/>
+        <w:spacing w:line="276" w:lineRule="auto" w:after="0"/>
+        <w:ind w:firstLine="420"/>
       </w:pPr>
       <w:r>
         <w:rPr>
@@ -3412,7 +3457,7 @@
       </w:pPr>
       <w:r>
         <w:rPr>
-          <w:rFonts w:ascii="黑体" w:hAnsi="黑体" w:eastAsia="黑体"/>
+          <w:rFonts w:ascii="宋体" w:hAnsi="宋体" w:eastAsia="宋体"/>
         </w:rPr>
         <w:t xml:space="preserve">4. 测试与质量保证</w:t>
       </w:r>
@@ -3420,6 +3465,8 @@
     <w:p>
       <w:pPr>
         <w:pStyle w:val="FirstParagraph"/>
+        <w:spacing w:line="276" w:lineRule="auto" w:after="0"/>
+        <w:ind w:firstLine="420"/>
       </w:pPr>
       <w:r>
         <w:rPr>
@@ -3435,6 +3482,8 @@
           <w:numId w:val="1001"/>
         </w:numPr>
         <w:pStyle w:val="Compact"/>
+        <w:spacing w:line="276" w:lineRule="auto" w:after="0"/>
+        <w:ind w:firstLine="420"/>
       </w:pPr>
       <w:r>
         <w:rPr>
@@ -3450,6 +3499,8 @@
           <w:numId w:val="1001"/>
         </w:numPr>
         <w:pStyle w:val="Compact"/>
+        <w:spacing w:line="276" w:lineRule="auto" w:after="0"/>
+        <w:ind w:firstLine="420"/>
       </w:pPr>
       <w:r>
         <w:rPr>
@@ -3465,6 +3516,8 @@
           <w:numId w:val="1001"/>
         </w:numPr>
         <w:pStyle w:val="Compact"/>
+        <w:spacing w:line="276" w:lineRule="auto" w:after="0"/>
+        <w:ind w:firstLine="420"/>
       </w:pPr>
       <w:r>
         <w:rPr>
@@ -3505,6 +3558,8 @@
           <w:numId w:val="1001"/>
         </w:numPr>
         <w:pStyle w:val="Compact"/>
+        <w:spacing w:line="276" w:lineRule="auto" w:after="0"/>
+        <w:ind w:firstLine="420"/>
       </w:pPr>
       <w:r>
         <w:rPr>
@@ -3545,6 +3600,8 @@
           <w:numId w:val="1001"/>
         </w:numPr>
         <w:pStyle w:val="Compact"/>
+        <w:spacing w:line="276" w:lineRule="auto" w:after="0"/>
+        <w:ind w:firstLine="420"/>
       </w:pPr>
       <w:r>
         <w:rPr>
@@ -3556,6 +3613,8 @@
     <w:p>
       <w:pPr>
         <w:pStyle w:val="FirstParagraph"/>
+        <w:spacing w:line="276" w:lineRule="auto" w:after="0"/>
+        <w:ind w:firstLine="420"/>
       </w:pPr>
       <w:r>
         <w:rPr>
@@ -3653,7 +3712,7 @@
       </w:pPr>
       <w:r>
         <w:rPr>
-          <w:rFonts w:ascii="黑体" w:hAnsi="黑体" w:eastAsia="黑体"/>
+          <w:rFonts w:ascii="宋体" w:hAnsi="宋体" w:eastAsia="宋体"/>
         </w:rPr>
         <w:t xml:space="preserve">5. 项目成果</w:t>
       </w:r>
@@ -3661,6 +3720,8 @@
     <w:p>
       <w:pPr>
         <w:pStyle w:val="FirstParagraph"/>
+        <w:spacing w:line="276" w:lineRule="auto" w:after="0"/>
+        <w:ind w:firstLine="420"/>
       </w:pPr>
       <w:r>
         <w:rPr>
@@ -3676,6 +3737,8 @@
           <w:numId w:val="1002"/>
         </w:numPr>
         <w:pStyle w:val="Compact"/>
+        <w:spacing w:line="276" w:lineRule="auto" w:after="0"/>
+        <w:ind w:firstLine="420"/>
       </w:pPr>
       <w:r>
         <w:rPr>
@@ -3698,6 +3761,8 @@
           <w:numId w:val="1002"/>
         </w:numPr>
         <w:pStyle w:val="Compact"/>
+        <w:spacing w:line="276" w:lineRule="auto" w:after="0"/>
+        <w:ind w:firstLine="420"/>
       </w:pPr>
       <w:r>
         <w:rPr>
@@ -3720,6 +3785,8 @@
           <w:numId w:val="1002"/>
         </w:numPr>
         <w:pStyle w:val="Compact"/>
+        <w:spacing w:line="276" w:lineRule="auto" w:after="0"/>
+        <w:ind w:firstLine="420"/>
       </w:pPr>
       <w:r>
         <w:rPr>
@@ -3742,6 +3809,8 @@
           <w:numId w:val="1002"/>
         </w:numPr>
         <w:pStyle w:val="Compact"/>
+        <w:spacing w:line="276" w:lineRule="auto" w:after="0"/>
+        <w:ind w:firstLine="420"/>
       </w:pPr>
       <w:r>
         <w:rPr>
@@ -3764,6 +3833,8 @@
           <w:numId w:val="1002"/>
         </w:numPr>
         <w:pStyle w:val="Compact"/>
+        <w:spacing w:line="276" w:lineRule="auto" w:after="0"/>
+        <w:ind w:firstLine="420"/>
       </w:pPr>
       <w:r>
         <w:rPr>
@@ -3786,6 +3857,8 @@
           <w:numId w:val="1002"/>
         </w:numPr>
         <w:pStyle w:val="Compact"/>
+        <w:spacing w:line="276" w:lineRule="auto" w:after="0"/>
+        <w:ind w:firstLine="420"/>
       </w:pPr>
       <w:r>
         <w:rPr>
@@ -3808,6 +3881,8 @@
           <w:numId w:val="1002"/>
         </w:numPr>
         <w:pStyle w:val="Compact"/>
+        <w:spacing w:line="276" w:lineRule="auto" w:after="0"/>
+        <w:ind w:firstLine="420"/>
       </w:pPr>
       <w:r>
         <w:rPr>
@@ -3830,6 +3905,8 @@
           <w:numId w:val="1002"/>
         </w:numPr>
         <w:pStyle w:val="Compact"/>
+        <w:spacing w:line="276" w:lineRule="auto" w:after="0"/>
+        <w:ind w:firstLine="420"/>
       </w:pPr>
       <w:r>
         <w:rPr>
@@ -3853,7 +3930,7 @@
       </w:pPr>
       <w:r>
         <w:rPr>
-          <w:rFonts w:ascii="黑体" w:hAnsi="黑体" w:eastAsia="黑体"/>
+          <w:rFonts w:ascii="宋体" w:hAnsi="宋体" w:eastAsia="宋体"/>
         </w:rPr>
         <w:t xml:space="preserve">6. 不足与后续改进</w:t>
       </w:r>
@@ -3861,6 +3938,8 @@
     <w:p>
       <w:pPr>
         <w:pStyle w:val="FirstParagraph"/>
+        <w:spacing w:line="276" w:lineRule="auto" w:after="0"/>
+        <w:ind w:firstLine="420"/>
       </w:pPr>
       <w:r>
         <w:rPr>
@@ -3876,6 +3955,8 @@
           <w:numId w:val="1003"/>
         </w:numPr>
         <w:pStyle w:val="Compact"/>
+        <w:spacing w:line="276" w:lineRule="auto" w:after="0"/>
+        <w:ind w:firstLine="420"/>
       </w:pPr>
       <w:r>
         <w:rPr>
@@ -3891,6 +3972,8 @@
           <w:numId w:val="1003"/>
         </w:numPr>
         <w:pStyle w:val="Compact"/>
+        <w:spacing w:line="276" w:lineRule="auto" w:after="0"/>
+        <w:ind w:firstLine="420"/>
       </w:pPr>
       <w:r>
         <w:rPr>
@@ -3906,6 +3989,8 @@
           <w:numId w:val="1003"/>
         </w:numPr>
         <w:pStyle w:val="Compact"/>
+        <w:spacing w:line="276" w:lineRule="auto" w:after="0"/>
+        <w:ind w:firstLine="420"/>
       </w:pPr>
       <w:r>
         <w:rPr>
@@ -3921,6 +4006,8 @@
           <w:numId w:val="1003"/>
         </w:numPr>
         <w:pStyle w:val="Compact"/>
+        <w:spacing w:line="276" w:lineRule="auto" w:after="0"/>
+        <w:ind w:firstLine="420"/>
       </w:pPr>
       <w:r>
         <w:rPr>
@@ -3937,7 +4024,7 @@
       </w:pPr>
       <w:r>
         <w:rPr>
-          <w:rFonts w:ascii="黑体" w:hAnsi="黑体" w:eastAsia="黑体"/>
+          <w:rFonts w:ascii="宋体" w:hAnsi="宋体" w:eastAsia="宋体"/>
         </w:rPr>
         <w:t xml:space="preserve">7. 结论</w:t>
       </w:r>
@@ -3945,6 +4032,8 @@
     <w:p>
       <w:pPr>
         <w:pStyle w:val="FirstParagraph"/>
+        <w:spacing w:line="276" w:lineRule="auto" w:after="0"/>
+        <w:ind w:firstLine="420"/>
       </w:pPr>
       <w:r>
         <w:rPr>
@@ -3956,7 +4045,7 @@
     <w:bookmarkEnd w:id="32"/>
     <w:bookmarkEnd w:id="33"/>
     <w:sectPr>
-      <w:pgMar w:top="1361" w:bottom="1247" w:left="1417" w:right="1417"/>
+      <w:pgMar w:top="1440" w:bottom="1440" w:left="1797" w:right="1797"/>
     </w:sectPr>
   </w:body>
 </w:document>
@@ -4327,12 +4416,20 @@
       <w:spacing w:after="180" w:before="180"/>
     </w:pPr>
     <w:qFormat/>
+    <w:rPr>
+      <w:rFonts w:ascii="宋体" w:hAnsi="宋体" w:eastAsia="宋体"/>
+      <w:sz w:val="21"/>
+    </w:rPr>
   </w:style>
   <w:style w:customStyle="1" w:styleId="FirstParagraph" w:type="paragraph">
     <w:name w:val="First Paragraph"/>
     <w:basedOn w:val="BodyText"/>
     <w:next w:val="BodyText"/>
     <w:qFormat/>
+    <w:rPr>
+      <w:rFonts w:ascii="宋体" w:hAnsi="宋体" w:eastAsia="宋体"/>
+      <w:sz w:val="21"/>
+    </w:rPr>
   </w:style>
   <w:style w:customStyle="1" w:styleId="Compact" w:type="paragraph">
     <w:name w:val="Compact"/>
@@ -4341,6 +4438,10 @@
     <w:pPr>
       <w:spacing w:after="36" w:before="36"/>
     </w:pPr>
+    <w:rPr>
+      <w:rFonts w:ascii="宋体" w:hAnsi="宋体" w:eastAsia="宋体"/>
+      <w:sz w:val="21"/>
+    </w:rPr>
   </w:style>
   <w:style w:styleId="Title" w:type="paragraph">
     <w:name w:val="Title"/>
@@ -4358,7 +4459,7 @@
       <w:b/>
       <w:bCs/>
       <w:color w:themeColor="accent1" w:themeShade="B5" w:val="345A8A"/>
-      <w:sz w:val="40"/>
+      <w:sz w:val="36"/>
       <w:szCs w:val="36"/>
     </w:rPr>
   </w:style>
@@ -4434,11 +4535,11 @@
       <w:outlineLvl w:val="0"/>
     </w:pPr>
     <w:rPr>
-      <w:rFonts w:asciiTheme="majorHAnsi" w:cstheme="majorBidi" w:eastAsiaTheme="majorEastAsia" w:hAnsiTheme="majorHAnsi"/>
+      <w:rFonts w:asciiTheme="majorHAnsi" w:cstheme="majorBidi" w:eastAsiaTheme="majorEastAsia" w:hAnsiTheme="majorHAnsi" w:ascii="宋体" w:hAnsi="宋体" w:eastAsia="宋体"/>
       <w:b/>
       <w:bCs/>
       <w:color w:themeColor="accent1" w:val="4F81BD"/>
-      <w:sz w:val="32"/>
+      <w:sz w:val="48"/>
       <w:szCs w:val="32"/>
     </w:rPr>
   </w:style>
@@ -4456,11 +4557,11 @@
       <w:outlineLvl w:val="1"/>
     </w:pPr>
     <w:rPr>
-      <w:rFonts w:asciiTheme="majorHAnsi" w:cstheme="majorBidi" w:eastAsiaTheme="majorEastAsia" w:hAnsiTheme="majorHAnsi"/>
+      <w:rFonts w:asciiTheme="majorHAnsi" w:cstheme="majorBidi" w:eastAsiaTheme="majorEastAsia" w:hAnsiTheme="majorHAnsi" w:ascii="宋体" w:hAnsi="宋体" w:eastAsia="宋体"/>
       <w:b/>
       <w:bCs/>
       <w:color w:themeColor="accent1" w:val="4F81BD"/>
-      <w:sz w:val="28"/>
+      <w:sz w:val="36"/>
       <w:szCs w:val="28"/>
     </w:rPr>
   </w:style>
@@ -4478,11 +4579,11 @@
       <w:outlineLvl w:val="2"/>
     </w:pPr>
     <w:rPr>
-      <w:rFonts w:asciiTheme="majorHAnsi" w:cstheme="majorBidi" w:eastAsiaTheme="majorEastAsia" w:hAnsiTheme="majorHAnsi"/>
+      <w:rFonts w:asciiTheme="majorHAnsi" w:cstheme="majorBidi" w:eastAsiaTheme="majorEastAsia" w:hAnsiTheme="majorHAnsi" w:ascii="宋体" w:hAnsi="宋体" w:eastAsia="宋体"/>
       <w:b/>
       <w:bCs/>
       <w:color w:themeColor="accent1" w:val="4F81BD"/>
-      <w:sz w:val="24"/>
+      <w:sz w:val="27"/>
       <w:szCs w:val="24"/>
     </w:rPr>
   </w:style>
@@ -4500,8 +4601,9 @@
       <w:outlineLvl w:val="3"/>
     </w:pPr>
     <w:rPr>
-      <w:rFonts w:asciiTheme="majorHAnsi" w:cstheme="majorBidi" w:eastAsiaTheme="majorEastAsia" w:hAnsiTheme="majorHAnsi"/>
+      <w:rFonts w:asciiTheme="majorHAnsi" w:cstheme="majorBidi" w:eastAsiaTheme="majorEastAsia" w:hAnsiTheme="majorHAnsi" w:ascii="宋体" w:hAnsi="宋体" w:eastAsia="宋体"/>
       <w:i/>
+      <w:b/>
       <w:bCs/>
       <w:color w:themeColor="accent1" w:val="4F81BD"/>
       <w:sz w:val="24"/>

</xml_diff>

<commit_message>
docs: force course document titles black
</commit_message>
<xml_diff>
--- a/docx/final/12_结题报告.docx
+++ b/docx/final/12_结题报告.docx
@@ -38,6 +38,7 @@
         <w:rPr>
           <w:rFonts w:ascii="宋体" w:hAnsi="宋体" w:eastAsia="宋体"/>
           <w:b/>
+          <w:color w:val="000000"/>
           <w:sz w:val="48"/>
         </w:rPr>
         <w:t xml:space="preserve">工业轴承设备剩余寿命预测系统的实现：结题报告</w:t>
@@ -51,6 +52,7 @@
       <w:r>
         <w:rPr>
           <w:rFonts w:ascii="宋体" w:hAnsi="宋体" w:eastAsia="宋体"/>
+          <w:color w:val="000000"/>
         </w:rPr>
         <w:t xml:space="preserve">文档信息</w:t>
       </w:r>
@@ -85,6 +87,7 @@
               <w:rPr>
                 <w:rFonts w:ascii="宋体" w:hAnsi="宋体" w:eastAsia="宋体"/>
                 <w:b/>
+                <w:color w:val="000000"/>
                 <w:sz w:val="21"/>
               </w:rPr>
               <w:t xml:space="preserve">项目</w:t>
@@ -105,6 +108,7 @@
               <w:rPr>
                 <w:rFonts w:ascii="宋体" w:hAnsi="宋体" w:eastAsia="宋体"/>
                 <w:b/>
+                <w:color w:val="000000"/>
                 <w:sz w:val="21"/>
               </w:rPr>
               <w:t xml:space="preserve">内容</w:t>
@@ -123,6 +127,7 @@
             <w:r>
               <w:rPr>
                 <w:rFonts w:ascii="宋体" w:hAnsi="宋体" w:eastAsia="宋体"/>
+                <w:color w:val="000000"/>
                 <w:sz w:val="21"/>
               </w:rPr>
               <w:t xml:space="preserve">文档名称</w:t>
@@ -139,6 +144,7 @@
             <w:r>
               <w:rPr>
                 <w:rFonts w:ascii="宋体" w:hAnsi="宋体" w:eastAsia="宋体"/>
+                <w:color w:val="000000"/>
                 <w:sz w:val="21"/>
               </w:rPr>
               <w:t xml:space="preserve">结题报告</w:t>
@@ -157,6 +163,7 @@
             <w:r>
               <w:rPr>
                 <w:rFonts w:ascii="宋体" w:hAnsi="宋体" w:eastAsia="宋体"/>
+                <w:color w:val="000000"/>
                 <w:sz w:val="21"/>
               </w:rPr>
               <w:t xml:space="preserve">文档编号</w:t>
@@ -173,6 +180,7 @@
             <w:r>
               <w:rPr>
                 <w:rFonts w:ascii="宋体" w:hAnsi="宋体" w:eastAsia="宋体"/>
+                <w:color w:val="000000"/>
                 <w:sz w:val="21"/>
               </w:rPr>
               <w:t xml:space="preserve">SE-PHM-FINAL-12</w:t>
@@ -191,6 +199,7 @@
             <w:r>
               <w:rPr>
                 <w:rFonts w:ascii="宋体" w:hAnsi="宋体" w:eastAsia="宋体"/>
+                <w:color w:val="000000"/>
                 <w:sz w:val="21"/>
               </w:rPr>
               <w:t xml:space="preserve">文档阶段</w:t>
@@ -207,6 +216,7 @@
             <w:r>
               <w:rPr>
                 <w:rFonts w:ascii="宋体" w:hAnsi="宋体" w:eastAsia="宋体"/>
+                <w:color w:val="000000"/>
                 <w:sz w:val="21"/>
               </w:rPr>
               <w:t xml:space="preserve">结题</w:t>
@@ -225,6 +235,7 @@
             <w:r>
               <w:rPr>
                 <w:rFonts w:ascii="宋体" w:hAnsi="宋体" w:eastAsia="宋体"/>
+                <w:color w:val="000000"/>
                 <w:sz w:val="21"/>
               </w:rPr>
               <w:t xml:space="preserve">项目名称</w:t>
@@ -241,6 +252,7 @@
             <w:r>
               <w:rPr>
                 <w:rFonts w:ascii="宋体" w:hAnsi="宋体" w:eastAsia="宋体"/>
+                <w:color w:val="000000"/>
                 <w:sz w:val="21"/>
               </w:rPr>
               <w:t xml:space="preserve">工业轴承设备剩余寿命预测系统的实现</w:t>
@@ -259,6 +271,7 @@
             <w:r>
               <w:rPr>
                 <w:rFonts w:ascii="宋体" w:hAnsi="宋体" w:eastAsia="宋体"/>
+                <w:color w:val="000000"/>
                 <w:sz w:val="21"/>
               </w:rPr>
               <w:t xml:space="preserve">课程</w:t>
@@ -275,6 +288,7 @@
             <w:r>
               <w:rPr>
                 <w:rFonts w:ascii="宋体" w:hAnsi="宋体" w:eastAsia="宋体"/>
+                <w:color w:val="000000"/>
                 <w:sz w:val="21"/>
               </w:rPr>
               <w:t xml:space="preserve">中国科学技术大学软件学院《软件工程》</w:t>
@@ -293,6 +307,7 @@
             <w:r>
               <w:rPr>
                 <w:rFonts w:ascii="宋体" w:hAnsi="宋体" w:eastAsia="宋体"/>
+                <w:color w:val="000000"/>
                 <w:sz w:val="21"/>
               </w:rPr>
               <w:t xml:space="preserve">指导老师</w:t>
@@ -309,6 +324,7 @@
             <w:r>
               <w:rPr>
                 <w:rFonts w:ascii="宋体" w:hAnsi="宋体" w:eastAsia="宋体"/>
+                <w:color w:val="000000"/>
                 <w:sz w:val="21"/>
               </w:rPr>
               <w:t xml:space="preserve">zjf</w:t>
@@ -327,6 +343,7 @@
             <w:r>
               <w:rPr>
                 <w:rFonts w:ascii="宋体" w:hAnsi="宋体" w:eastAsia="宋体"/>
+                <w:color w:val="000000"/>
                 <w:sz w:val="21"/>
               </w:rPr>
               <w:t xml:space="preserve">小组成员</w:t>
@@ -343,6 +360,7 @@
             <w:r>
               <w:rPr>
                 <w:rFonts w:ascii="宋体" w:hAnsi="宋体" w:eastAsia="宋体"/>
+                <w:color w:val="000000"/>
                 <w:sz w:val="21"/>
               </w:rPr>
               <w:t xml:space="preserve">zyj、cyy、zdh、zy</w:t>
@@ -361,6 +379,7 @@
             <w:r>
               <w:rPr>
                 <w:rFonts w:ascii="宋体" w:hAnsi="宋体" w:eastAsia="宋体"/>
+                <w:color w:val="000000"/>
                 <w:sz w:val="21"/>
               </w:rPr>
               <w:t xml:space="preserve">文档负责人</w:t>
@@ -377,6 +396,7 @@
             <w:r>
               <w:rPr>
                 <w:rFonts w:ascii="宋体" w:hAnsi="宋体" w:eastAsia="宋体"/>
+                <w:color w:val="000000"/>
                 <w:sz w:val="21"/>
               </w:rPr>
               <w:t xml:space="preserve">zyj</w:t>
@@ -395,6 +415,7 @@
             <w:r>
               <w:rPr>
                 <w:rFonts w:ascii="宋体" w:hAnsi="宋体" w:eastAsia="宋体"/>
+                <w:color w:val="000000"/>
                 <w:sz w:val="21"/>
               </w:rPr>
               <w:t xml:space="preserve">参与编写</w:t>
@@ -411,6 +432,7 @@
             <w:r>
               <w:rPr>
                 <w:rFonts w:ascii="宋体" w:hAnsi="宋体" w:eastAsia="宋体"/>
+                <w:color w:val="000000"/>
                 <w:sz w:val="21"/>
               </w:rPr>
               <w:t xml:space="preserve">cyy、zdh、zy</w:t>
@@ -429,6 +451,7 @@
             <w:r>
               <w:rPr>
                 <w:rFonts w:ascii="宋体" w:hAnsi="宋体" w:eastAsia="宋体"/>
+                <w:color w:val="000000"/>
                 <w:sz w:val="21"/>
               </w:rPr>
               <w:t xml:space="preserve">版本</w:t>
@@ -445,6 +468,7 @@
             <w:r>
               <w:rPr>
                 <w:rFonts w:ascii="宋体" w:hAnsi="宋体" w:eastAsia="宋体"/>
+                <w:color w:val="000000"/>
                 <w:sz w:val="21"/>
               </w:rPr>
               <w:t xml:space="preserve">V3.0</w:t>
@@ -463,6 +487,7 @@
             <w:r>
               <w:rPr>
                 <w:rFonts w:ascii="宋体" w:hAnsi="宋体" w:eastAsia="宋体"/>
+                <w:color w:val="000000"/>
                 <w:sz w:val="21"/>
               </w:rPr>
               <w:t xml:space="preserve">修订日期</w:t>
@@ -479,6 +504,7 @@
             <w:r>
               <w:rPr>
                 <w:rFonts w:ascii="宋体" w:hAnsi="宋体" w:eastAsia="宋体"/>
+                <w:color w:val="000000"/>
                 <w:sz w:val="21"/>
               </w:rPr>
               <w:t xml:space="preserve">2026-06-14</w:t>
@@ -497,6 +523,7 @@
             <w:r>
               <w:rPr>
                 <w:rFonts w:ascii="宋体" w:hAnsi="宋体" w:eastAsia="宋体"/>
+                <w:color w:val="000000"/>
                 <w:sz w:val="21"/>
               </w:rPr>
               <w:t xml:space="preserve">归档形式</w:t>
@@ -513,6 +540,7 @@
             <w:r>
               <w:rPr>
                 <w:rFonts w:ascii="宋体" w:hAnsi="宋体" w:eastAsia="宋体"/>
+                <w:color w:val="000000"/>
                 <w:sz w:val="21"/>
               </w:rPr>
               <w:t xml:space="preserve">Markdown 源文件、PDF、DOCX</w:t>
@@ -531,6 +559,7 @@
             <w:r>
               <w:rPr>
                 <w:rFonts w:ascii="宋体" w:hAnsi="宋体" w:eastAsia="宋体"/>
+                <w:color w:val="000000"/>
                 <w:sz w:val="21"/>
               </w:rPr>
               <w:t xml:space="preserve">内容基线</w:t>
@@ -547,6 +576,7 @@
             <w:r>
               <w:rPr>
                 <w:rFonts w:ascii="宋体" w:hAnsi="宋体" w:eastAsia="宋体"/>
+                <w:color w:val="000000"/>
                 <w:sz w:val="21"/>
               </w:rPr>
               <w:t xml:space="preserve">最终成果、数据理解、技术难点、测试和验收总结</w:t>
@@ -564,6 +594,7 @@
       <w:r>
         <w:rPr>
           <w:rFonts w:ascii="宋体" w:hAnsi="宋体" w:eastAsia="宋体"/>
+          <w:color w:val="000000"/>
         </w:rPr>
         <w:t xml:space="preserve">修订记录</w:t>
       </w:r>
@@ -598,6 +629,7 @@
               <w:rPr>
                 <w:rFonts w:ascii="宋体" w:hAnsi="宋体" w:eastAsia="宋体"/>
                 <w:b/>
+                <w:color w:val="000000"/>
                 <w:sz w:val="21"/>
               </w:rPr>
               <w:t xml:space="preserve">版本</w:t>
@@ -618,6 +650,7 @@
               <w:rPr>
                 <w:rFonts w:ascii="宋体" w:hAnsi="宋体" w:eastAsia="宋体"/>
                 <w:b/>
+                <w:color w:val="000000"/>
                 <w:sz w:val="21"/>
               </w:rPr>
               <w:t xml:space="preserve">日期</w:t>
@@ -638,6 +671,7 @@
               <w:rPr>
                 <w:rFonts w:ascii="宋体" w:hAnsi="宋体" w:eastAsia="宋体"/>
                 <w:b/>
+                <w:color w:val="000000"/>
                 <w:sz w:val="21"/>
               </w:rPr>
               <w:t xml:space="preserve">编写人</w:t>
@@ -658,6 +692,7 @@
               <w:rPr>
                 <w:rFonts w:ascii="宋体" w:hAnsi="宋体" w:eastAsia="宋体"/>
                 <w:b/>
+                <w:color w:val="000000"/>
                 <w:sz w:val="21"/>
               </w:rPr>
               <w:t xml:space="preserve">说明</w:t>
@@ -676,6 +711,7 @@
             <w:r>
               <w:rPr>
                 <w:rFonts w:ascii="宋体" w:hAnsi="宋体" w:eastAsia="宋体"/>
+                <w:color w:val="000000"/>
                 <w:sz w:val="21"/>
               </w:rPr>
               <w:t xml:space="preserve">V1.0</w:t>
@@ -692,6 +728,7 @@
             <w:r>
               <w:rPr>
                 <w:rFonts w:ascii="宋体" w:hAnsi="宋体" w:eastAsia="宋体"/>
+                <w:color w:val="000000"/>
                 <w:sz w:val="21"/>
               </w:rPr>
               <w:t xml:space="preserve">2025-11-10</w:t>
@@ -708,6 +745,7 @@
             <w:r>
               <w:rPr>
                 <w:rFonts w:ascii="宋体" w:hAnsi="宋体" w:eastAsia="宋体"/>
+                <w:color w:val="000000"/>
                 <w:sz w:val="21"/>
               </w:rPr>
               <w:t xml:space="preserve">项目组</w:t>
@@ -724,6 +762,7 @@
             <w:r>
               <w:rPr>
                 <w:rFonts w:ascii="宋体" w:hAnsi="宋体" w:eastAsia="宋体"/>
+                <w:color w:val="000000"/>
                 <w:sz w:val="21"/>
               </w:rPr>
               <w:t xml:space="preserve">完成初版课程文档</w:t>
@@ -742,6 +781,7 @@
             <w:r>
               <w:rPr>
                 <w:rFonts w:ascii="宋体" w:hAnsi="宋体" w:eastAsia="宋体"/>
+                <w:color w:val="000000"/>
                 <w:sz w:val="21"/>
               </w:rPr>
               <w:t xml:space="preserve">V2.0</w:t>
@@ -758,6 +798,7 @@
             <w:r>
               <w:rPr>
                 <w:rFonts w:ascii="宋体" w:hAnsi="宋体" w:eastAsia="宋体"/>
+                <w:color w:val="000000"/>
                 <w:sz w:val="21"/>
               </w:rPr>
               <w:t xml:space="preserve">2026-03-12</w:t>
@@ -774,6 +815,7 @@
             <w:r>
               <w:rPr>
                 <w:rFonts w:ascii="宋体" w:hAnsi="宋体" w:eastAsia="宋体"/>
+                <w:color w:val="000000"/>
                 <w:sz w:val="21"/>
               </w:rPr>
               <w:t xml:space="preserve">项目组</w:t>
@@ -790,6 +832,7 @@
             <w:r>
               <w:rPr>
                 <w:rFonts w:ascii="宋体" w:hAnsi="宋体" w:eastAsia="宋体"/>
+                <w:color w:val="000000"/>
                 <w:sz w:val="21"/>
               </w:rPr>
               <w:t xml:space="preserve">统一项目名称、技术基线和阶段交付内容</w:t>
@@ -808,6 +851,7 @@
             <w:r>
               <w:rPr>
                 <w:rFonts w:ascii="宋体" w:hAnsi="宋体" w:eastAsia="宋体"/>
+                <w:color w:val="000000"/>
                 <w:sz w:val="21"/>
               </w:rPr>
               <w:t xml:space="preserve">V3.0</w:t>
@@ -824,6 +868,7 @@
             <w:r>
               <w:rPr>
                 <w:rFonts w:ascii="宋体" w:hAnsi="宋体" w:eastAsia="宋体"/>
+                <w:color w:val="000000"/>
                 <w:sz w:val="21"/>
               </w:rPr>
               <w:t xml:space="preserve">2026-06-14</w:t>
@@ -840,6 +885,7 @@
             <w:r>
               <w:rPr>
                 <w:rFonts w:ascii="宋体" w:hAnsi="宋体" w:eastAsia="宋体"/>
+                <w:color w:val="000000"/>
                 <w:sz w:val="21"/>
               </w:rPr>
               <w:t xml:space="preserve">项目组</w:t>
@@ -856,6 +902,7 @@
             <w:r>
               <w:rPr>
                 <w:rFonts w:ascii="宋体" w:hAnsi="宋体" w:eastAsia="宋体"/>
+                <w:color w:val="000000"/>
                 <w:sz w:val="21"/>
               </w:rPr>
               <w:t xml:space="preserve">参考课程交付样例统一封面与归档格式，补充数据理解、技术难点、测试验收和 DOCX 交付信息</w:t>
@@ -873,6 +920,7 @@
       <w:r>
         <w:rPr>
           <w:rFonts w:ascii="宋体" w:hAnsi="宋体" w:eastAsia="宋体"/>
+          <w:color w:val="000000"/>
         </w:rPr>
         <w:t xml:space="preserve">1. 项目概述</w:t>
       </w:r>
@@ -886,6 +934,7 @@
       <w:r>
         <w:rPr>
           <w:rFonts w:ascii="宋体" w:hAnsi="宋体" w:eastAsia="宋体"/>
+          <w:color w:val="000000"/>
         </w:rPr>
         <w:t xml:space="preserve">本项目面向工业轴承预测性维护场景，围绕轴承振动信号建立一个可运行、可测试、可复现实验的剩余寿命预测系统。系统支持 XJTU-SY 和 PHM2012/FEMTO 两类真实轴承退化数据集，提供数据加载、信号预处理、特征提取、RUL 标签构造、多模型训练、指标评估、实验记录和可视化输出能力。</w:t>
       </w:r>
@@ -899,12 +948,14 @@
       <w:r>
         <w:rPr>
           <w:rFonts w:ascii="宋体" w:hAnsi="宋体" w:eastAsia="宋体"/>
+          <w:color w:val="000000"/>
         </w:rPr>
         <w:t xml:space="preserve">与单个算法脚本不同，本项目重点体现软件工程课程要求：统一模块边界、统一训练与测试接口、完整文档体系、自动化测试和可复现实验记录。最终系统以</w:t>
       </w:r>
       <w:r>
         <w:rPr>
           <w:rFonts w:ascii="宋体" w:hAnsi="宋体" w:eastAsia="宋体"/>
+          <w:color w:val="000000"/>
         </w:rPr>
         <w:t xml:space="preserve"> </w:t>
       </w:r>
@@ -912,24 +963,28 @@
         <w:rPr>
           <w:rStyle w:val="VerbatimChar"/>
           <w:rFonts w:ascii="宋体" w:hAnsi="宋体" w:eastAsia="宋体"/>
+          <w:color w:val="000000"/>
         </w:rPr>
         <w:t xml:space="preserve">USTC.SSE.BearingPrediction</w:t>
       </w:r>
       <w:r>
         <w:rPr>
           <w:rFonts w:ascii="宋体" w:hAnsi="宋体" w:eastAsia="宋体"/>
+          <w:color w:val="000000"/>
         </w:rPr>
         <w:t xml:space="preserve"> </w:t>
       </w:r>
       <w:r>
         <w:rPr>
           <w:rFonts w:ascii="宋体" w:hAnsi="宋体" w:eastAsia="宋体"/>
+          <w:color w:val="000000"/>
         </w:rPr>
         <w:t xml:space="preserve">为主命名空间，通过</w:t>
       </w:r>
       <w:r>
         <w:rPr>
           <w:rFonts w:ascii="宋体" w:hAnsi="宋体" w:eastAsia="宋体"/>
+          <w:color w:val="000000"/>
         </w:rPr>
         <w:t xml:space="preserve"> </w:t>
       </w:r>
@@ -937,18 +992,21 @@
         <w:rPr>
           <w:rStyle w:val="VerbatimChar"/>
           <w:rFonts w:ascii="宋体" w:hAnsi="宋体" w:eastAsia="宋体"/>
+          <w:color w:val="000000"/>
         </w:rPr>
         <w:t xml:space="preserve">uv</w:t>
       </w:r>
       <w:r>
         <w:rPr>
           <w:rFonts w:ascii="宋体" w:hAnsi="宋体" w:eastAsia="宋体"/>
+          <w:color w:val="000000"/>
         </w:rPr>
         <w:t xml:space="preserve"> </w:t>
       </w:r>
       <w:r>
         <w:rPr>
           <w:rFonts w:ascii="宋体" w:hAnsi="宋体" w:eastAsia="宋体"/>
+          <w:color w:val="000000"/>
         </w:rPr>
         <w:t xml:space="preserve">管理环境，并以 notebook、API 文档和课程文档支撑验收与答辩。</w:t>
       </w:r>
@@ -962,6 +1020,7 @@
       <w:r>
         <w:rPr>
           <w:rFonts w:ascii="宋体" w:hAnsi="宋体" w:eastAsia="宋体"/>
+          <w:color w:val="000000"/>
         </w:rPr>
         <w:t xml:space="preserve">2. 完成情况</w:t>
       </w:r>
@@ -975,6 +1034,7 @@
       <w:r>
         <w:rPr>
           <w:rFonts w:ascii="宋体" w:hAnsi="宋体" w:eastAsia="宋体"/>
+          <w:color w:val="000000"/>
         </w:rPr>
         <w:t xml:space="preserve">项目已完成以下核心功能：</w:t>
       </w:r>
@@ -1012,6 +1072,7 @@
               <w:rPr>
                 <w:rFonts w:ascii="宋体" w:hAnsi="宋体" w:eastAsia="宋体"/>
                 <w:b/>
+                <w:color w:val="000000"/>
                 <w:sz w:val="21"/>
               </w:rPr>
               <w:t xml:space="preserve">模块</w:t>
@@ -1032,6 +1093,7 @@
               <w:rPr>
                 <w:rFonts w:ascii="宋体" w:hAnsi="宋体" w:eastAsia="宋体"/>
                 <w:b/>
+                <w:color w:val="000000"/>
                 <w:sz w:val="21"/>
               </w:rPr>
               <w:t xml:space="preserve">完成内容</w:t>
@@ -1050,6 +1112,7 @@
             <w:r>
               <w:rPr>
                 <w:rFonts w:ascii="宋体" w:hAnsi="宋体" w:eastAsia="宋体"/>
+                <w:color w:val="000000"/>
                 <w:sz w:val="21"/>
               </w:rPr>
               <w:t xml:space="preserve">数据管理</w:t>
@@ -1066,6 +1129,7 @@
             <w:r>
               <w:rPr>
                 <w:rFonts w:ascii="宋体" w:hAnsi="宋体" w:eastAsia="宋体"/>
+                <w:color w:val="000000"/>
                 <w:sz w:val="21"/>
               </w:rPr>
               <w:t xml:space="preserve">支持</w:t>
@@ -1073,6 +1137,7 @@
             <w:r>
               <w:rPr>
                 <w:rFonts w:ascii="宋体" w:hAnsi="宋体" w:eastAsia="宋体"/>
+                <w:color w:val="000000"/>
                 <w:sz w:val="21"/>
               </w:rPr>
               <w:t xml:space="preserve"> </w:t>
@@ -1081,6 +1146,7 @@
               <w:rPr>
                 <w:rStyle w:val="VerbatimChar"/>
                 <w:rFonts w:ascii="宋体" w:hAnsi="宋体" w:eastAsia="宋体"/>
+                <w:color w:val="000000"/>
                 <w:sz w:val="21"/>
               </w:rPr>
               <w:t xml:space="preserve">XJTULoader</w:t>
@@ -1088,6 +1154,7 @@
             <w:r>
               <w:rPr>
                 <w:rFonts w:ascii="宋体" w:hAnsi="宋体" w:eastAsia="宋体"/>
+                <w:color w:val="000000"/>
                 <w:sz w:val="21"/>
               </w:rPr>
               <w:t xml:space="preserve">、</w:t>
@@ -1096,6 +1163,7 @@
               <w:rPr>
                 <w:rStyle w:val="VerbatimChar"/>
                 <w:rFonts w:ascii="宋体" w:hAnsi="宋体" w:eastAsia="宋体"/>
+                <w:color w:val="000000"/>
                 <w:sz w:val="21"/>
               </w:rPr>
               <w:t xml:space="preserve">PHM2012Loader</w:t>
@@ -1103,6 +1171,7 @@
             <w:r>
               <w:rPr>
                 <w:rFonts w:ascii="宋体" w:hAnsi="宋体" w:eastAsia="宋体"/>
+                <w:color w:val="000000"/>
                 <w:sz w:val="21"/>
               </w:rPr>
               <w:t xml:space="preserve">、</w:t>
@@ -1111,6 +1180,7 @@
               <w:rPr>
                 <w:rStyle w:val="VerbatimChar"/>
                 <w:rFonts w:ascii="宋体" w:hAnsi="宋体" w:eastAsia="宋体"/>
+                <w:color w:val="000000"/>
                 <w:sz w:val="21"/>
               </w:rPr>
               <w:t xml:space="preserve">SyntheticBearingFactory</w:t>
@@ -1118,6 +1188,7 @@
             <w:r>
               <w:rPr>
                 <w:rFonts w:ascii="宋体" w:hAnsi="宋体" w:eastAsia="宋体"/>
+                <w:color w:val="000000"/>
                 <w:sz w:val="21"/>
               </w:rPr>
               <w:t xml:space="preserve">，并补充真实数据抽样加载能力</w:t>
@@ -1136,6 +1207,7 @@
             <w:r>
               <w:rPr>
                 <w:rFonts w:ascii="宋体" w:hAnsi="宋体" w:eastAsia="宋体"/>
+                <w:color w:val="000000"/>
                 <w:sz w:val="21"/>
               </w:rPr>
               <w:t xml:space="preserve">预处理</w:t>
@@ -1152,6 +1224,7 @@
             <w:r>
               <w:rPr>
                 <w:rFonts w:ascii="宋体" w:hAnsi="宋体" w:eastAsia="宋体"/>
+                <w:color w:val="000000"/>
                 <w:sz w:val="21"/>
               </w:rPr>
               <w:t xml:space="preserve">支持鲁棒裁剪、Z-score、Min-Max、滑动窗口切分</w:t>
@@ -1170,6 +1243,7 @@
             <w:r>
               <w:rPr>
                 <w:rFonts w:ascii="宋体" w:hAnsi="宋体" w:eastAsia="宋体"/>
+                <w:color w:val="000000"/>
                 <w:sz w:val="21"/>
               </w:rPr>
               <w:t xml:space="preserve">特征工程</w:t>
@@ -1186,6 +1260,7 @@
             <w:r>
               <w:rPr>
                 <w:rFonts w:ascii="宋体" w:hAnsi="宋体" w:eastAsia="宋体"/>
+                <w:color w:val="000000"/>
                 <w:sz w:val="21"/>
               </w:rPr>
               <w:t xml:space="preserve">支持 19 维时域/频域特征，覆盖论文复现所需基础特征</w:t>
@@ -1204,6 +1279,7 @@
             <w:r>
               <w:rPr>
                 <w:rFonts w:ascii="宋体" w:hAnsi="宋体" w:eastAsia="宋体"/>
+                <w:color w:val="000000"/>
                 <w:sz w:val="21"/>
               </w:rPr>
               <w:t xml:space="preserve">标签构造</w:t>
@@ -1220,6 +1296,7 @@
             <w:r>
               <w:rPr>
                 <w:rFonts w:ascii="宋体" w:hAnsi="宋体" w:eastAsia="宋体"/>
+                <w:color w:val="000000"/>
                 <w:sz w:val="21"/>
               </w:rPr>
               <w:t xml:space="preserve">支持 RUL 窗口标签、特征序列 RUL 标签、健康指标序列标签、退化阶段标签</w:t>
@@ -1238,6 +1315,7 @@
             <w:r>
               <w:rPr>
                 <w:rFonts w:ascii="宋体" w:hAnsi="宋体" w:eastAsia="宋体"/>
+                <w:color w:val="000000"/>
                 <w:sz w:val="21"/>
               </w:rPr>
               <w:t xml:space="preserve">模型</w:t>
@@ -1254,6 +1332,7 @@
             <w:r>
               <w:rPr>
                 <w:rFonts w:ascii="宋体" w:hAnsi="宋体" w:eastAsia="宋体"/>
+                <w:color w:val="000000"/>
                 <w:sz w:val="21"/>
               </w:rPr>
               <w:t xml:space="preserve">支持 CNN、RNN、MLP、Transformer、CNN-LSTM-AM、XLSTM-Transformer 等模型</w:t>
@@ -1272,6 +1351,7 @@
             <w:r>
               <w:rPr>
                 <w:rFonts w:ascii="宋体" w:hAnsi="宋体" w:eastAsia="宋体"/>
+                <w:color w:val="000000"/>
                 <w:sz w:val="21"/>
               </w:rPr>
               <w:t xml:space="preserve">训练测试</w:t>
@@ -1288,6 +1368,7 @@
             <w:r>
               <w:rPr>
                 <w:rFonts w:ascii="宋体" w:hAnsi="宋体" w:eastAsia="宋体"/>
+                <w:color w:val="000000"/>
                 <w:sz w:val="21"/>
               </w:rPr>
               <w:t xml:space="preserve">支持统一</w:t>
@@ -1295,6 +1376,7 @@
             <w:r>
               <w:rPr>
                 <w:rFonts w:ascii="宋体" w:hAnsi="宋体" w:eastAsia="宋体"/>
+                <w:color w:val="000000"/>
                 <w:sz w:val="21"/>
               </w:rPr>
               <w:t xml:space="preserve"> </w:t>
@@ -1303,6 +1385,7 @@
               <w:rPr>
                 <w:rStyle w:val="VerbatimChar"/>
                 <w:rFonts w:ascii="宋体" w:hAnsi="宋体" w:eastAsia="宋体"/>
+                <w:color w:val="000000"/>
                 <w:sz w:val="21"/>
               </w:rPr>
               <w:t xml:space="preserve">BaseTrainer</w:t>
@@ -1310,6 +1393,7 @@
             <w:r>
               <w:rPr>
                 <w:rFonts w:ascii="宋体" w:hAnsi="宋体" w:eastAsia="宋体"/>
+                <w:color w:val="000000"/>
                 <w:sz w:val="21"/>
               </w:rPr>
               <w:t xml:space="preserve">、</w:t>
@@ -1318,6 +1402,7 @@
               <w:rPr>
                 <w:rStyle w:val="VerbatimChar"/>
                 <w:rFonts w:ascii="宋体" w:hAnsi="宋体" w:eastAsia="宋体"/>
+                <w:color w:val="000000"/>
                 <w:sz w:val="21"/>
               </w:rPr>
               <w:t xml:space="preserve">BaseTester</w:t>
@@ -1325,6 +1410,7 @@
             <w:r>
               <w:rPr>
                 <w:rFonts w:ascii="宋体" w:hAnsi="宋体" w:eastAsia="宋体"/>
+                <w:color w:val="000000"/>
                 <w:sz w:val="21"/>
               </w:rPr>
               <w:t xml:space="preserve">、实验配置记录、历史记录和预测结果导出</w:t>
@@ -1343,6 +1429,7 @@
             <w:r>
               <w:rPr>
                 <w:rFonts w:ascii="宋体" w:hAnsi="宋体" w:eastAsia="宋体"/>
+                <w:color w:val="000000"/>
                 <w:sz w:val="21"/>
               </w:rPr>
               <w:t xml:space="preserve">评价指标</w:t>
@@ -1359,6 +1446,7 @@
             <w:r>
               <w:rPr>
                 <w:rFonts w:ascii="宋体" w:hAnsi="宋体" w:eastAsia="宋体"/>
+                <w:color w:val="000000"/>
                 <w:sz w:val="21"/>
               </w:rPr>
               <w:t xml:space="preserve">支持 MAE、RMSE、NormalizedRMSE、R2、SMAPE、Huang RUL Score、PHM/RUL 非对称惩罚 score 和方向性偏差指标</w:t>
@@ -1377,6 +1465,7 @@
             <w:r>
               <w:rPr>
                 <w:rFonts w:ascii="宋体" w:hAnsi="宋体" w:eastAsia="宋体"/>
+                <w:color w:val="000000"/>
                 <w:sz w:val="21"/>
               </w:rPr>
               <w:t xml:space="preserve">论文复现</w:t>
@@ -1393,6 +1482,7 @@
             <w:r>
               <w:rPr>
                 <w:rFonts w:ascii="宋体" w:hAnsi="宋体" w:eastAsia="宋体"/>
+                <w:color w:val="000000"/>
                 <w:sz w:val="21"/>
               </w:rPr>
               <w:t xml:space="preserve">完成 CNN-LSTM-AM 与 xLSTM-Transformer 两篇 RUL 论文的工程化复现</w:t>
@@ -1411,6 +1501,7 @@
             <w:r>
               <w:rPr>
                 <w:rFonts w:ascii="宋体" w:hAnsi="宋体" w:eastAsia="宋体"/>
+                <w:color w:val="000000"/>
                 <w:sz w:val="21"/>
               </w:rPr>
               <w:t xml:space="preserve">失效概率/生存分析</w:t>
@@ -1427,6 +1518,7 @@
             <w:r>
               <w:rPr>
                 <w:rFonts w:ascii="宋体" w:hAnsi="宋体" w:eastAsia="宋体"/>
+                <w:color w:val="000000"/>
                 <w:sz w:val="21"/>
               </w:rPr>
               <w:t xml:space="preserve">保留 Kaplan-Meier、Cox 等基础接口和文档说明，未作为本轮结题主验收路线</w:t>
@@ -1445,6 +1537,7 @@
             <w:r>
               <w:rPr>
                 <w:rFonts w:ascii="宋体" w:hAnsi="宋体" w:eastAsia="宋体"/>
+                <w:color w:val="000000"/>
                 <w:sz w:val="21"/>
               </w:rPr>
               <w:t xml:space="preserve">文档交付</w:t>
@@ -1461,6 +1554,7 @@
             <w:r>
               <w:rPr>
                 <w:rFonts w:ascii="宋体" w:hAnsi="宋体" w:eastAsia="宋体"/>
+                <w:color w:val="000000"/>
                 <w:sz w:val="21"/>
               </w:rPr>
               <w:t xml:space="preserve">完成开题、中期、结题、测试、用户、安装、技术论文和贡献说明文档</w:t>
@@ -1477,6 +1571,7 @@
       <w:r>
         <w:rPr>
           <w:rFonts w:ascii="宋体" w:hAnsi="宋体" w:eastAsia="宋体"/>
+          <w:color w:val="000000"/>
         </w:rPr>
         <w:t xml:space="preserve">2.1 数据理解与特征分析成果</w:t>
       </w:r>
@@ -1490,6 +1585,7 @@
       <w:r>
         <w:rPr>
           <w:rFonts w:ascii="宋体" w:hAnsi="宋体" w:eastAsia="宋体"/>
+          <w:color w:val="000000"/>
         </w:rPr>
         <w:t xml:space="preserve">本项目在结题阶段已经形成对两个真实轴承数据集的基本认识：</w:t>
       </w:r>
@@ -1529,6 +1625,7 @@
               <w:rPr>
                 <w:rFonts w:ascii="宋体" w:hAnsi="宋体" w:eastAsia="宋体"/>
                 <w:b/>
+                <w:color w:val="000000"/>
                 <w:sz w:val="21"/>
               </w:rPr>
               <w:t xml:space="preserve">数据集</w:t>
@@ -1549,6 +1646,7 @@
               <w:rPr>
                 <w:rFonts w:ascii="宋体" w:hAnsi="宋体" w:eastAsia="宋体"/>
                 <w:b/>
+                <w:color w:val="000000"/>
                 <w:sz w:val="21"/>
               </w:rPr>
               <w:t xml:space="preserve">数据特点</w:t>
@@ -1569,6 +1667,7 @@
               <w:rPr>
                 <w:rFonts w:ascii="宋体" w:hAnsi="宋体" w:eastAsia="宋体"/>
                 <w:b/>
+                <w:color w:val="000000"/>
                 <w:sz w:val="21"/>
               </w:rPr>
               <w:t xml:space="preserve">观察到的退化规律</w:t>
@@ -1589,6 +1688,7 @@
               <w:rPr>
                 <w:rFonts w:ascii="宋体" w:hAnsi="宋体" w:eastAsia="宋体"/>
                 <w:b/>
+                <w:color w:val="000000"/>
                 <w:sz w:val="21"/>
               </w:rPr>
               <w:t xml:space="preserve">对建模的影响</w:t>
@@ -1607,6 +1707,7 @@
             <w:r>
               <w:rPr>
                 <w:rFonts w:ascii="宋体" w:hAnsi="宋体" w:eastAsia="宋体"/>
+                <w:color w:val="000000"/>
                 <w:sz w:val="21"/>
               </w:rPr>
               <w:t xml:space="preserve">XJTU-SY</w:t>
@@ -1623,6 +1724,7 @@
             <w:r>
               <w:rPr>
                 <w:rFonts w:ascii="宋体" w:hAnsi="宋体" w:eastAsia="宋体"/>
+                <w:color w:val="000000"/>
                 <w:sz w:val="21"/>
               </w:rPr>
               <w:t xml:space="preserve">三工况、多个轴承全寿命序列，单快照长，分钟级间隔</w:t>
@@ -1639,6 +1741,7 @@
             <w:r>
               <w:rPr>
                 <w:rFonts w:ascii="宋体" w:hAnsi="宋体" w:eastAsia="宋体"/>
+                <w:color w:val="000000"/>
                 <w:sz w:val="21"/>
               </w:rPr>
               <w:t xml:space="preserve">以 Bearing1_1 为例，寿命后期 RMS、峰值和综合健康指标明显抬升</w:t>
@@ -1655,6 +1758,7 @@
             <w:r>
               <w:rPr>
                 <w:rFonts w:ascii="宋体" w:hAnsi="宋体" w:eastAsia="宋体"/>
+                <w:color w:val="000000"/>
                 <w:sz w:val="21"/>
               </w:rPr>
               <w:t xml:space="preserve">适合展示完整退化曲线，训练划分应按轴承或时间顺序组织</w:t>
@@ -1673,6 +1777,7 @@
             <w:r>
               <w:rPr>
                 <w:rFonts w:ascii="宋体" w:hAnsi="宋体" w:eastAsia="宋体"/>
+                <w:color w:val="000000"/>
                 <w:sz w:val="21"/>
               </w:rPr>
               <w:t xml:space="preserve">PHM2012/FEMTO</w:t>
@@ -1689,6 +1794,7 @@
             <w:r>
               <w:rPr>
                 <w:rFonts w:ascii="宋体" w:hAnsi="宋体" w:eastAsia="宋体"/>
+                <w:color w:val="000000"/>
                 <w:sz w:val="21"/>
               </w:rPr>
               <w:t xml:space="preserve">文件更密，包含加速度和温度信息，Learning/Test/Full_Test 语义明确</w:t>
@@ -1705,6 +1811,7 @@
             <w:r>
               <w:rPr>
                 <w:rFonts w:ascii="宋体" w:hAnsi="宋体" w:eastAsia="宋体"/>
+                <w:color w:val="000000"/>
                 <w:sz w:val="21"/>
               </w:rPr>
               <w:t xml:space="preserve">以 Bearing1_1 为例，后期振动强度增强，但曲线更密集、波动更明显</w:t>
@@ -1721,6 +1828,7 @@
             <w:r>
               <w:rPr>
                 <w:rFonts w:ascii="宋体" w:hAnsi="宋体" w:eastAsia="宋体"/>
+                <w:color w:val="000000"/>
                 <w:sz w:val="21"/>
               </w:rPr>
               <w:t xml:space="preserve">需要 loader 解释 split 语义，并对官方终止 RUL 信息保持可追溯</w:t>
@@ -1738,6 +1846,7 @@
       <w:r>
         <w:rPr>
           <w:rFonts w:ascii="宋体" w:hAnsi="宋体" w:eastAsia="宋体"/>
+          <w:color w:val="000000"/>
         </w:rPr>
         <w:t xml:space="preserve">特征层采用 19 维时域/频域特征。RMS 和谱能量用于反映振动强度，峭度、峰值因子和脉冲因子用于反映冲击增强，谱熵和主频用于补充频率分布变化。这些特征既作为模型输入，也用于答辩中说明数据规律。</w:t>
       </w:r>
@@ -1751,6 +1860,7 @@
       <w:r>
         <w:rPr>
           <w:rFonts w:ascii="宋体" w:hAnsi="宋体" w:eastAsia="宋体"/>
+          <w:color w:val="000000"/>
         </w:rPr>
         <w:t xml:space="preserve">2.2 项目难点与解决方案</w:t>
       </w:r>
@@ -1785,6 +1895,7 @@
               <w:rPr>
                 <w:rFonts w:ascii="宋体" w:hAnsi="宋体" w:eastAsia="宋体"/>
                 <w:b/>
+                <w:color w:val="000000"/>
                 <w:sz w:val="21"/>
               </w:rPr>
               <w:t xml:space="preserve">难点</w:t>
@@ -1805,6 +1916,7 @@
               <w:rPr>
                 <w:rFonts w:ascii="宋体" w:hAnsi="宋体" w:eastAsia="宋体"/>
                 <w:b/>
+                <w:color w:val="000000"/>
                 <w:sz w:val="21"/>
               </w:rPr>
               <w:t xml:space="preserve">解决原则</w:t>
@@ -1825,6 +1937,7 @@
               <w:rPr>
                 <w:rFonts w:ascii="宋体" w:hAnsi="宋体" w:eastAsia="宋体"/>
                 <w:b/>
+                <w:color w:val="000000"/>
                 <w:sz w:val="21"/>
               </w:rPr>
               <w:t xml:space="preserve">实现结果</w:t>
@@ -1843,6 +1956,7 @@
             <w:r>
               <w:rPr>
                 <w:rFonts w:ascii="宋体" w:hAnsi="宋体" w:eastAsia="宋体"/>
+                <w:color w:val="000000"/>
                 <w:sz w:val="21"/>
               </w:rPr>
               <w:t xml:space="preserve">两个数据集格式不同</w:t>
@@ -1859,6 +1973,7 @@
             <w:r>
               <w:rPr>
                 <w:rFonts w:ascii="宋体" w:hAnsi="宋体" w:eastAsia="宋体"/>
+                <w:color w:val="000000"/>
                 <w:sz w:val="21"/>
               </w:rPr>
               <w:t xml:space="preserve">将目录差异收敛在 loader 层</w:t>
@@ -1876,6 +1991,7 @@
               <w:rPr>
                 <w:rStyle w:val="VerbatimChar"/>
                 <w:rFonts w:ascii="宋体" w:hAnsi="宋体" w:eastAsia="宋体"/>
+                <w:color w:val="000000"/>
                 <w:sz w:val="21"/>
               </w:rPr>
               <w:t xml:space="preserve">XJTULoader</w:t>
@@ -1883,6 +1999,7 @@
             <w:r>
               <w:rPr>
                 <w:rFonts w:ascii="宋体" w:hAnsi="宋体" w:eastAsia="宋体"/>
+                <w:color w:val="000000"/>
                 <w:sz w:val="21"/>
               </w:rPr>
               <w:t xml:space="preserve"> </w:t>
@@ -1890,6 +2007,7 @@
             <w:r>
               <w:rPr>
                 <w:rFonts w:ascii="宋体" w:hAnsi="宋体" w:eastAsia="宋体"/>
+                <w:color w:val="000000"/>
                 <w:sz w:val="21"/>
               </w:rPr>
               <w:t xml:space="preserve">和</w:t>
@@ -1897,6 +2015,7 @@
             <w:r>
               <w:rPr>
                 <w:rFonts w:ascii="宋体" w:hAnsi="宋体" w:eastAsia="宋体"/>
+                <w:color w:val="000000"/>
                 <w:sz w:val="21"/>
               </w:rPr>
               <w:t xml:space="preserve"> </w:t>
@@ -1905,6 +2024,7 @@
               <w:rPr>
                 <w:rStyle w:val="VerbatimChar"/>
                 <w:rFonts w:ascii="宋体" w:hAnsi="宋体" w:eastAsia="宋体"/>
+                <w:color w:val="000000"/>
                 <w:sz w:val="21"/>
               </w:rPr>
               <w:t xml:space="preserve">PHM2012Loader</w:t>
@@ -1912,6 +2032,7 @@
             <w:r>
               <w:rPr>
                 <w:rFonts w:ascii="宋体" w:hAnsi="宋体" w:eastAsia="宋体"/>
+                <w:color w:val="000000"/>
                 <w:sz w:val="21"/>
               </w:rPr>
               <w:t xml:space="preserve"> </w:t>
@@ -1919,6 +2040,7 @@
             <w:r>
               <w:rPr>
                 <w:rFonts w:ascii="宋体" w:hAnsi="宋体" w:eastAsia="宋体"/>
+                <w:color w:val="000000"/>
                 <w:sz w:val="21"/>
               </w:rPr>
               <w:t xml:space="preserve">输出统一实体</w:t>
@@ -1937,6 +2059,7 @@
             <w:r>
               <w:rPr>
                 <w:rFonts w:ascii="宋体" w:hAnsi="宋体" w:eastAsia="宋体"/>
+                <w:color w:val="000000"/>
                 <w:sz w:val="21"/>
               </w:rPr>
               <w:t xml:space="preserve">原始信号长度不同</w:t>
@@ -1953,6 +2076,7 @@
             <w:r>
               <w:rPr>
                 <w:rFonts w:ascii="宋体" w:hAnsi="宋体" w:eastAsia="宋体"/>
+                <w:color w:val="000000"/>
                 <w:sz w:val="21"/>
               </w:rPr>
               <w:t xml:space="preserve">先提取可解释特征，再组织序列</w:t>
@@ -1969,6 +2093,7 @@
             <w:r>
               <w:rPr>
                 <w:rFonts w:ascii="宋体" w:hAnsi="宋体" w:eastAsia="宋体"/>
+                <w:color w:val="000000"/>
                 <w:sz w:val="21"/>
               </w:rPr>
               <w:t xml:space="preserve">支持 19 维特征和</w:t>
@@ -1976,6 +2101,7 @@
             <w:r>
               <w:rPr>
                 <w:rFonts w:ascii="宋体" w:hAnsi="宋体" w:eastAsia="宋体"/>
+                <w:color w:val="000000"/>
                 <w:sz w:val="21"/>
               </w:rPr>
               <w:t xml:space="preserve"> </w:t>
@@ -1984,6 +2110,7 @@
               <w:rPr>
                 <w:rStyle w:val="VerbatimChar"/>
                 <w:rFonts w:ascii="宋体" w:hAnsi="宋体" w:eastAsia="宋体"/>
+                <w:color w:val="000000"/>
                 <w:sz w:val="21"/>
               </w:rPr>
               <w:t xml:space="preserve">FeatureSequenceRulLabeler</w:t>
@@ -2002,6 +2129,7 @@
             <w:r>
               <w:rPr>
                 <w:rFonts w:ascii="宋体" w:hAnsi="宋体" w:eastAsia="宋体"/>
+                <w:color w:val="000000"/>
                 <w:sz w:val="21"/>
               </w:rPr>
               <w:t xml:space="preserve">RUL 标签和时间单位易混淆</w:t>
@@ -2018,6 +2146,7 @@
             <w:r>
               <w:rPr>
                 <w:rFonts w:ascii="宋体" w:hAnsi="宋体" w:eastAsia="宋体"/>
+                <w:color w:val="000000"/>
                 <w:sz w:val="21"/>
               </w:rPr>
               <w:t xml:space="preserve">在标签构造和文档中保留单位说明</w:t>
@@ -2034,6 +2163,7 @@
             <w:r>
               <w:rPr>
                 <w:rFonts w:ascii="宋体" w:hAnsi="宋体" w:eastAsia="宋体"/>
+                <w:color w:val="000000"/>
                 <w:sz w:val="21"/>
               </w:rPr>
               <w:t xml:space="preserve">notebook 和测试均检查 prediction_count 与 target</w:t>
@@ -2052,6 +2182,7 @@
             <w:r>
               <w:rPr>
                 <w:rFonts w:ascii="宋体" w:hAnsi="宋体" w:eastAsia="宋体"/>
+                <w:color w:val="000000"/>
                 <w:sz w:val="21"/>
               </w:rPr>
               <w:t xml:space="preserve">论文 score 口径不同</w:t>
@@ -2068,6 +2199,7 @@
             <w:r>
               <w:rPr>
                 <w:rFonts w:ascii="宋体" w:hAnsi="宋体" w:eastAsia="宋体"/>
+                <w:color w:val="000000"/>
                 <w:sz w:val="21"/>
               </w:rPr>
               <w:t xml:space="preserve">区分论文原版 Score、PHM/RUL 惩罚 Score 和普通误差</w:t>
@@ -2084,6 +2216,7 @@
             <w:r>
               <w:rPr>
                 <w:rFonts w:ascii="宋体" w:hAnsi="宋体" w:eastAsia="宋体"/>
+                <w:color w:val="000000"/>
                 <w:sz w:val="21"/>
               </w:rPr>
               <w:t xml:space="preserve">新增 RUL 指标体系并写入复现文档</w:t>
@@ -2102,6 +2235,7 @@
             <w:r>
               <w:rPr>
                 <w:rFonts w:ascii="宋体" w:hAnsi="宋体" w:eastAsia="宋体"/>
+                <w:color w:val="000000"/>
                 <w:sz w:val="21"/>
               </w:rPr>
               <w:t xml:space="preserve">课程验收需要可复跑</w:t>
@@ -2118,6 +2252,7 @@
             <w:r>
               <w:rPr>
                 <w:rFonts w:ascii="宋体" w:hAnsi="宋体" w:eastAsia="宋体"/>
+                <w:color w:val="000000"/>
                 <w:sz w:val="21"/>
               </w:rPr>
               <w:t xml:space="preserve">将 notebook、pytest、真实训练输出分层验证</w:t>
@@ -2134,6 +2269,7 @@
             <w:r>
               <w:rPr>
                 <w:rFonts w:ascii="宋体" w:hAnsi="宋体" w:eastAsia="宋体"/>
+                <w:color w:val="000000"/>
                 <w:sz w:val="21"/>
               </w:rPr>
               <w:t xml:space="preserve">8 个 notebook smoke、31 个测试和真实训练记录</w:t>
@@ -2152,6 +2288,7 @@
       <w:r>
         <w:rPr>
           <w:rFonts w:ascii="宋体" w:hAnsi="宋体" w:eastAsia="宋体"/>
+          <w:color w:val="000000"/>
         </w:rPr>
         <w:t xml:space="preserve">3. 论文复现成果</w:t>
       </w:r>
@@ -2164,6 +2301,7 @@
       <w:r>
         <w:rPr>
           <w:rFonts w:ascii="宋体" w:hAnsi="宋体" w:eastAsia="宋体"/>
+          <w:color w:val="000000"/>
         </w:rPr>
         <w:t xml:space="preserve">3.1 CNN-LSTM-AM 复现</w:t>
       </w:r>
@@ -2177,12 +2315,14 @@
       <w:r>
         <w:rPr>
           <w:rFonts w:ascii="宋体" w:hAnsi="宋体" w:eastAsia="宋体"/>
+          <w:color w:val="000000"/>
         </w:rPr>
         <w:t xml:space="preserve">项目复现 Huang 等 2024 年 CNN-LSTM-AM 论文中的核心流程：19 维振动特征、CNN 局部特征编码、LSTM 时序建模、attention 聚合和 RUL 回归。复现 notebook 为</w:t>
       </w:r>
       <w:r>
         <w:rPr>
           <w:rFonts w:ascii="宋体" w:hAnsi="宋体" w:eastAsia="宋体"/>
+          <w:color w:val="000000"/>
         </w:rPr>
         <w:t xml:space="preserve"> </w:t>
       </w:r>
@@ -2190,12 +2330,14 @@
         <w:rPr>
           <w:rStyle w:val="VerbatimChar"/>
           <w:rFonts w:ascii="宋体" w:hAnsi="宋体" w:eastAsia="宋体"/>
+          <w:color w:val="000000"/>
         </w:rPr>
         <w:t xml:space="preserve">examples/06_paper_cnn_lstm_attention_rul.ipynb</w:t>
       </w:r>
       <w:r>
         <w:rPr>
           <w:rFonts w:ascii="宋体" w:hAnsi="宋体" w:eastAsia="宋体"/>
+          <w:color w:val="000000"/>
         </w:rPr>
         <w:t xml:space="preserve">。</w:t>
       </w:r>
@@ -2209,12 +2351,14 @@
       <w:r>
         <w:rPr>
           <w:rFonts w:ascii="宋体" w:hAnsi="宋体" w:eastAsia="宋体"/>
+          <w:color w:val="000000"/>
         </w:rPr>
         <w:t xml:space="preserve">真实数据 8 epoch 小规模训练验收结果显示，XJTU-SY 和 PHM2012 均能完成 CNN-LSTM-AM 与 CNN-LSTM baseline 对比，并输出</w:t>
       </w:r>
       <w:r>
         <w:rPr>
           <w:rFonts w:ascii="宋体" w:hAnsi="宋体" w:eastAsia="宋体"/>
+          <w:color w:val="000000"/>
         </w:rPr>
         <w:t xml:space="preserve"> </w:t>
       </w:r>
@@ -2222,12 +2366,14 @@
         <w:rPr>
           <w:rStyle w:val="VerbatimChar"/>
           <w:rFonts w:ascii="宋体" w:hAnsi="宋体" w:eastAsia="宋体"/>
+          <w:color w:val="000000"/>
         </w:rPr>
         <w:t xml:space="preserve">huang_rul_score</w:t>
       </w:r>
       <w:r>
         <w:rPr>
           <w:rFonts w:ascii="宋体" w:hAnsi="宋体" w:eastAsia="宋体"/>
+          <w:color w:val="000000"/>
         </w:rPr>
         <w:t xml:space="preserve">、</w:t>
       </w:r>
@@ -2235,12 +2381,14 @@
         <w:rPr>
           <w:rStyle w:val="VerbatimChar"/>
           <w:rFonts w:ascii="宋体" w:hAnsi="宋体" w:eastAsia="宋体"/>
+          <w:color w:val="000000"/>
         </w:rPr>
         <w:t xml:space="preserve">normalized_rmse</w:t>
       </w:r>
       <w:r>
         <w:rPr>
           <w:rFonts w:ascii="宋体" w:hAnsi="宋体" w:eastAsia="宋体"/>
+          <w:color w:val="000000"/>
         </w:rPr>
         <w:t xml:space="preserve">、</w:t>
       </w:r>
@@ -2248,12 +2396,14 @@
         <w:rPr>
           <w:rStyle w:val="VerbatimChar"/>
           <w:rFonts w:ascii="宋体" w:hAnsi="宋体" w:eastAsia="宋体"/>
+          <w:color w:val="000000"/>
         </w:rPr>
         <w:t xml:space="preserve">smape</w:t>
       </w:r>
       <w:r>
         <w:rPr>
           <w:rFonts w:ascii="宋体" w:hAnsi="宋体" w:eastAsia="宋体"/>
+          <w:color w:val="000000"/>
         </w:rPr>
         <w:t xml:space="preserve">、方向性偏差和相对变化列。</w:t>
       </w:r>
@@ -2288,6 +2438,7 @@
               <w:rPr>
                 <w:rFonts w:ascii="宋体" w:hAnsi="宋体" w:eastAsia="宋体"/>
                 <w:b/>
+                <w:color w:val="000000"/>
                 <w:sz w:val="21"/>
               </w:rPr>
               <w:t xml:space="preserve">数据集与轴承</w:t>
@@ -2308,6 +2459,7 @@
               <w:rPr>
                 <w:rFonts w:ascii="宋体" w:hAnsi="宋体" w:eastAsia="宋体"/>
                 <w:b/>
+                <w:color w:val="000000"/>
                 <w:sz w:val="21"/>
               </w:rPr>
               <w:t xml:space="preserve">模型</w:t>
@@ -2328,6 +2480,7 @@
               <w:rPr>
                 <w:rFonts w:ascii="宋体" w:hAnsi="宋体" w:eastAsia="宋体"/>
                 <w:b/>
+                <w:color w:val="000000"/>
                 <w:sz w:val="21"/>
               </w:rPr>
               <w:t xml:space="preserve">RMSE</w:t>
@@ -2348,6 +2501,7 @@
               <w:rPr>
                 <w:rFonts w:ascii="宋体" w:hAnsi="宋体" w:eastAsia="宋体"/>
                 <w:b/>
+                <w:color w:val="000000"/>
                 <w:sz w:val="21"/>
               </w:rPr>
               <w:t xml:space="preserve">NormalizedRMSE</w:t>
@@ -2368,6 +2522,7 @@
               <w:rPr>
                 <w:rFonts w:ascii="宋体" w:hAnsi="宋体" w:eastAsia="宋体"/>
                 <w:b/>
+                <w:color w:val="000000"/>
                 <w:sz w:val="21"/>
               </w:rPr>
               <w:t xml:space="preserve">Huang RUL Score</w:t>
@@ -2386,6 +2541,7 @@
             <w:r>
               <w:rPr>
                 <w:rFonts w:ascii="宋体" w:hAnsi="宋体" w:eastAsia="宋体"/>
+                <w:color w:val="000000"/>
                 <w:sz w:val="21"/>
               </w:rPr>
               <w:t xml:space="preserve">XJTU-SY Bearing1_5</w:t>
@@ -2402,6 +2558,7 @@
             <w:r>
               <w:rPr>
                 <w:rFonts w:ascii="宋体" w:hAnsi="宋体" w:eastAsia="宋体"/>
+                <w:color w:val="000000"/>
                 <w:sz w:val="21"/>
               </w:rPr>
               <w:t xml:space="preserve">CNN-LSTM-AM</w:t>
@@ -2418,6 +2575,7 @@
             <w:r>
               <w:rPr>
                 <w:rFonts w:ascii="宋体" w:hAnsi="宋体" w:eastAsia="宋体"/>
+                <w:color w:val="000000"/>
                 <w:sz w:val="21"/>
               </w:rPr>
               <w:t xml:space="preserve">406.302</w:t>
@@ -2434,6 +2592,7 @@
             <w:r>
               <w:rPr>
                 <w:rFonts w:ascii="宋体" w:hAnsi="宋体" w:eastAsia="宋体"/>
+                <w:color w:val="000000"/>
                 <w:sz w:val="21"/>
               </w:rPr>
               <w:t xml:space="preserve">0.615609</w:t>
@@ -2450,6 +2609,7 @@
             <w:r>
               <w:rPr>
                 <w:rFonts w:ascii="宋体" w:hAnsi="宋体" w:eastAsia="宋体"/>
+                <w:color w:val="000000"/>
                 <w:sz w:val="21"/>
               </w:rPr>
               <w:t xml:space="preserve">29.001612</w:t>
@@ -2468,6 +2628,7 @@
             <w:r>
               <w:rPr>
                 <w:rFonts w:ascii="宋体" w:hAnsi="宋体" w:eastAsia="宋体"/>
+                <w:color w:val="000000"/>
                 <w:sz w:val="21"/>
               </w:rPr>
               <w:t xml:space="preserve">XJTU-SY Bearing1_5</w:t>
@@ -2484,6 +2645,7 @@
             <w:r>
               <w:rPr>
                 <w:rFonts w:ascii="宋体" w:hAnsi="宋体" w:eastAsia="宋体"/>
+                <w:color w:val="000000"/>
                 <w:sz w:val="21"/>
               </w:rPr>
               <w:t xml:space="preserve">CNN-LSTM</w:t>
@@ -2500,6 +2662,7 @@
             <w:r>
               <w:rPr>
                 <w:rFonts w:ascii="宋体" w:hAnsi="宋体" w:eastAsia="宋体"/>
+                <w:color w:val="000000"/>
                 <w:sz w:val="21"/>
               </w:rPr>
               <w:t xml:space="preserve">406.503</w:t>
@@ -2516,6 +2679,7 @@
             <w:r>
               <w:rPr>
                 <w:rFonts w:ascii="宋体" w:hAnsi="宋体" w:eastAsia="宋体"/>
+                <w:color w:val="000000"/>
                 <w:sz w:val="21"/>
               </w:rPr>
               <w:t xml:space="preserve">0.615913</w:t>
@@ -2532,6 +2696,7 @@
             <w:r>
               <w:rPr>
                 <w:rFonts w:ascii="宋体" w:hAnsi="宋体" w:eastAsia="宋体"/>
+                <w:color w:val="000000"/>
                 <w:sz w:val="21"/>
               </w:rPr>
               <w:t xml:space="preserve">29.127879</w:t>
@@ -2550,6 +2715,7 @@
             <w:r>
               <w:rPr>
                 <w:rFonts w:ascii="宋体" w:hAnsi="宋体" w:eastAsia="宋体"/>
+                <w:color w:val="000000"/>
                 <w:sz w:val="21"/>
               </w:rPr>
               <w:t xml:space="preserve">PHM2012 Bearing3_1</w:t>
@@ -2566,6 +2732,7 @@
             <w:r>
               <w:rPr>
                 <w:rFonts w:ascii="宋体" w:hAnsi="宋体" w:eastAsia="宋体"/>
+                <w:color w:val="000000"/>
                 <w:sz w:val="21"/>
               </w:rPr>
               <w:t xml:space="preserve">CNN-LSTM-AM</w:t>
@@ -2582,6 +2749,7 @@
             <w:r>
               <w:rPr>
                 <w:rFonts w:ascii="宋体" w:hAnsi="宋体" w:eastAsia="宋体"/>
+                <w:color w:val="000000"/>
                 <w:sz w:val="21"/>
               </w:rPr>
               <w:t xml:space="preserve">651.036</w:t>
@@ -2598,6 +2766,7 @@
             <w:r>
               <w:rPr>
                 <w:rFonts w:ascii="宋体" w:hAnsi="宋体" w:eastAsia="宋体"/>
+                <w:color w:val="000000"/>
                 <w:sz w:val="21"/>
               </w:rPr>
               <w:t xml:space="preserve">0.591850</w:t>
@@ -2614,6 +2783,7 @@
             <w:r>
               <w:rPr>
                 <w:rFonts w:ascii="宋体" w:hAnsi="宋体" w:eastAsia="宋体"/>
+                <w:color w:val="000000"/>
                 <w:sz w:val="21"/>
               </w:rPr>
               <w:t xml:space="preserve">29.447255</w:t>
@@ -2632,6 +2802,7 @@
             <w:r>
               <w:rPr>
                 <w:rFonts w:ascii="宋体" w:hAnsi="宋体" w:eastAsia="宋体"/>
+                <w:color w:val="000000"/>
                 <w:sz w:val="21"/>
               </w:rPr>
               <w:t xml:space="preserve">PHM2012 Bearing3_1</w:t>
@@ -2648,6 +2819,7 @@
             <w:r>
               <w:rPr>
                 <w:rFonts w:ascii="宋体" w:hAnsi="宋体" w:eastAsia="宋体"/>
+                <w:color w:val="000000"/>
                 <w:sz w:val="21"/>
               </w:rPr>
               <w:t xml:space="preserve">CNN-LSTM</w:t>
@@ -2664,6 +2836,7 @@
             <w:r>
               <w:rPr>
                 <w:rFonts w:ascii="宋体" w:hAnsi="宋体" w:eastAsia="宋体"/>
+                <w:color w:val="000000"/>
                 <w:sz w:val="21"/>
               </w:rPr>
               <w:t xml:space="preserve">650.700</w:t>
@@ -2680,6 +2853,7 @@
             <w:r>
               <w:rPr>
                 <w:rFonts w:ascii="宋体" w:hAnsi="宋体" w:eastAsia="宋体"/>
+                <w:color w:val="000000"/>
                 <w:sz w:val="21"/>
               </w:rPr>
               <w:t xml:space="preserve">0.591545</w:t>
@@ -2696,6 +2870,7 @@
             <w:r>
               <w:rPr>
                 <w:rFonts w:ascii="宋体" w:hAnsi="宋体" w:eastAsia="宋体"/>
+                <w:color w:val="000000"/>
                 <w:sz w:val="21"/>
               </w:rPr>
               <w:t xml:space="preserve">29.098391</w:t>
@@ -2713,6 +2888,7 @@
       <w:r>
         <w:rPr>
           <w:rFonts w:ascii="宋体" w:hAnsi="宋体" w:eastAsia="宋体"/>
+          <w:color w:val="000000"/>
         </w:rPr>
         <w:t xml:space="preserve">3.2 xLSTM-Transformer 复现</w:t>
       </w:r>
@@ -2726,12 +2902,14 @@
       <w:r>
         <w:rPr>
           <w:rFonts w:ascii="宋体" w:hAnsi="宋体" w:eastAsia="宋体"/>
+          <w:color w:val="000000"/>
         </w:rPr>
         <w:t xml:space="preserve">项目复现 Jiang 等 2026 年 xLSTM-Transformer 论文的核心结构：特征序列输入、xLSTM-inspired memory、Transformer encoder 和 RUL 回归 head。复现 notebook 为</w:t>
       </w:r>
       <w:r>
         <w:rPr>
           <w:rFonts w:ascii="宋体" w:hAnsi="宋体" w:eastAsia="宋体"/>
+          <w:color w:val="000000"/>
         </w:rPr>
         <w:t xml:space="preserve"> </w:t>
       </w:r>
@@ -2739,12 +2917,14 @@
         <w:rPr>
           <w:rStyle w:val="VerbatimChar"/>
           <w:rFonts w:ascii="宋体" w:hAnsi="宋体" w:eastAsia="宋体"/>
+          <w:color w:val="000000"/>
         </w:rPr>
         <w:t xml:space="preserve">examples/07_paper_xlstm_transformer_rul.ipynb</w:t>
       </w:r>
       <w:r>
         <w:rPr>
           <w:rFonts w:ascii="宋体" w:hAnsi="宋体" w:eastAsia="宋体"/>
+          <w:color w:val="000000"/>
         </w:rPr>
         <w:t xml:space="preserve">。</w:t>
       </w:r>
@@ -2758,12 +2938,14 @@
       <w:r>
         <w:rPr>
           <w:rFonts w:ascii="宋体" w:hAnsi="宋体" w:eastAsia="宋体"/>
+          <w:color w:val="000000"/>
         </w:rPr>
         <w:t xml:space="preserve">该复现按照论文的 XJTU-SY 三工况和 PHM2012 三工况划分组织训练/测试，训练</w:t>
       </w:r>
       <w:r>
         <w:rPr>
           <w:rFonts w:ascii="宋体" w:hAnsi="宋体" w:eastAsia="宋体"/>
+          <w:color w:val="000000"/>
         </w:rPr>
         <w:t xml:space="preserve"> </w:t>
       </w:r>
@@ -2771,12 +2953,14 @@
         <w:rPr>
           <w:rStyle w:val="VerbatimChar"/>
           <w:rFonts w:ascii="宋体" w:hAnsi="宋体" w:eastAsia="宋体"/>
+          <w:color w:val="000000"/>
         </w:rPr>
         <w:t xml:space="preserve">XLSTM-Transformer</w:t>
       </w:r>
       <w:r>
         <w:rPr>
           <w:rFonts w:ascii="宋体" w:hAnsi="宋体" w:eastAsia="宋体"/>
+          <w:color w:val="000000"/>
         </w:rPr>
         <w:t xml:space="preserve">、</w:t>
       </w:r>
@@ -2784,24 +2968,28 @@
         <w:rPr>
           <w:rStyle w:val="VerbatimChar"/>
           <w:rFonts w:ascii="宋体" w:hAnsi="宋体" w:eastAsia="宋体"/>
+          <w:color w:val="000000"/>
         </w:rPr>
         <w:t xml:space="preserve">Feature-Transformer</w:t>
       </w:r>
       <w:r>
         <w:rPr>
           <w:rFonts w:ascii="宋体" w:hAnsi="宋体" w:eastAsia="宋体"/>
+          <w:color w:val="000000"/>
         </w:rPr>
         <w:t xml:space="preserve"> </w:t>
       </w:r>
       <w:r>
         <w:rPr>
           <w:rFonts w:ascii="宋体" w:hAnsi="宋体" w:eastAsia="宋体"/>
+          <w:color w:val="000000"/>
         </w:rPr>
         <w:t xml:space="preserve">和</w:t>
       </w:r>
       <w:r>
         <w:rPr>
           <w:rFonts w:ascii="宋体" w:hAnsi="宋体" w:eastAsia="宋体"/>
+          <w:color w:val="000000"/>
         </w:rPr>
         <w:t xml:space="preserve"> </w:t>
       </w:r>
@@ -2809,18 +2997,21 @@
         <w:rPr>
           <w:rStyle w:val="VerbatimChar"/>
           <w:rFonts w:ascii="宋体" w:hAnsi="宋体" w:eastAsia="宋体"/>
+          <w:color w:val="000000"/>
         </w:rPr>
         <w:t xml:space="preserve">LSTM-Transformer</w:t>
       </w:r>
       <w:r>
         <w:rPr>
           <w:rFonts w:ascii="宋体" w:hAnsi="宋体" w:eastAsia="宋体"/>
+          <w:color w:val="000000"/>
         </w:rPr>
         <w:t xml:space="preserve"> </w:t>
       </w:r>
       <w:r>
         <w:rPr>
           <w:rFonts w:ascii="宋体" w:hAnsi="宋体" w:eastAsia="宋体"/>
+          <w:color w:val="000000"/>
         </w:rPr>
         <w:t xml:space="preserve">三类模型，并输出 RMSE、NormalizedRMSE、R2、PHM2012 Score、Huang RUL Score 和相对 baseline 变化列。</w:t>
       </w:r>
@@ -2855,6 +3046,7 @@
               <w:rPr>
                 <w:rFonts w:ascii="宋体" w:hAnsi="宋体" w:eastAsia="宋体"/>
                 <w:b/>
+                <w:color w:val="000000"/>
                 <w:sz w:val="21"/>
               </w:rPr>
               <w:t xml:space="preserve">数据集/工况</w:t>
@@ -2875,6 +3067,7 @@
               <w:rPr>
                 <w:rFonts w:ascii="宋体" w:hAnsi="宋体" w:eastAsia="宋体"/>
                 <w:b/>
+                <w:color w:val="000000"/>
                 <w:sz w:val="21"/>
               </w:rPr>
               <w:t xml:space="preserve">XLSTM-Transformer RMSE</w:t>
@@ -2895,6 +3088,7 @@
               <w:rPr>
                 <w:rFonts w:ascii="宋体" w:hAnsi="宋体" w:eastAsia="宋体"/>
                 <w:b/>
+                <w:color w:val="000000"/>
                 <w:sz w:val="21"/>
               </w:rPr>
               <w:t xml:space="preserve">NormalizedRMSE</w:t>
@@ -2915,6 +3109,7 @@
               <w:rPr>
                 <w:rFonts w:ascii="宋体" w:hAnsi="宋体" w:eastAsia="宋体"/>
                 <w:b/>
+                <w:color w:val="000000"/>
                 <w:sz w:val="21"/>
               </w:rPr>
               <w:t xml:space="preserve">R2</w:t>
@@ -2935,6 +3130,7 @@
               <w:rPr>
                 <w:rFonts w:ascii="宋体" w:hAnsi="宋体" w:eastAsia="宋体"/>
                 <w:b/>
+                <w:color w:val="000000"/>
                 <w:sz w:val="21"/>
               </w:rPr>
               <w:t xml:space="preserve">Huang RUL Score</w:t>
@@ -2953,6 +3149,7 @@
             <w:r>
               <w:rPr>
                 <w:rFonts w:ascii="宋体" w:hAnsi="宋体" w:eastAsia="宋体"/>
+                <w:color w:val="000000"/>
                 <w:sz w:val="21"/>
               </w:rPr>
               <w:t xml:space="preserve">XJTU-SY Condition 1</w:t>
@@ -2969,6 +3166,7 @@
             <w:r>
               <w:rPr>
                 <w:rFonts w:ascii="宋体" w:hAnsi="宋体" w:eastAsia="宋体"/>
+                <w:color w:val="000000"/>
                 <w:sz w:val="21"/>
               </w:rPr>
               <w:t xml:space="preserve">2280.512</w:t>
@@ -2985,6 +3183,7 @@
             <w:r>
               <w:rPr>
                 <w:rFonts w:ascii="宋体" w:hAnsi="宋体" w:eastAsia="宋体"/>
+                <w:color w:val="000000"/>
                 <w:sz w:val="21"/>
               </w:rPr>
               <w:t xml:space="preserve">0.603310</w:t>
@@ -3001,6 +3200,7 @@
             <w:r>
               <w:rPr>
                 <w:rFonts w:ascii="宋体" w:hAnsi="宋体" w:eastAsia="宋体"/>
+                <w:color w:val="000000"/>
                 <w:sz w:val="21"/>
               </w:rPr>
               <w:t xml:space="preserve">-2.275391</w:t>
@@ -3017,6 +3217,7 @@
             <w:r>
               <w:rPr>
                 <w:rFonts w:ascii="宋体" w:hAnsi="宋体" w:eastAsia="宋体"/>
+                <w:color w:val="000000"/>
                 <w:sz w:val="21"/>
               </w:rPr>
               <w:t xml:space="preserve">27.303331</w:t>
@@ -3035,6 +3236,7 @@
             <w:r>
               <w:rPr>
                 <w:rFonts w:ascii="宋体" w:hAnsi="宋体" w:eastAsia="宋体"/>
+                <w:color w:val="000000"/>
                 <w:sz w:val="21"/>
               </w:rPr>
               <w:t xml:space="preserve">XJTU-SY Condition 2</w:t>
@@ -3051,6 +3253,7 @@
             <w:r>
               <w:rPr>
                 <w:rFonts w:ascii="宋体" w:hAnsi="宋体" w:eastAsia="宋体"/>
+                <w:color w:val="000000"/>
                 <w:sz w:val="21"/>
               </w:rPr>
               <w:t xml:space="preserve">7688.563</w:t>
@@ -3067,6 +3270,7 @@
             <w:r>
               <w:rPr>
                 <w:rFonts w:ascii="宋体" w:hAnsi="宋体" w:eastAsia="宋体"/>
+                <w:color w:val="000000"/>
                 <w:sz w:val="21"/>
               </w:rPr>
               <w:t xml:space="preserve">0.601609</w:t>
@@ -3083,6 +3287,7 @@
             <w:r>
               <w:rPr>
                 <w:rFonts w:ascii="宋体" w:hAnsi="宋体" w:eastAsia="宋体"/>
+                <w:color w:val="000000"/>
                 <w:sz w:val="21"/>
               </w:rPr>
               <w:t xml:space="preserve">-2.257361</w:t>
@@ -3099,6 +3304,7 @@
             <w:r>
               <w:rPr>
                 <w:rFonts w:ascii="宋体" w:hAnsi="宋体" w:eastAsia="宋体"/>
+                <w:color w:val="000000"/>
                 <w:sz w:val="21"/>
               </w:rPr>
               <w:t xml:space="preserve">27.385834</w:t>
@@ -3117,6 +3323,7 @@
             <w:r>
               <w:rPr>
                 <w:rFonts w:ascii="宋体" w:hAnsi="宋体" w:eastAsia="宋体"/>
+                <w:color w:val="000000"/>
                 <w:sz w:val="21"/>
               </w:rPr>
               <w:t xml:space="preserve">XJTU-SY Condition 3</w:t>
@@ -3133,6 +3340,7 @@
             <w:r>
               <w:rPr>
                 <w:rFonts w:ascii="宋体" w:hAnsi="宋体" w:eastAsia="宋体"/>
+                <w:color w:val="000000"/>
                 <w:sz w:val="21"/>
               </w:rPr>
               <w:t xml:space="preserve">5348.922</w:t>
@@ -3149,6 +3357,7 @@
             <w:r>
               <w:rPr>
                 <w:rFonts w:ascii="宋体" w:hAnsi="宋体" w:eastAsia="宋体"/>
+                <w:color w:val="000000"/>
                 <w:sz w:val="21"/>
               </w:rPr>
               <w:t xml:space="preserve">0.602356</w:t>
@@ -3165,6 +3374,7 @@
             <w:r>
               <w:rPr>
                 <w:rFonts w:ascii="宋体" w:hAnsi="宋体" w:eastAsia="宋体"/>
+                <w:color w:val="000000"/>
                 <w:sz w:val="21"/>
               </w:rPr>
               <w:t xml:space="preserve">-2.262244</w:t>
@@ -3181,6 +3391,7 @@
             <w:r>
               <w:rPr>
                 <w:rFonts w:ascii="宋体" w:hAnsi="宋体" w:eastAsia="宋体"/>
+                <w:color w:val="000000"/>
                 <w:sz w:val="21"/>
               </w:rPr>
               <w:t xml:space="preserve">27.354392</w:t>
@@ -3199,6 +3410,7 @@
             <w:r>
               <w:rPr>
                 <w:rFonts w:ascii="宋体" w:hAnsi="宋体" w:eastAsia="宋体"/>
+                <w:color w:val="000000"/>
                 <w:sz w:val="21"/>
               </w:rPr>
               <w:t xml:space="preserve">PHM2012 Condition 1</w:t>
@@ -3215,6 +3427,7 @@
             <w:r>
               <w:rPr>
                 <w:rFonts w:ascii="宋体" w:hAnsi="宋体" w:eastAsia="宋体"/>
+                <w:color w:val="000000"/>
                 <w:sz w:val="21"/>
               </w:rPr>
               <w:t xml:space="preserve">9641.803</w:t>
@@ -3231,6 +3444,7 @@
             <w:r>
               <w:rPr>
                 <w:rFonts w:ascii="宋体" w:hAnsi="宋体" w:eastAsia="宋体"/>
+                <w:color w:val="000000"/>
                 <w:sz w:val="21"/>
               </w:rPr>
               <w:t xml:space="preserve">1.337282</w:t>
@@ -3247,6 +3461,7 @@
             <w:r>
               <w:rPr>
                 <w:rFonts w:ascii="宋体" w:hAnsi="宋体" w:eastAsia="宋体"/>
+                <w:color w:val="000000"/>
                 <w:sz w:val="21"/>
               </w:rPr>
               <w:t xml:space="preserve">-15.110842</w:t>
@@ -3263,6 +3478,7 @@
             <w:r>
               <w:rPr>
                 <w:rFonts w:ascii="宋体" w:hAnsi="宋体" w:eastAsia="宋体"/>
+                <w:color w:val="000000"/>
                 <w:sz w:val="21"/>
               </w:rPr>
               <w:t xml:space="preserve">31.989850</w:t>
@@ -3281,6 +3497,7 @@
             <w:r>
               <w:rPr>
                 <w:rFonts w:ascii="宋体" w:hAnsi="宋体" w:eastAsia="宋体"/>
+                <w:color w:val="000000"/>
                 <w:sz w:val="21"/>
               </w:rPr>
               <w:t xml:space="preserve">PHM2012 Condition 2</w:t>
@@ -3297,6 +3514,7 @@
             <w:r>
               <w:rPr>
                 <w:rFonts w:ascii="宋体" w:hAnsi="宋体" w:eastAsia="宋体"/>
+                <w:color w:val="000000"/>
                 <w:sz w:val="21"/>
               </w:rPr>
               <w:t xml:space="preserve">10065.537</w:t>
@@ -3313,6 +3531,7 @@
             <w:r>
               <w:rPr>
                 <w:rFonts w:ascii="宋体" w:hAnsi="宋体" w:eastAsia="宋体"/>
+                <w:color w:val="000000"/>
                 <w:sz w:val="21"/>
               </w:rPr>
               <w:t xml:space="preserve">2.092627</w:t>
@@ -3329,6 +3548,7 @@
             <w:r>
               <w:rPr>
                 <w:rFonts w:ascii="宋体" w:hAnsi="宋体" w:eastAsia="宋体"/>
+                <w:color w:val="000000"/>
                 <w:sz w:val="21"/>
               </w:rPr>
               <w:t xml:space="preserve">-38.470269</w:t>
@@ -3345,6 +3565,7 @@
             <w:r>
               <w:rPr>
                 <w:rFonts w:ascii="宋体" w:hAnsi="宋体" w:eastAsia="宋体"/>
+                <w:color w:val="000000"/>
                 <w:sz w:val="21"/>
               </w:rPr>
               <w:t xml:space="preserve">31.984371</w:t>
@@ -3363,6 +3584,7 @@
             <w:r>
               <w:rPr>
                 <w:rFonts w:ascii="宋体" w:hAnsi="宋体" w:eastAsia="宋体"/>
+                <w:color w:val="000000"/>
                 <w:sz w:val="21"/>
               </w:rPr>
               <w:t xml:space="preserve">PHM2012 Condition 3</w:t>
@@ -3379,6 +3601,7 @@
             <w:r>
               <w:rPr>
                 <w:rFonts w:ascii="宋体" w:hAnsi="宋体" w:eastAsia="宋体"/>
+                <w:color w:val="000000"/>
                 <w:sz w:val="21"/>
               </w:rPr>
               <w:t xml:space="preserve">1594.675</w:t>
@@ -3395,6 +3618,7 @@
             <w:r>
               <w:rPr>
                 <w:rFonts w:ascii="宋体" w:hAnsi="宋体" w:eastAsia="宋体"/>
+                <w:color w:val="000000"/>
                 <w:sz w:val="21"/>
               </w:rPr>
               <w:t xml:space="preserve">1.130975</w:t>
@@ -3411,6 +3635,7 @@
             <w:r>
               <w:rPr>
                 <w:rFonts w:ascii="宋体" w:hAnsi="宋体" w:eastAsia="宋体"/>
+                <w:color w:val="000000"/>
                 <w:sz w:val="21"/>
               </w:rPr>
               <w:t xml:space="preserve">-10.581817</w:t>
@@ -3427,6 +3652,7 @@
             <w:r>
               <w:rPr>
                 <w:rFonts w:ascii="宋体" w:hAnsi="宋体" w:eastAsia="宋体"/>
+                <w:color w:val="000000"/>
                 <w:sz w:val="21"/>
               </w:rPr>
               <w:t xml:space="preserve">31.883923</w:t>
@@ -3444,6 +3670,7 @@
       <w:r>
         <w:rPr>
           <w:rFonts w:ascii="宋体" w:hAnsi="宋体" w:eastAsia="宋体"/>
+          <w:color w:val="000000"/>
         </w:rPr>
         <w:t xml:space="preserve">上述结果用于证明复现 workflow 真实运行并输出论文指标。由于本地训练采用小样本和 8 epoch，PHM2012 上 R2 为负，说明当前设置下模型拟合不足，这一点在复现文档中作为限制保留。</w:t>
       </w:r>
@@ -3458,6 +3685,7 @@
       <w:r>
         <w:rPr>
           <w:rFonts w:ascii="宋体" w:hAnsi="宋体" w:eastAsia="宋体"/>
+          <w:color w:val="000000"/>
         </w:rPr>
         <w:t xml:space="preserve">4. 测试与质量保证</w:t>
       </w:r>
@@ -3471,6 +3699,7 @@
       <w:r>
         <w:rPr>
           <w:rFonts w:ascii="宋体" w:hAnsi="宋体" w:eastAsia="宋体"/>
+          <w:color w:val="000000"/>
         </w:rPr>
         <w:t xml:space="preserve">项目采用自动化测试和真实训练验收结合的质量保障方式：</w:t>
       </w:r>
@@ -3488,6 +3717,7 @@
       <w:r>
         <w:rPr>
           <w:rFonts w:ascii="宋体" w:hAnsi="宋体" w:eastAsia="宋体"/>
+          <w:color w:val="000000"/>
         </w:rPr>
         <w:t xml:space="preserve">单元测试覆盖数据加载、特征构造、指标计算、预测模式和模型 forward。</w:t>
       </w:r>
@@ -3505,6 +3735,7 @@
       <w:r>
         <w:rPr>
           <w:rFonts w:ascii="宋体" w:hAnsi="宋体" w:eastAsia="宋体"/>
+          <w:color w:val="000000"/>
         </w:rPr>
         <w:t xml:space="preserve">集成测试覆盖 loader、labeler、trainer、tester、evaluator 和 experiment tracker 的组合链路。</w:t>
       </w:r>
@@ -3522,12 +3753,14 @@
       <w:r>
         <w:rPr>
           <w:rFonts w:ascii="宋体" w:hAnsi="宋体" w:eastAsia="宋体"/>
+          <w:color w:val="000000"/>
         </w:rPr>
         <w:t xml:space="preserve">notebook 测试直接执行</w:t>
       </w:r>
       <w:r>
         <w:rPr>
           <w:rFonts w:ascii="宋体" w:hAnsi="宋体" w:eastAsia="宋体"/>
+          <w:color w:val="000000"/>
         </w:rPr>
         <w:t xml:space="preserve"> </w:t>
       </w:r>
@@ -3535,18 +3768,21 @@
         <w:rPr>
           <w:rStyle w:val="VerbatimChar"/>
           <w:rFonts w:ascii="宋体" w:hAnsi="宋体" w:eastAsia="宋体"/>
+          <w:color w:val="000000"/>
         </w:rPr>
         <w:t xml:space="preserve">examples/*.ipynb</w:t>
       </w:r>
       <w:r>
         <w:rPr>
           <w:rFonts w:ascii="宋体" w:hAnsi="宋体" w:eastAsia="宋体"/>
+          <w:color w:val="000000"/>
         </w:rPr>
         <w:t xml:space="preserve"> </w:t>
       </w:r>
       <w:r>
         <w:rPr>
           <w:rFonts w:ascii="宋体" w:hAnsi="宋体" w:eastAsia="宋体"/>
+          <w:color w:val="000000"/>
         </w:rPr>
         <w:t xml:space="preserve">的代码单元，确认示例不是静态展示。</w:t>
       </w:r>
@@ -3564,12 +3800,14 @@
       <w:r>
         <w:rPr>
           <w:rFonts w:ascii="宋体" w:hAnsi="宋体" w:eastAsia="宋体"/>
+          <w:color w:val="000000"/>
         </w:rPr>
         <w:t xml:space="preserve">真实训练验收在</w:t>
       </w:r>
       <w:r>
         <w:rPr>
           <w:rFonts w:ascii="宋体" w:hAnsi="宋体" w:eastAsia="宋体"/>
+          <w:color w:val="000000"/>
         </w:rPr>
         <w:t xml:space="preserve"> </w:t>
       </w:r>
@@ -3577,18 +3815,21 @@
         <w:rPr>
           <w:rStyle w:val="VerbatimChar"/>
           <w:rFonts w:ascii="宋体" w:hAnsi="宋体" w:eastAsia="宋体"/>
+          <w:color w:val="000000"/>
         </w:rPr>
         <w:t xml:space="preserve">tmp/</w:t>
       </w:r>
       <w:r>
         <w:rPr>
           <w:rFonts w:ascii="宋体" w:hAnsi="宋体" w:eastAsia="宋体"/>
+          <w:color w:val="000000"/>
         </w:rPr>
         <w:t xml:space="preserve"> </w:t>
       </w:r>
       <w:r>
         <w:rPr>
           <w:rFonts w:ascii="宋体" w:hAnsi="宋体" w:eastAsia="宋体"/>
+          <w:color w:val="000000"/>
         </w:rPr>
         <w:t xml:space="preserve">下运行，不提交训练输出，但将命令和指标摘要写入复现文档。</w:t>
       </w:r>
@@ -3606,6 +3847,7 @@
       <w:r>
         <w:rPr>
           <w:rFonts w:ascii="宋体" w:hAnsi="宋体" w:eastAsia="宋体"/>
+          <w:color w:val="000000"/>
         </w:rPr>
         <w:t xml:space="preserve">通过多次 commit 保存关键阶段，便于回溯和问题定位。</w:t>
       </w:r>
@@ -3619,6 +3861,7 @@
       <w:r>
         <w:rPr>
           <w:rFonts w:ascii="宋体" w:hAnsi="宋体" w:eastAsia="宋体"/>
+          <w:color w:val="000000"/>
         </w:rPr>
         <w:t xml:space="preserve">截至结题阶段，重点测试命令包括：</w:t>
       </w:r>
@@ -3631,6 +3874,7 @@
         <w:rPr>
           <w:rStyle w:val="ExtensionTok"/>
           <w:rFonts w:ascii="宋体" w:hAnsi="宋体" w:eastAsia="宋体"/>
+          <w:color w:val="000000"/>
         </w:rPr>
         <w:t xml:space="preserve">uv</w:t>
       </w:r>
@@ -3638,6 +3882,7 @@
         <w:rPr>
           <w:rStyle w:val="NormalTok"/>
           <w:rFonts w:ascii="宋体" w:hAnsi="宋体" w:eastAsia="宋体"/>
+          <w:color w:val="000000"/>
         </w:rPr>
         <w:t xml:space="preserve"> run </w:t>
       </w:r>
@@ -3645,6 +3890,7 @@
         <w:rPr>
           <w:rStyle w:val="AttributeTok"/>
           <w:rFonts w:ascii="宋体" w:hAnsi="宋体" w:eastAsia="宋体"/>
+          <w:color w:val="000000"/>
         </w:rPr>
         <w:t xml:space="preserve">--extra</w:t>
       </w:r>
@@ -3652,6 +3898,7 @@
         <w:rPr>
           <w:rStyle w:val="NormalTok"/>
           <w:rFonts w:ascii="宋体" w:hAnsi="宋体" w:eastAsia="宋体"/>
+          <w:color w:val="000000"/>
         </w:rPr>
         <w:t xml:space="preserve"> dev pytest tests/test_rul_metrics.py tests/test_paper_cnn_lstm_attention.py tests/test_paper_xlstm_transformer.py tests/test_examples_notebooks.py </w:t>
       </w:r>
@@ -3659,12 +3906,14 @@
         <w:rPr>
           <w:rStyle w:val="AttributeTok"/>
           <w:rFonts w:ascii="宋体" w:hAnsi="宋体" w:eastAsia="宋体"/>
+          <w:color w:val="000000"/>
         </w:rPr>
         <w:t xml:space="preserve">-q</w:t>
       </w:r>
       <w:r>
         <w:rPr>
           <w:rFonts w:ascii="宋体" w:hAnsi="宋体" w:eastAsia="宋体"/>
+          <w:color w:val="000000"/>
         </w:rPr>
         <w:br/>
       </w:r>
@@ -3672,6 +3921,7 @@
         <w:rPr>
           <w:rStyle w:val="ExtensionTok"/>
           <w:rFonts w:ascii="宋体" w:hAnsi="宋体" w:eastAsia="宋体"/>
+          <w:color w:val="000000"/>
         </w:rPr>
         <w:t xml:space="preserve">uv</w:t>
       </w:r>
@@ -3679,6 +3929,7 @@
         <w:rPr>
           <w:rStyle w:val="NormalTok"/>
           <w:rFonts w:ascii="宋体" w:hAnsi="宋体" w:eastAsia="宋体"/>
+          <w:color w:val="000000"/>
         </w:rPr>
         <w:t xml:space="preserve"> run </w:t>
       </w:r>
@@ -3686,6 +3937,7 @@
         <w:rPr>
           <w:rStyle w:val="AttributeTok"/>
           <w:rFonts w:ascii="宋体" w:hAnsi="宋体" w:eastAsia="宋体"/>
+          <w:color w:val="000000"/>
         </w:rPr>
         <w:t xml:space="preserve">--extra</w:t>
       </w:r>
@@ -3693,6 +3945,7 @@
         <w:rPr>
           <w:rStyle w:val="NormalTok"/>
           <w:rFonts w:ascii="宋体" w:hAnsi="宋体" w:eastAsia="宋体"/>
+          <w:color w:val="000000"/>
         </w:rPr>
         <w:t xml:space="preserve"> dev pytest </w:t>
       </w:r>
@@ -3700,6 +3953,7 @@
         <w:rPr>
           <w:rStyle w:val="AttributeTok"/>
           <w:rFonts w:ascii="宋体" w:hAnsi="宋体" w:eastAsia="宋体"/>
+          <w:color w:val="000000"/>
         </w:rPr>
         <w:t xml:space="preserve">-q</w:t>
       </w:r>
@@ -3713,6 +3967,7 @@
       <w:r>
         <w:rPr>
           <w:rFonts w:ascii="宋体" w:hAnsi="宋体" w:eastAsia="宋体"/>
+          <w:color w:val="000000"/>
         </w:rPr>
         <w:t xml:space="preserve">5. 项目成果</w:t>
       </w:r>
@@ -3726,6 +3981,7 @@
       <w:r>
         <w:rPr>
           <w:rFonts w:ascii="宋体" w:hAnsi="宋体" w:eastAsia="宋体"/>
+          <w:color w:val="000000"/>
         </w:rPr>
         <w:t xml:space="preserve">最终成果包括：</w:t>
       </w:r>
@@ -3743,6 +3999,7 @@
       <w:r>
         <w:rPr>
           <w:rFonts w:ascii="宋体" w:hAnsi="宋体" w:eastAsia="宋体"/>
+          <w:color w:val="000000"/>
         </w:rPr>
         <w:t xml:space="preserve">源代码：</w:t>
       </w:r>
@@ -3750,6 +4007,7 @@
         <w:rPr>
           <w:rStyle w:val="VerbatimChar"/>
           <w:rFonts w:ascii="宋体" w:hAnsi="宋体" w:eastAsia="宋体"/>
+          <w:color w:val="000000"/>
         </w:rPr>
         <w:t xml:space="preserve">src/USTC/SSE/BearingPrediction</w:t>
       </w:r>
@@ -3767,6 +4025,7 @@
       <w:r>
         <w:rPr>
           <w:rFonts w:ascii="宋体" w:hAnsi="宋体" w:eastAsia="宋体"/>
+          <w:color w:val="000000"/>
         </w:rPr>
         <w:t xml:space="preserve">notebook 示例：</w:t>
       </w:r>
@@ -3774,6 +4033,7 @@
         <w:rPr>
           <w:rStyle w:val="VerbatimChar"/>
           <w:rFonts w:ascii="宋体" w:hAnsi="宋体" w:eastAsia="宋体"/>
+          <w:color w:val="000000"/>
         </w:rPr>
         <w:t xml:space="preserve">examples</w:t>
       </w:r>
@@ -3791,6 +4051,7 @@
       <w:r>
         <w:rPr>
           <w:rFonts w:ascii="宋体" w:hAnsi="宋体" w:eastAsia="宋体"/>
+          <w:color w:val="000000"/>
         </w:rPr>
         <w:t xml:space="preserve">API 与用户文档：</w:t>
       </w:r>
@@ -3798,6 +4059,7 @@
         <w:rPr>
           <w:rStyle w:val="VerbatimChar"/>
           <w:rFonts w:ascii="宋体" w:hAnsi="宋体" w:eastAsia="宋体"/>
+          <w:color w:val="000000"/>
         </w:rPr>
         <w:t xml:space="preserve">docs</w:t>
       </w:r>
@@ -3815,6 +4077,7 @@
       <w:r>
         <w:rPr>
           <w:rFonts w:ascii="宋体" w:hAnsi="宋体" w:eastAsia="宋体"/>
+          <w:color w:val="000000"/>
         </w:rPr>
         <w:t xml:space="preserve">开题材料：</w:t>
       </w:r>
@@ -3822,6 +4085,7 @@
         <w:rPr>
           <w:rStyle w:val="VerbatimChar"/>
           <w:rFonts w:ascii="宋体" w:hAnsi="宋体" w:eastAsia="宋体"/>
+          <w:color w:val="000000"/>
         </w:rPr>
         <w:t xml:space="preserve">docx/proposal</w:t>
       </w:r>
@@ -3839,6 +4103,7 @@
       <w:r>
         <w:rPr>
           <w:rFonts w:ascii="宋体" w:hAnsi="宋体" w:eastAsia="宋体"/>
+          <w:color w:val="000000"/>
         </w:rPr>
         <w:t xml:space="preserve">中期材料：</w:t>
       </w:r>
@@ -3846,6 +4111,7 @@
         <w:rPr>
           <w:rStyle w:val="VerbatimChar"/>
           <w:rFonts w:ascii="宋体" w:hAnsi="宋体" w:eastAsia="宋体"/>
+          <w:color w:val="000000"/>
         </w:rPr>
         <w:t xml:space="preserve">docx/mid-term</w:t>
       </w:r>
@@ -3863,6 +4129,7 @@
       <w:r>
         <w:rPr>
           <w:rFonts w:ascii="宋体" w:hAnsi="宋体" w:eastAsia="宋体"/>
+          <w:color w:val="000000"/>
         </w:rPr>
         <w:t xml:space="preserve">结题材料：</w:t>
       </w:r>
@@ -3870,6 +4137,7 @@
         <w:rPr>
           <w:rStyle w:val="VerbatimChar"/>
           <w:rFonts w:ascii="宋体" w:hAnsi="宋体" w:eastAsia="宋体"/>
+          <w:color w:val="000000"/>
         </w:rPr>
         <w:t xml:space="preserve">docx/final</w:t>
       </w:r>
@@ -3887,6 +4155,7 @@
       <w:r>
         <w:rPr>
           <w:rFonts w:ascii="宋体" w:hAnsi="宋体" w:eastAsia="宋体"/>
+          <w:color w:val="000000"/>
         </w:rPr>
         <w:t xml:space="preserve">自动化测试：</w:t>
       </w:r>
@@ -3894,6 +4163,7 @@
         <w:rPr>
           <w:rStyle w:val="VerbatimChar"/>
           <w:rFonts w:ascii="宋体" w:hAnsi="宋体" w:eastAsia="宋体"/>
+          <w:color w:val="000000"/>
         </w:rPr>
         <w:t xml:space="preserve">tests</w:t>
       </w:r>
@@ -3911,6 +4181,7 @@
       <w:r>
         <w:rPr>
           <w:rFonts w:ascii="宋体" w:hAnsi="宋体" w:eastAsia="宋体"/>
+          <w:color w:val="000000"/>
         </w:rPr>
         <w:t xml:space="preserve">文档/PPT 导出脚本：</w:t>
       </w:r>
@@ -3918,6 +4189,7 @@
         <w:rPr>
           <w:rStyle w:val="VerbatimChar"/>
           <w:rFonts w:ascii="宋体" w:hAnsi="宋体" w:eastAsia="宋体"/>
+          <w:color w:val="000000"/>
         </w:rPr>
         <w:t xml:space="preserve">scripts</w:t>
       </w:r>
@@ -3931,6 +4203,7 @@
       <w:r>
         <w:rPr>
           <w:rFonts w:ascii="宋体" w:hAnsi="宋体" w:eastAsia="宋体"/>
+          <w:color w:val="000000"/>
         </w:rPr>
         <w:t xml:space="preserve">6. 不足与后续改进</w:t>
       </w:r>
@@ -3944,6 +4217,7 @@
       <w:r>
         <w:rPr>
           <w:rFonts w:ascii="宋体" w:hAnsi="宋体" w:eastAsia="宋体"/>
+          <w:color w:val="000000"/>
         </w:rPr>
         <w:t xml:space="preserve">当前系统已经完成课程项目要求的主要流程，但仍存在可继续改进的方向：</w:t>
       </w:r>
@@ -3961,6 +4235,7 @@
       <w:r>
         <w:rPr>
           <w:rFonts w:ascii="宋体" w:hAnsi="宋体" w:eastAsia="宋体"/>
+          <w:color w:val="000000"/>
         </w:rPr>
         <w:t xml:space="preserve">论文复现采用小样本真实训练，尚未进行论文级 50 epoch、多随机种子和全量统计对齐。</w:t>
       </w:r>
@@ -3978,6 +4253,7 @@
       <w:r>
         <w:rPr>
           <w:rFonts w:ascii="宋体" w:hAnsi="宋体" w:eastAsia="宋体"/>
+          <w:color w:val="000000"/>
         </w:rPr>
         <w:t xml:space="preserve">xLSTM-Transformer 复现为结构复现和项目特征管线适配，未获得作者源码，因此不能声明逐行复刻。</w:t>
       </w:r>
@@ -3995,6 +4271,7 @@
       <w:r>
         <w:rPr>
           <w:rFonts w:ascii="宋体" w:hAnsi="宋体" w:eastAsia="宋体"/>
+          <w:color w:val="000000"/>
         </w:rPr>
         <w:t xml:space="preserve">当前重点是 RUL 预测；失效概率/生存分析保留基础接口和文档说明，尚未作为结题主线进行充分实验验证。</w:t>
       </w:r>
@@ -4012,6 +4289,7 @@
       <w:r>
         <w:rPr>
           <w:rFonts w:ascii="宋体" w:hAnsi="宋体" w:eastAsia="宋体"/>
+          <w:color w:val="000000"/>
         </w:rPr>
         <w:t xml:space="preserve">可视化系统仍以静态 Matplotlib 图表为主，后续可扩展交互式实验看板。</w:t>
       </w:r>
@@ -4025,6 +4303,7 @@
       <w:r>
         <w:rPr>
           <w:rFonts w:ascii="宋体" w:hAnsi="宋体" w:eastAsia="宋体"/>
+          <w:color w:val="000000"/>
         </w:rPr>
         <w:t xml:space="preserve">7. 结论</w:t>
       </w:r>
@@ -4038,6 +4317,7 @@
       <w:r>
         <w:rPr>
           <w:rFonts w:ascii="宋体" w:hAnsi="宋体" w:eastAsia="宋体"/>
+          <w:color w:val="000000"/>
         </w:rPr>
         <w:t xml:space="preserve">本项目完成了工业轴承剩余寿命预测系统的主要设计、实现、测试和文档工作。系统能够导入真实轴承数据，完成特征提取、RUL 训练、指标评估、实验记录和论文复现，满足软件工程课程对可运行系统、工程过程、测试验证和文档交付的要求。</w:t>
       </w:r>
@@ -4405,6 +4685,7 @@
     <w:qFormat/>
     <w:rPr>
       <w:rFonts w:ascii="宋体" w:hAnsi="宋体" w:eastAsia="宋体"/>
+      <w:color w:val="000000"/>
       <w:sz w:val="21"/>
     </w:rPr>
   </w:style>
@@ -4418,6 +4699,7 @@
     <w:qFormat/>
     <w:rPr>
       <w:rFonts w:ascii="宋体" w:hAnsi="宋体" w:eastAsia="宋体"/>
+      <w:color w:val="000000"/>
       <w:sz w:val="21"/>
     </w:rPr>
   </w:style>
@@ -4428,6 +4710,7 @@
     <w:qFormat/>
     <w:rPr>
       <w:rFonts w:ascii="宋体" w:hAnsi="宋体" w:eastAsia="宋体"/>
+      <w:color w:val="000000"/>
       <w:sz w:val="21"/>
     </w:rPr>
   </w:style>
@@ -4440,6 +4723,7 @@
     </w:pPr>
     <w:rPr>
       <w:rFonts w:ascii="宋体" w:hAnsi="宋体" w:eastAsia="宋体"/>
+      <w:color w:val="000000"/>
       <w:sz w:val="21"/>
     </w:rPr>
   </w:style>
@@ -4458,7 +4742,7 @@
       <w:rFonts w:asciiTheme="majorHAnsi" w:cstheme="majorBidi" w:eastAsiaTheme="majorEastAsia" w:hAnsiTheme="majorHAnsi" w:ascii="黑体" w:hAnsi="黑体" w:eastAsia="黑体"/>
       <w:b/>
       <w:bCs/>
-      <w:color w:themeColor="accent1" w:themeShade="B5" w:val="345A8A"/>
+      <w:color w:val="000000"/>
       <w:sz w:val="36"/>
       <w:szCs w:val="36"/>
     </w:rPr>
@@ -4475,6 +4759,7 @@
       <w:jc w:val="center"/>
     </w:pPr>
     <w:rPr>
+      <w:color w:val="000000"/>
       <w:sz w:val="30"/>
       <w:szCs w:val="30"/>
     </w:rPr>
@@ -4538,7 +4823,7 @@
       <w:rFonts w:asciiTheme="majorHAnsi" w:cstheme="majorBidi" w:eastAsiaTheme="majorEastAsia" w:hAnsiTheme="majorHAnsi" w:ascii="宋体" w:hAnsi="宋体" w:eastAsia="宋体"/>
       <w:b/>
       <w:bCs/>
-      <w:color w:themeColor="accent1" w:val="4F81BD"/>
+      <w:color w:val="000000"/>
       <w:sz w:val="48"/>
       <w:szCs w:val="32"/>
     </w:rPr>
@@ -4560,7 +4845,7 @@
       <w:rFonts w:asciiTheme="majorHAnsi" w:cstheme="majorBidi" w:eastAsiaTheme="majorEastAsia" w:hAnsiTheme="majorHAnsi" w:ascii="宋体" w:hAnsi="宋体" w:eastAsia="宋体"/>
       <w:b/>
       <w:bCs/>
-      <w:color w:themeColor="accent1" w:val="4F81BD"/>
+      <w:color w:val="000000"/>
       <w:sz w:val="36"/>
       <w:szCs w:val="28"/>
     </w:rPr>
@@ -4582,7 +4867,7 @@
       <w:rFonts w:asciiTheme="majorHAnsi" w:cstheme="majorBidi" w:eastAsiaTheme="majorEastAsia" w:hAnsiTheme="majorHAnsi" w:ascii="宋体" w:hAnsi="宋体" w:eastAsia="宋体"/>
       <w:b/>
       <w:bCs/>
-      <w:color w:themeColor="accent1" w:val="4F81BD"/>
+      <w:color w:val="000000"/>
       <w:sz w:val="27"/>
       <w:szCs w:val="24"/>
     </w:rPr>
@@ -4605,7 +4890,7 @@
       <w:i/>
       <w:b/>
       <w:bCs/>
-      <w:color w:themeColor="accent1" w:val="4F81BD"/>
+      <w:color w:val="000000"/>
       <w:sz w:val="24"/>
       <w:szCs w:val="24"/>
     </w:rPr>
@@ -4624,10 +4909,11 @@
       <w:outlineLvl w:val="4"/>
     </w:pPr>
     <w:rPr>
-      <w:rFonts w:asciiTheme="majorHAnsi" w:cstheme="majorBidi" w:eastAsiaTheme="majorEastAsia" w:hAnsiTheme="majorHAnsi"/>
+      <w:rFonts w:asciiTheme="majorHAnsi" w:cstheme="majorBidi" w:eastAsiaTheme="majorEastAsia" w:hAnsiTheme="majorHAnsi" w:ascii="宋体" w:hAnsi="宋体" w:eastAsia="宋体"/>
+      <w:b/>
       <w:iCs/>
-      <w:color w:themeColor="accent1" w:val="4F81BD"/>
-      <w:sz w:val="24"/>
+      <w:color w:val="000000"/>
+      <w:sz w:val="21"/>
       <w:szCs w:val="24"/>
     </w:rPr>
   </w:style>
@@ -4645,9 +4931,10 @@
       <w:outlineLvl w:val="5"/>
     </w:pPr>
     <w:rPr>
-      <w:rFonts w:asciiTheme="majorHAnsi" w:cstheme="majorBidi" w:eastAsiaTheme="majorEastAsia" w:hAnsiTheme="majorHAnsi"/>
-      <w:color w:themeColor="accent1" w:val="4F81BD"/>
-      <w:sz w:val="24"/>
+      <w:rFonts w:asciiTheme="majorHAnsi" w:cstheme="majorBidi" w:eastAsiaTheme="majorEastAsia" w:hAnsiTheme="majorHAnsi" w:ascii="宋体" w:hAnsi="宋体" w:eastAsia="宋体"/>
+      <w:b/>
+      <w:color w:val="000000"/>
+      <w:sz w:val="21"/>
       <w:szCs w:val="24"/>
     </w:rPr>
   </w:style>
@@ -4665,9 +4952,10 @@
       <w:outlineLvl w:val="6"/>
     </w:pPr>
     <w:rPr>
-      <w:rFonts w:asciiTheme="majorHAnsi" w:cstheme="majorBidi" w:eastAsiaTheme="majorEastAsia" w:hAnsiTheme="majorHAnsi"/>
-      <w:color w:themeColor="accent1" w:val="4F81BD"/>
-      <w:sz w:val="24"/>
+      <w:rFonts w:asciiTheme="majorHAnsi" w:cstheme="majorBidi" w:eastAsiaTheme="majorEastAsia" w:hAnsiTheme="majorHAnsi" w:ascii="宋体" w:hAnsi="宋体" w:eastAsia="宋体"/>
+      <w:b/>
+      <w:color w:val="000000"/>
+      <w:sz w:val="21"/>
       <w:szCs w:val="24"/>
     </w:rPr>
   </w:style>
@@ -4685,9 +4973,10 @@
       <w:outlineLvl w:val="7"/>
     </w:pPr>
     <w:rPr>
-      <w:rFonts w:asciiTheme="majorHAnsi" w:cstheme="majorBidi" w:eastAsiaTheme="majorEastAsia" w:hAnsiTheme="majorHAnsi"/>
-      <w:color w:themeColor="accent1" w:val="4F81BD"/>
-      <w:sz w:val="24"/>
+      <w:rFonts w:asciiTheme="majorHAnsi" w:cstheme="majorBidi" w:eastAsiaTheme="majorEastAsia" w:hAnsiTheme="majorHAnsi" w:ascii="宋体" w:hAnsi="宋体" w:eastAsia="宋体"/>
+      <w:b/>
+      <w:color w:val="000000"/>
+      <w:sz w:val="21"/>
       <w:szCs w:val="24"/>
     </w:rPr>
   </w:style>
@@ -4705,9 +4994,10 @@
       <w:outlineLvl w:val="8"/>
     </w:pPr>
     <w:rPr>
-      <w:rFonts w:asciiTheme="majorHAnsi" w:cstheme="majorBidi" w:eastAsiaTheme="majorEastAsia" w:hAnsiTheme="majorHAnsi"/>
-      <w:color w:themeColor="accent1" w:val="4F81BD"/>
-      <w:sz w:val="24"/>
+      <w:rFonts w:asciiTheme="majorHAnsi" w:cstheme="majorBidi" w:eastAsiaTheme="majorEastAsia" w:hAnsiTheme="majorHAnsi" w:ascii="宋体" w:hAnsi="宋体" w:eastAsia="宋体"/>
+      <w:b/>
+      <w:color w:val="000000"/>
+      <w:sz w:val="21"/>
       <w:szCs w:val="24"/>
     </w:rPr>
   </w:style>
@@ -4845,7 +5135,7 @@
     <w:name w:val="Hyperlink"/>
     <w:basedOn w:val="BodyTextChar"/>
     <w:rPr>
-      <w:color w:themeColor="accent1" w:val="4F81BD"/>
+      <w:color w:val="000000"/>
     </w:rPr>
   </w:style>
   <w:style w:styleId="TOCHeading" w:type="paragraph">
@@ -4863,7 +5153,7 @@
       <w:rFonts w:asciiTheme="majorHAnsi" w:cstheme="majorBidi" w:eastAsiaTheme="majorEastAsia" w:hAnsiTheme="majorHAnsi"/>
       <w:b w:val="0"/>
       <w:bCs w:val="0"/>
-      <w:color w:themeColor="accent1" w:themeShade="BF" w:val="365F91"/>
+      <w:color w:val="000000"/>
     </w:rPr>
   </w:style>
   <w:style w:type="paragraph" w:customStyle="1" w:styleId="SourceCode">

</xml_diff>

<commit_message>
docs: address final rubric review
</commit_message>
<xml_diff>
--- a/docx/final/12_结题报告.docx
+++ b/docx/final/12_结题报告.docx
@@ -3169,7 +3169,7 @@
                 <w:color w:val="000000"/>
                 <w:sz w:val="21"/>
               </w:rPr>
-              <w:t xml:space="preserve">2280.512</w:t>
+              <w:t xml:space="preserve">2280.631</w:t>
             </w:r>
           </w:p>
         </w:tc>
@@ -3186,7 +3186,7 @@
                 <w:color w:val="000000"/>
                 <w:sz w:val="21"/>
               </w:rPr>
-              <w:t xml:space="preserve">0.603310</w:t>
+              <w:t xml:space="preserve">0.603342</w:t>
             </w:r>
           </w:p>
         </w:tc>
@@ -3203,7 +3203,7 @@
                 <w:color w:val="000000"/>
                 <w:sz w:val="21"/>
               </w:rPr>
-              <w:t xml:space="preserve">-2.275391</w:t>
+              <w:t xml:space="preserve">-2.275735</w:t>
             </w:r>
           </w:p>
         </w:tc>
@@ -3220,7 +3220,7 @@
                 <w:color w:val="000000"/>
                 <w:sz w:val="21"/>
               </w:rPr>
-              <w:t xml:space="preserve">27.303331</w:t>
+              <w:t xml:space="preserve">27.311963</w:t>
             </w:r>
           </w:p>
         </w:tc>
@@ -3256,7 +3256,7 @@
                 <w:color w:val="000000"/>
                 <w:sz w:val="21"/>
               </w:rPr>
-              <w:t xml:space="preserve">7688.563</w:t>
+              <w:t xml:space="preserve">7688.510</w:t>
             </w:r>
           </w:p>
         </w:tc>
@@ -3273,7 +3273,7 @@
                 <w:color w:val="000000"/>
                 <w:sz w:val="21"/>
               </w:rPr>
-              <w:t xml:space="preserve">0.601609</w:t>
+              <w:t xml:space="preserve">0.601605</w:t>
             </w:r>
           </w:p>
         </w:tc>
@@ -3290,7 +3290,7 @@
                 <w:color w:val="000000"/>
                 <w:sz w:val="21"/>
               </w:rPr>
-              <w:t xml:space="preserve">-2.257361</w:t>
+              <w:t xml:space="preserve">-2.257316</w:t>
             </w:r>
           </w:p>
         </w:tc>
@@ -3307,7 +3307,7 @@
                 <w:color w:val="000000"/>
                 <w:sz w:val="21"/>
               </w:rPr>
-              <w:t xml:space="preserve">27.385834</w:t>
+              <w:t xml:space="preserve">27.384609</w:t>
             </w:r>
           </w:p>
         </w:tc>
@@ -3343,7 +3343,7 @@
                 <w:color w:val="000000"/>
                 <w:sz w:val="21"/>
               </w:rPr>
-              <w:t xml:space="preserve">5348.922</w:t>
+              <w:t xml:space="preserve">5349.793</w:t>
             </w:r>
           </w:p>
         </w:tc>
@@ -3360,7 +3360,7 @@
                 <w:color w:val="000000"/>
                 <w:sz w:val="21"/>
               </w:rPr>
-              <w:t xml:space="preserve">0.602356</w:t>
+              <w:t xml:space="preserve">0.602454</w:t>
             </w:r>
           </w:p>
         </w:tc>
@@ -3377,7 +3377,7 @@
                 <w:color w:val="000000"/>
                 <w:sz w:val="21"/>
               </w:rPr>
-              <w:t xml:space="preserve">-2.262244</w:t>
+              <w:t xml:space="preserve">-2.263306</w:t>
             </w:r>
           </w:p>
         </w:tc>
@@ -3394,7 +3394,7 @@
                 <w:color w:val="000000"/>
                 <w:sz w:val="21"/>
               </w:rPr>
-              <w:t xml:space="preserve">27.354392</w:t>
+              <w:t xml:space="preserve">27.381524</w:t>
             </w:r>
           </w:p>
         </w:tc>
@@ -3430,7 +3430,7 @@
                 <w:color w:val="000000"/>
                 <w:sz w:val="21"/>
               </w:rPr>
-              <w:t xml:space="preserve">9641.803</w:t>
+              <w:t xml:space="preserve">9641.294</w:t>
             </w:r>
           </w:p>
         </w:tc>
@@ -3447,7 +3447,7 @@
                 <w:color w:val="000000"/>
                 <w:sz w:val="21"/>
               </w:rPr>
-              <w:t xml:space="preserve">1.337282</w:t>
+              <w:t xml:space="preserve">1.337211</w:t>
             </w:r>
           </w:p>
         </w:tc>
@@ -3464,7 +3464,7 @@
                 <w:color w:val="000000"/>
                 <w:sz w:val="21"/>
               </w:rPr>
-              <w:t xml:space="preserve">-15.110842</w:t>
+              <w:t xml:space="preserve">-15.109142</w:t>
             </w:r>
           </w:p>
         </w:tc>
@@ -3481,7 +3481,7 @@
                 <w:color w:val="000000"/>
                 <w:sz w:val="21"/>
               </w:rPr>
-              <w:t xml:space="preserve">31.989850</w:t>
+              <w:t xml:space="preserve">31.983197</w:t>
             </w:r>
           </w:p>
         </w:tc>
@@ -3517,7 +3517,7 @@
                 <w:color w:val="000000"/>
                 <w:sz w:val="21"/>
               </w:rPr>
-              <w:t xml:space="preserve">10065.537</w:t>
+              <w:t xml:space="preserve">10066.013</w:t>
             </w:r>
           </w:p>
         </w:tc>
@@ -3534,7 +3534,7 @@
                 <w:color w:val="000000"/>
                 <w:sz w:val="21"/>
               </w:rPr>
-              <w:t xml:space="preserve">2.092627</w:t>
+              <w:t xml:space="preserve">2.092726</w:t>
             </w:r>
           </w:p>
         </w:tc>
@@ -3551,7 +3551,7 @@
                 <w:color w:val="000000"/>
                 <w:sz w:val="21"/>
               </w:rPr>
-              <w:t xml:space="preserve">-38.470269</w:t>
+              <w:t xml:space="preserve">-38.474005</w:t>
             </w:r>
           </w:p>
         </w:tc>
@@ -3568,7 +3568,7 @@
                 <w:color w:val="000000"/>
                 <w:sz w:val="21"/>
               </w:rPr>
-              <w:t xml:space="preserve">31.984371</w:t>
+              <w:t xml:space="preserve">31.989926</w:t>
             </w:r>
           </w:p>
         </w:tc>
@@ -3604,7 +3604,7 @@
                 <w:color w:val="000000"/>
                 <w:sz w:val="21"/>
               </w:rPr>
-              <w:t xml:space="preserve">1594.675</w:t>
+              <w:t xml:space="preserve">1594.736</w:t>
             </w:r>
           </w:p>
         </w:tc>
@@ -3621,7 +3621,7 @@
                 <w:color w:val="000000"/>
                 <w:sz w:val="21"/>
               </w:rPr>
-              <w:t xml:space="preserve">1.130975</w:t>
+              <w:t xml:space="preserve">1.131018</w:t>
             </w:r>
           </w:p>
         </w:tc>
@@ -3638,7 +3638,7 @@
                 <w:color w:val="000000"/>
                 <w:sz w:val="21"/>
               </w:rPr>
-              <w:t xml:space="preserve">-10.581817</w:t>
+              <w:t xml:space="preserve">-10.582701</w:t>
             </w:r>
           </w:p>
         </w:tc>
@@ -3655,7 +3655,7 @@
                 <w:color w:val="000000"/>
                 <w:sz w:val="21"/>
               </w:rPr>
-              <w:t xml:space="preserve">31.883923</w:t>
+              <w:t xml:space="preserve">31.889389</w:t>
             </w:r>
           </w:p>
         </w:tc>

</xml_diff>

<commit_message>
docs: strengthen final review evidence
</commit_message>
<xml_diff>
--- a/docx/final/12_结题报告.docx
+++ b/docx/final/12_结题报告.docx
@@ -1563,6 +1563,561 @@
         </w:tc>
       </w:tr>
     </w:tbl>
+    <w:p>
+      <w:pPr>
+        <w:pStyle w:val="BodyText"/>
+        <w:spacing w:line="276" w:lineRule="auto" w:after="0"/>
+        <w:ind w:firstLine="420"/>
+      </w:pPr>
+      <w:r>
+        <w:rPr>
+          <w:rFonts w:ascii="宋体" w:hAnsi="宋体" w:eastAsia="宋体"/>
+          <w:color w:val="000000"/>
+        </w:rPr>
+        <w:t xml:space="preserve">开题阶段提出的能力在结题时按主线和扩展分层验收：</w:t>
+      </w:r>
+    </w:p>
+    <w:tbl>
+      <w:tblPr>
+        <w:tblStyle w:val="Table"/>
+        <w:tblW w:type="pct" w:w="5000.0"/>
+        <w:tblLook w:firstRow="1" w:lastRow="0" w:firstColumn="0" w:lastColumn="0" w:noHBand="0" w:noVBand="0" w:val="0020"/>
+        <w:tblBorders>
+          <w:top w:val="single" w:sz="4" w:space="0" w:color="000000"/>
+          <w:left w:val="single" w:sz="4" w:space="0" w:color="000000"/>
+          <w:bottom w:val="single" w:sz="4" w:space="0" w:color="000000"/>
+          <w:right w:val="single" w:sz="4" w:space="0" w:color="000000"/>
+          <w:insideH w:val="single" w:sz="4" w:space="0" w:color="000000"/>
+          <w:insideV w:val="single" w:sz="4" w:space="0" w:color="000000"/>
+        </w:tblBorders>
+      </w:tblPr>
+      <w:tblGrid>
+        <w:gridCol w:w="2640"/>
+        <w:gridCol w:w="2640"/>
+        <w:gridCol w:w="2640"/>
+      </w:tblGrid>
+      <w:tr>
+        <w:tc>
+          <w:tcPr>
+            <w:shd w:fill="FFFFFF"/>
+          </w:tcPr>
+          <w:p>
+            <w:pPr>
+              <w:pStyle w:val="Compact"/>
+              <w:ind w:firstLine="0"/>
+              <w:jc w:val="left"/>
+            </w:pPr>
+            <w:r>
+              <w:rPr>
+                <w:rFonts w:ascii="宋体" w:hAnsi="宋体" w:eastAsia="宋体"/>
+                <w:b/>
+                <w:color w:val="000000"/>
+                <w:sz w:val="21"/>
+              </w:rPr>
+              <w:t xml:space="preserve">开题承诺</w:t>
+            </w:r>
+          </w:p>
+        </w:tc>
+        <w:tc>
+          <w:tcPr>
+            <w:shd w:fill="FFFFFF"/>
+          </w:tcPr>
+          <w:p>
+            <w:pPr>
+              <w:pStyle w:val="Compact"/>
+              <w:ind w:firstLine="0"/>
+              <w:jc w:val="left"/>
+            </w:pPr>
+            <w:r>
+              <w:rPr>
+                <w:rFonts w:ascii="宋体" w:hAnsi="宋体" w:eastAsia="宋体"/>
+                <w:b/>
+                <w:color w:val="000000"/>
+                <w:sz w:val="21"/>
+              </w:rPr>
+              <w:t xml:space="preserve">结题状态</w:t>
+            </w:r>
+          </w:p>
+        </w:tc>
+        <w:tc>
+          <w:tcPr>
+            <w:shd w:fill="FFFFFF"/>
+          </w:tcPr>
+          <w:p>
+            <w:pPr>
+              <w:pStyle w:val="Compact"/>
+              <w:ind w:firstLine="0"/>
+              <w:jc w:val="left"/>
+            </w:pPr>
+            <w:r>
+              <w:rPr>
+                <w:rFonts w:ascii="宋体" w:hAnsi="宋体" w:eastAsia="宋体"/>
+                <w:b/>
+                <w:color w:val="000000"/>
+                <w:sz w:val="21"/>
+              </w:rPr>
+              <w:t xml:space="preserve">说明</w:t>
+            </w:r>
+          </w:p>
+        </w:tc>
+      </w:tr>
+      <w:tr>
+        <w:tc>
+          <w:p>
+            <w:pPr>
+              <w:pStyle w:val="Compact"/>
+              <w:ind w:firstLine="0"/>
+              <w:jc w:val="left"/>
+            </w:pPr>
+            <w:r>
+              <w:rPr>
+                <w:rFonts w:ascii="宋体" w:hAnsi="宋体" w:eastAsia="宋体"/>
+                <w:color w:val="000000"/>
+                <w:sz w:val="21"/>
+              </w:rPr>
+              <w:t xml:space="preserve">数据导入、检查与管理</w:t>
+            </w:r>
+          </w:p>
+        </w:tc>
+        <w:tc>
+          <w:p>
+            <w:pPr>
+              <w:pStyle w:val="Compact"/>
+              <w:ind w:firstLine="0"/>
+              <w:jc w:val="left"/>
+            </w:pPr>
+            <w:r>
+              <w:rPr>
+                <w:rFonts w:ascii="宋体" w:hAnsi="宋体" w:eastAsia="宋体"/>
+                <w:color w:val="000000"/>
+                <w:sz w:val="21"/>
+              </w:rPr>
+              <w:t xml:space="preserve">已完成</w:t>
+            </w:r>
+          </w:p>
+        </w:tc>
+        <w:tc>
+          <w:p>
+            <w:pPr>
+              <w:pStyle w:val="Compact"/>
+              <w:ind w:firstLine="0"/>
+              <w:jc w:val="left"/>
+            </w:pPr>
+            <w:r>
+              <w:rPr>
+                <w:rFonts w:ascii="宋体" w:hAnsi="宋体" w:eastAsia="宋体"/>
+                <w:color w:val="000000"/>
+                <w:sz w:val="21"/>
+              </w:rPr>
+              <w:t xml:space="preserve">支持 XJTU-SY、PHM2012 和合成数据，统一为</w:t>
+            </w:r>
+            <w:r>
+              <w:rPr>
+                <w:rFonts w:ascii="宋体" w:hAnsi="宋体" w:eastAsia="宋体"/>
+                <w:color w:val="000000"/>
+                <w:sz w:val="21"/>
+              </w:rPr>
+              <w:t xml:space="preserve"> </w:t>
+            </w:r>
+            <w:r>
+              <w:rPr>
+                <w:rStyle w:val="VerbatimChar"/>
+                <w:rFonts w:ascii="宋体" w:hAnsi="宋体" w:eastAsia="宋体"/>
+                <w:color w:val="000000"/>
+                <w:sz w:val="21"/>
+              </w:rPr>
+              <w:t xml:space="preserve">BearingEntity</w:t>
+            </w:r>
+          </w:p>
+        </w:tc>
+      </w:tr>
+      <w:tr>
+        <w:tc>
+          <w:p>
+            <w:pPr>
+              <w:pStyle w:val="Compact"/>
+              <w:ind w:firstLine="0"/>
+              <w:jc w:val="left"/>
+            </w:pPr>
+            <w:r>
+              <w:rPr>
+                <w:rFonts w:ascii="宋体" w:hAnsi="宋体" w:eastAsia="宋体"/>
+                <w:color w:val="000000"/>
+                <w:sz w:val="21"/>
+              </w:rPr>
+              <w:t xml:space="preserve">振动信号预处理与特征提取</w:t>
+            </w:r>
+          </w:p>
+        </w:tc>
+        <w:tc>
+          <w:p>
+            <w:pPr>
+              <w:pStyle w:val="Compact"/>
+              <w:ind w:firstLine="0"/>
+              <w:jc w:val="left"/>
+            </w:pPr>
+            <w:r>
+              <w:rPr>
+                <w:rFonts w:ascii="宋体" w:hAnsi="宋体" w:eastAsia="宋体"/>
+                <w:color w:val="000000"/>
+                <w:sz w:val="21"/>
+              </w:rPr>
+              <w:t xml:space="preserve">已完成</w:t>
+            </w:r>
+          </w:p>
+        </w:tc>
+        <w:tc>
+          <w:p>
+            <w:pPr>
+              <w:pStyle w:val="Compact"/>
+              <w:ind w:firstLine="0"/>
+              <w:jc w:val="left"/>
+            </w:pPr>
+            <w:r>
+              <w:rPr>
+                <w:rFonts w:ascii="宋体" w:hAnsi="宋体" w:eastAsia="宋体"/>
+                <w:color w:val="000000"/>
+                <w:sz w:val="21"/>
+              </w:rPr>
+              <w:t xml:space="preserve">实现 19 维时域/频域特征和多轴承特征摘要</w:t>
+            </w:r>
+          </w:p>
+        </w:tc>
+      </w:tr>
+      <w:tr>
+        <w:tc>
+          <w:p>
+            <w:pPr>
+              <w:pStyle w:val="Compact"/>
+              <w:ind w:firstLine="0"/>
+              <w:jc w:val="left"/>
+            </w:pPr>
+            <w:r>
+              <w:rPr>
+                <w:rFonts w:ascii="宋体" w:hAnsi="宋体" w:eastAsia="宋体"/>
+                <w:color w:val="000000"/>
+                <w:sz w:val="21"/>
+              </w:rPr>
+              <w:t xml:space="preserve">剩余寿命预测</w:t>
+            </w:r>
+          </w:p>
+        </w:tc>
+        <w:tc>
+          <w:p>
+            <w:pPr>
+              <w:pStyle w:val="Compact"/>
+              <w:ind w:firstLine="0"/>
+              <w:jc w:val="left"/>
+            </w:pPr>
+            <w:r>
+              <w:rPr>
+                <w:rFonts w:ascii="宋体" w:hAnsi="宋体" w:eastAsia="宋体"/>
+                <w:color w:val="000000"/>
+                <w:sz w:val="21"/>
+              </w:rPr>
+              <w:t xml:space="preserve">已完成</w:t>
+            </w:r>
+          </w:p>
+        </w:tc>
+        <w:tc>
+          <w:p>
+            <w:pPr>
+              <w:pStyle w:val="Compact"/>
+              <w:ind w:firstLine="0"/>
+              <w:jc w:val="left"/>
+            </w:pPr>
+            <w:r>
+              <w:rPr>
+                <w:rFonts w:ascii="宋体" w:hAnsi="宋体" w:eastAsia="宋体"/>
+                <w:color w:val="000000"/>
+                <w:sz w:val="21"/>
+              </w:rPr>
+              <w:t xml:space="preserve">支持 baseline、CNN-LSTM-AM、XLSTM-Transformer 等训练 workflow</w:t>
+            </w:r>
+          </w:p>
+        </w:tc>
+      </w:tr>
+      <w:tr>
+        <w:tc>
+          <w:p>
+            <w:pPr>
+              <w:pStyle w:val="Compact"/>
+              <w:ind w:firstLine="0"/>
+              <w:jc w:val="left"/>
+            </w:pPr>
+            <w:r>
+              <w:rPr>
+                <w:rFonts w:ascii="宋体" w:hAnsi="宋体" w:eastAsia="宋体"/>
+                <w:color w:val="000000"/>
+                <w:sz w:val="21"/>
+              </w:rPr>
+              <w:t xml:space="preserve">健康趋势和 RUL 曲线展示</w:t>
+            </w:r>
+          </w:p>
+        </w:tc>
+        <w:tc>
+          <w:p>
+            <w:pPr>
+              <w:pStyle w:val="Compact"/>
+              <w:ind w:firstLine="0"/>
+              <w:jc w:val="left"/>
+            </w:pPr>
+            <w:r>
+              <w:rPr>
+                <w:rFonts w:ascii="宋体" w:hAnsi="宋体" w:eastAsia="宋体"/>
+                <w:color w:val="000000"/>
+                <w:sz w:val="21"/>
+              </w:rPr>
+              <w:t xml:space="preserve">已完成</w:t>
+            </w:r>
+          </w:p>
+        </w:tc>
+        <w:tc>
+          <w:p>
+            <w:pPr>
+              <w:pStyle w:val="Compact"/>
+              <w:ind w:firstLine="0"/>
+              <w:jc w:val="left"/>
+            </w:pPr>
+            <w:r>
+              <w:rPr>
+                <w:rFonts w:ascii="宋体" w:hAnsi="宋体" w:eastAsia="宋体"/>
+                <w:color w:val="000000"/>
+                <w:sz w:val="21"/>
+              </w:rPr>
+              <w:t xml:space="preserve">notebook、可视化模块和最终 PPT 均包含趋势图</w:t>
+            </w:r>
+          </w:p>
+        </w:tc>
+      </w:tr>
+      <w:tr>
+        <w:tc>
+          <w:p>
+            <w:pPr>
+              <w:pStyle w:val="Compact"/>
+              <w:ind w:firstLine="0"/>
+              <w:jc w:val="left"/>
+            </w:pPr>
+            <w:r>
+              <w:rPr>
+                <w:rFonts w:ascii="宋体" w:hAnsi="宋体" w:eastAsia="宋体"/>
+                <w:color w:val="000000"/>
+                <w:sz w:val="21"/>
+              </w:rPr>
+              <w:t xml:space="preserve">训练监控与实验记录</w:t>
+            </w:r>
+          </w:p>
+        </w:tc>
+        <w:tc>
+          <w:p>
+            <w:pPr>
+              <w:pStyle w:val="Compact"/>
+              <w:ind w:firstLine="0"/>
+              <w:jc w:val="left"/>
+            </w:pPr>
+            <w:r>
+              <w:rPr>
+                <w:rFonts w:ascii="宋体" w:hAnsi="宋体" w:eastAsia="宋体"/>
+                <w:color w:val="000000"/>
+                <w:sz w:val="21"/>
+              </w:rPr>
+              <w:t xml:space="preserve">已完成</w:t>
+            </w:r>
+          </w:p>
+        </w:tc>
+        <w:tc>
+          <w:p>
+            <w:pPr>
+              <w:pStyle w:val="Compact"/>
+              <w:ind w:firstLine="0"/>
+              <w:jc w:val="left"/>
+            </w:pPr>
+            <w:r>
+              <w:rPr>
+                <w:rStyle w:val="VerbatimChar"/>
+                <w:rFonts w:ascii="宋体" w:hAnsi="宋体" w:eastAsia="宋体"/>
+                <w:color w:val="000000"/>
+                <w:sz w:val="21"/>
+              </w:rPr>
+              <w:t xml:space="preserve">history.csv</w:t>
+            </w:r>
+            <w:r>
+              <w:rPr>
+                <w:rFonts w:ascii="宋体" w:hAnsi="宋体" w:eastAsia="宋体"/>
+                <w:color w:val="000000"/>
+                <w:sz w:val="21"/>
+              </w:rPr>
+              <w:t xml:space="preserve">、</w:t>
+            </w:r>
+            <w:r>
+              <w:rPr>
+                <w:rStyle w:val="VerbatimChar"/>
+                <w:rFonts w:ascii="宋体" w:hAnsi="宋体" w:eastAsia="宋体"/>
+                <w:color w:val="000000"/>
+                <w:sz w:val="21"/>
+              </w:rPr>
+              <w:t xml:space="preserve">metrics.json</w:t>
+            </w:r>
+            <w:r>
+              <w:rPr>
+                <w:rFonts w:ascii="宋体" w:hAnsi="宋体" w:eastAsia="宋体"/>
+                <w:color w:val="000000"/>
+                <w:sz w:val="21"/>
+              </w:rPr>
+              <w:t xml:space="preserve">、</w:t>
+            </w:r>
+            <w:r>
+              <w:rPr>
+                <w:rStyle w:val="VerbatimChar"/>
+                <w:rFonts w:ascii="宋体" w:hAnsi="宋体" w:eastAsia="宋体"/>
+                <w:color w:val="000000"/>
+                <w:sz w:val="21"/>
+              </w:rPr>
+              <w:t xml:space="preserve">predictions.csv</w:t>
+            </w:r>
+            <w:r>
+              <w:rPr>
+                <w:rFonts w:ascii="宋体" w:hAnsi="宋体" w:eastAsia="宋体"/>
+                <w:color w:val="000000"/>
+                <w:sz w:val="21"/>
+              </w:rPr>
+              <w:t xml:space="preserve">、</w:t>
+            </w:r>
+            <w:r>
+              <w:rPr>
+                <w:rStyle w:val="VerbatimChar"/>
+                <w:rFonts w:ascii="宋体" w:hAnsi="宋体" w:eastAsia="宋体"/>
+                <w:color w:val="000000"/>
+                <w:sz w:val="21"/>
+              </w:rPr>
+              <w:t xml:space="preserve">comparison_metrics.csv</w:t>
+            </w:r>
+            <w:r>
+              <w:rPr>
+                <w:rFonts w:ascii="宋体" w:hAnsi="宋体" w:eastAsia="宋体"/>
+                <w:color w:val="000000"/>
+                <w:sz w:val="21"/>
+              </w:rPr>
+              <w:t xml:space="preserve"> </w:t>
+            </w:r>
+            <w:r>
+              <w:rPr>
+                <w:rFonts w:ascii="宋体" w:hAnsi="宋体" w:eastAsia="宋体"/>
+                <w:color w:val="000000"/>
+                <w:sz w:val="21"/>
+              </w:rPr>
+              <w:t xml:space="preserve">可追溯</w:t>
+            </w:r>
+          </w:p>
+        </w:tc>
+      </w:tr>
+      <w:tr>
+        <w:tc>
+          <w:p>
+            <w:pPr>
+              <w:pStyle w:val="Compact"/>
+              <w:ind w:firstLine="0"/>
+              <w:jc w:val="left"/>
+            </w:pPr>
+            <w:r>
+              <w:rPr>
+                <w:rFonts w:ascii="宋体" w:hAnsi="宋体" w:eastAsia="宋体"/>
+                <w:color w:val="000000"/>
+                <w:sz w:val="21"/>
+              </w:rPr>
+              <w:t xml:space="preserve">失效概率/生存分析</w:t>
+            </w:r>
+          </w:p>
+        </w:tc>
+        <w:tc>
+          <w:p>
+            <w:pPr>
+              <w:pStyle w:val="Compact"/>
+              <w:ind w:firstLine="0"/>
+              <w:jc w:val="left"/>
+            </w:pPr>
+            <w:r>
+              <w:rPr>
+                <w:rFonts w:ascii="宋体" w:hAnsi="宋体" w:eastAsia="宋体"/>
+                <w:color w:val="000000"/>
+                <w:sz w:val="21"/>
+              </w:rPr>
+              <w:t xml:space="preserve">扩展接口</w:t>
+            </w:r>
+          </w:p>
+        </w:tc>
+        <w:tc>
+          <w:p>
+            <w:pPr>
+              <w:pStyle w:val="Compact"/>
+              <w:ind w:firstLine="0"/>
+              <w:jc w:val="left"/>
+            </w:pPr>
+            <w:r>
+              <w:rPr>
+                <w:rFonts w:ascii="宋体" w:hAnsi="宋体" w:eastAsia="宋体"/>
+                <w:color w:val="000000"/>
+                <w:sz w:val="21"/>
+              </w:rPr>
+              <w:t xml:space="preserve">保留 Kaplan-Meier、Cox 等基础接口，但不作为本轮主验收路线</w:t>
+            </w:r>
+          </w:p>
+        </w:tc>
+      </w:tr>
+      <w:tr>
+        <w:tc>
+          <w:p>
+            <w:pPr>
+              <w:pStyle w:val="Compact"/>
+              <w:ind w:firstLine="0"/>
+              <w:jc w:val="left"/>
+            </w:pPr>
+            <w:r>
+              <w:rPr>
+                <w:rFonts w:ascii="宋体" w:hAnsi="宋体" w:eastAsia="宋体"/>
+                <w:color w:val="000000"/>
+                <w:sz w:val="21"/>
+              </w:rPr>
+              <w:t xml:space="preserve">课程文档和测试报告</w:t>
+            </w:r>
+          </w:p>
+        </w:tc>
+        <w:tc>
+          <w:p>
+            <w:pPr>
+              <w:pStyle w:val="Compact"/>
+              <w:ind w:firstLine="0"/>
+              <w:jc w:val="left"/>
+            </w:pPr>
+            <w:r>
+              <w:rPr>
+                <w:rFonts w:ascii="宋体" w:hAnsi="宋体" w:eastAsia="宋体"/>
+                <w:color w:val="000000"/>
+                <w:sz w:val="21"/>
+              </w:rPr>
+              <w:t xml:space="preserve">已完成</w:t>
+            </w:r>
+          </w:p>
+        </w:tc>
+        <w:tc>
+          <w:p>
+            <w:pPr>
+              <w:pStyle w:val="Compact"/>
+              <w:ind w:firstLine="0"/>
+              <w:jc w:val="left"/>
+            </w:pPr>
+            <w:r>
+              <w:rPr>
+                <w:rFonts w:ascii="宋体" w:hAnsi="宋体" w:eastAsia="宋体"/>
+                <w:color w:val="000000"/>
+                <w:sz w:val="21"/>
+              </w:rPr>
+              <w:t xml:space="preserve">结题报告、测试报告、用户手册、安装手册、技术论文、PPT 和讲稿已归档</w:t>
+            </w:r>
+          </w:p>
+        </w:tc>
+      </w:tr>
+    </w:tbl>
     <w:bookmarkStart w:id="23" w:name="数据理解与特征分析成果"/>
     <w:p>
       <w:pPr>
@@ -1848,7 +2403,49 @@
           <w:rFonts w:ascii="宋体" w:hAnsi="宋体" w:eastAsia="宋体"/>
           <w:color w:val="000000"/>
         </w:rPr>
-        <w:t xml:space="preserve">特征层采用 19 维时域/频域特征。RMS 和谱能量用于反映振动强度，峭度、峰值因子和脉冲因子用于反映冲击增强，谱熵和主频用于补充频率分布变化。这些特征既作为模型输入，也用于答辩中说明数据规律。</w:t>
+        <w:t xml:space="preserve">特征层采用 19 维时域/频域特征。RMS、峰值、峰峰值和谱能量用于反映振动强度；峭度、峰值因子、脉冲因子和裕度因子用于反映冲击增强；均值、方差、标准差和偏度用于描述稳定性；主频、谱质心、谱均方根频率和谱熵用于补充频率分布变化。这些特征由项目代码使用 NumPy/FFT 计算，不是依赖自动特征提取工具生成。</w:t>
+      </w:r>
+    </w:p>
+    <w:p>
+      <w:pPr>
+        <w:pStyle w:val="BodyText"/>
+        <w:spacing w:line="276" w:lineRule="auto" w:after="0"/>
+        <w:ind w:firstLine="420"/>
+      </w:pPr>
+      <w:r>
+        <w:rPr>
+          <w:rFonts w:ascii="宋体" w:hAnsi="宋体" w:eastAsia="宋体"/>
+          <w:color w:val="000000"/>
+        </w:rPr>
+        <w:t xml:space="preserve">综合健康指标用于图表展示时，并不是 19 维特征的简单平均，而是选取 RMS、峭度、峰值因子、谱能量做标准化合成。多轴承摘要采用</w:t>
+      </w:r>
+      <w:r>
+        <w:rPr>
+          <w:rFonts w:ascii="宋体" w:hAnsi="宋体" w:eastAsia="宋体"/>
+          <w:color w:val="000000"/>
+        </w:rPr>
+        <w:t xml:space="preserve">“</w:t>
+      </w:r>
+      <w:r>
+        <w:rPr>
+          <w:rFonts w:ascii="宋体" w:hAnsi="宋体" w:eastAsia="宋体"/>
+          <w:color w:val="000000"/>
+        </w:rPr>
+        <w:t xml:space="preserve">均匀抽样 80 个快照，前 20% 与后 20% 对比</w:t>
+      </w:r>
+      <w:r>
+        <w:rPr>
+          <w:rFonts w:ascii="宋体" w:hAnsi="宋体" w:eastAsia="宋体"/>
+          <w:color w:val="000000"/>
+        </w:rPr>
+        <w:t xml:space="preserve">”</w:t>
+      </w:r>
+      <w:r>
+        <w:rPr>
+          <w:rFonts w:ascii="宋体" w:hAnsi="宋体" w:eastAsia="宋体"/>
+          <w:color w:val="000000"/>
+        </w:rPr>
+        <w:t xml:space="preserve">的统计口径；该抽样只用于特征分析图，不等同于训练/测试划分。</w:t>
       </w:r>
     </w:p>
     <w:bookmarkEnd w:id="23"/>
@@ -3863,6 +4460,49 @@
           <w:rFonts w:ascii="宋体" w:hAnsi="宋体" w:eastAsia="宋体"/>
           <w:color w:val="000000"/>
         </w:rPr>
+        <w:t xml:space="preserve">测试证据按三层组织：快速 demo 用于验证 API 链路；notebook smoke 用于验证 examples 真实可执行；真实复现 workflow 用</w:t>
+      </w:r>
+      <w:r>
+        <w:rPr>
+          <w:rFonts w:ascii="宋体" w:hAnsi="宋体" w:eastAsia="宋体"/>
+          <w:color w:val="000000"/>
+        </w:rPr>
+        <w:t xml:space="preserve"> </w:t>
+      </w:r>
+      <w:r>
+        <w:rPr>
+          <w:rStyle w:val="VerbatimChar"/>
+          <w:rFonts w:ascii="宋体" w:hAnsi="宋体" w:eastAsia="宋体"/>
+          <w:color w:val="000000"/>
+        </w:rPr>
+        <w:t xml:space="preserve">data/external</w:t>
+      </w:r>
+      <w:r>
+        <w:rPr>
+          <w:rFonts w:ascii="宋体" w:hAnsi="宋体" w:eastAsia="宋体"/>
+          <w:color w:val="000000"/>
+        </w:rPr>
+        <w:t xml:space="preserve"> </w:t>
+      </w:r>
+      <w:r>
+        <w:rPr>
+          <w:rFonts w:ascii="宋体" w:hAnsi="宋体" w:eastAsia="宋体"/>
+          <w:color w:val="000000"/>
+        </w:rPr>
+        <w:t xml:space="preserve">数据输出训练历史、预测表和指标对比。结题文档、PDF/DOCX 导出和网页 PPT 生成也作为课程交付验收的一部分。</w:t>
+      </w:r>
+    </w:p>
+    <w:p>
+      <w:pPr>
+        <w:pStyle w:val="BodyText"/>
+        <w:spacing w:line="276" w:lineRule="auto" w:after="0"/>
+        <w:ind w:firstLine="420"/>
+      </w:pPr>
+      <w:r>
+        <w:rPr>
+          <w:rFonts w:ascii="宋体" w:hAnsi="宋体" w:eastAsia="宋体"/>
+          <w:color w:val="000000"/>
+        </w:rPr>
         <w:t xml:space="preserve">截至结题阶段，重点测试命令包括：</w:t>
       </w:r>
     </w:p>
@@ -4319,7 +4959,66 @@
           <w:rFonts w:ascii="宋体" w:hAnsi="宋体" w:eastAsia="宋体"/>
           <w:color w:val="000000"/>
         </w:rPr>
-        <w:t xml:space="preserve">本项目完成了工业轴承剩余寿命预测系统的主要设计、实现、测试和文档工作。系统能够导入真实轴承数据，完成特征提取、RUL 训练、指标评估、实验记录和论文复现，满足软件工程课程对可运行系统、工程过程、测试验证和文档交付的要求。</w:t>
+        <w:t xml:space="preserve">本项目完成了工业轴承剩余寿命预测系统的主要设计、实现、测试和文档工作。最终成果可以概括为三条可追溯链路：从真实数据文件到统一</w:t>
+      </w:r>
+      <w:r>
+        <w:rPr>
+          <w:rFonts w:ascii="宋体" w:hAnsi="宋体" w:eastAsia="宋体"/>
+          <w:color w:val="000000"/>
+        </w:rPr>
+        <w:t xml:space="preserve"> </w:t>
+      </w:r>
+      <w:r>
+        <w:rPr>
+          <w:rStyle w:val="VerbatimChar"/>
+          <w:rFonts w:ascii="宋体" w:hAnsi="宋体" w:eastAsia="宋体"/>
+          <w:color w:val="000000"/>
+        </w:rPr>
+        <w:t xml:space="preserve">BearingEntity</w:t>
+      </w:r>
+      <w:r>
+        <w:rPr>
+          <w:rFonts w:ascii="宋体" w:hAnsi="宋体" w:eastAsia="宋体"/>
+          <w:color w:val="000000"/>
+        </w:rPr>
+        <w:t xml:space="preserve">；从振动快照到 19 维特征、RUL 标签和模型输入；从真实训练到</w:t>
+      </w:r>
+      <w:r>
+        <w:rPr>
+          <w:rFonts w:ascii="宋体" w:hAnsi="宋体" w:eastAsia="宋体"/>
+          <w:color w:val="000000"/>
+        </w:rPr>
+        <w:t xml:space="preserve"> </w:t>
+      </w:r>
+      <w:r>
+        <w:rPr>
+          <w:rStyle w:val="VerbatimChar"/>
+          <w:rFonts w:ascii="宋体" w:hAnsi="宋体" w:eastAsia="宋体"/>
+          <w:color w:val="000000"/>
+        </w:rPr>
+        <w:t xml:space="preserve">history.csv</w:t>
+      </w:r>
+      <w:r>
+        <w:rPr>
+          <w:rFonts w:ascii="宋体" w:hAnsi="宋体" w:eastAsia="宋体"/>
+          <w:color w:val="000000"/>
+        </w:rPr>
+        <w:t xml:space="preserve">、</w:t>
+      </w:r>
+      <w:r>
+        <w:rPr>
+          <w:rStyle w:val="VerbatimChar"/>
+          <w:rFonts w:ascii="宋体" w:hAnsi="宋体" w:eastAsia="宋体"/>
+          <w:color w:val="000000"/>
+        </w:rPr>
+        <w:t xml:space="preserve">predictions.csv</w:t>
+      </w:r>
+      <w:r>
+        <w:rPr>
+          <w:rFonts w:ascii="宋体" w:hAnsi="宋体" w:eastAsia="宋体"/>
+          <w:color w:val="000000"/>
+        </w:rPr>
+        <w:t xml:space="preserve">、指标表、测试报告和答辩材料。系统满足软件工程课程对可运行系统、工程过程、测试验证和文档交付的要求。</w:t>
       </w:r>
     </w:p>
     <w:bookmarkEnd w:id="32"/>

</xml_diff>

<commit_message>
docs: finalize formal reproduction evidence
</commit_message>
<xml_diff>
--- a/docx/final/12_结题报告.docx
+++ b/docx/final/12_结题报告.docx
@@ -2869,7 +2869,7 @@
                 <w:color w:val="000000"/>
                 <w:sz w:val="21"/>
               </w:rPr>
-              <w:t xml:space="preserve">8 个 notebook smoke、31 个测试和真实训练记录</w:t>
+              <w:t xml:space="preserve">8 个 notebook、39 个全量测试和真实训练记录</w:t>
             </w:r>
           </w:p>
         </w:tc>
@@ -2950,7 +2950,7 @@
           <w:rFonts w:ascii="宋体" w:hAnsi="宋体" w:eastAsia="宋体"/>
           <w:color w:val="000000"/>
         </w:rPr>
-        <w:t xml:space="preserve">真实数据 8 epoch 小规模训练验收结果显示，XJTU-SY 和 PHM2012 均能完成 CNN-LSTM-AM 与 CNN-LSTM baseline 对比，并输出</w:t>
+        <w:t xml:space="preserve">真实数据 50 epoch 正式训练验收结果显示，XJTU-SY 和 PHM2012 均能完成 CNN-LSTM-AM 与 CNN-LSTM baseline 对比，并输出</w:t>
       </w:r>
       <w:r>
         <w:rPr>
@@ -3002,7 +3002,7 @@
           <w:rFonts w:ascii="宋体" w:hAnsi="宋体" w:eastAsia="宋体"/>
           <w:color w:val="000000"/>
         </w:rPr>
-        <w:t xml:space="preserve">、方向性偏差和相对变化列。</w:t>
+        <w:t xml:space="preserve">、方向性偏差、相对变化列和论文指标 gap 表。</w:t>
       </w:r>
     </w:p>
     <w:tbl>
@@ -3038,7 +3038,7 @@
                 <w:color w:val="000000"/>
                 <w:sz w:val="21"/>
               </w:rPr>
-              <w:t xml:space="preserve">数据集与轴承</w:t>
+              <w:t xml:space="preserve">数据集/工况</w:t>
             </w:r>
           </w:p>
         </w:tc>
@@ -3126,6 +3126,48 @@
             </w:r>
           </w:p>
         </w:tc>
+        <w:tc>
+          <w:tcPr>
+            <w:shd w:fill="FFFFFF"/>
+          </w:tcPr>
+          <w:p>
+            <w:pPr>
+              <w:pStyle w:val="Compact"/>
+              <w:ind w:firstLine="0"/>
+              <w:jc w:val="right"/>
+            </w:pPr>
+            <w:r>
+              <w:rPr>
+                <w:rFonts w:ascii="宋体" w:hAnsi="宋体" w:eastAsia="宋体"/>
+                <w:b/>
+                <w:color w:val="000000"/>
+                <w:sz w:val="21"/>
+              </w:rPr>
+              <w:t xml:space="preserve">预测数</w:t>
+            </w:r>
+          </w:p>
+        </w:tc>
+        <w:tc>
+          <w:tcPr>
+            <w:shd w:fill="FFFFFF"/>
+          </w:tcPr>
+          <w:p>
+            <w:pPr>
+              <w:pStyle w:val="Compact"/>
+              <w:ind w:firstLine="0"/>
+              <w:jc w:val="right"/>
+            </w:pPr>
+            <w:r>
+              <w:rPr>
+                <w:rFonts w:ascii="宋体" w:hAnsi="宋体" w:eastAsia="宋体"/>
+                <w:b/>
+                <w:color w:val="000000"/>
+                <w:sz w:val="21"/>
+              </w:rPr>
+              <w:t xml:space="preserve">epoch</w:t>
+            </w:r>
+          </w:p>
+        </w:tc>
       </w:tr>
       <w:tr>
         <w:tc>
@@ -3141,7 +3183,7 @@
                 <w:color w:val="000000"/>
                 <w:sz w:val="21"/>
               </w:rPr>
-              <w:t xml:space="preserve">XJTU-SY Bearing1_5</w:t>
+              <w:t xml:space="preserve">XJTU-SY condition_1_35Hz12kN</w:t>
             </w:r>
           </w:p>
         </w:tc>
@@ -3175,7 +3217,7 @@
                 <w:color w:val="000000"/>
                 <w:sz w:val="21"/>
               </w:rPr>
-              <w:t xml:space="preserve">406.302</w:t>
+              <w:t xml:space="preserve">0.146543</w:t>
             </w:r>
           </w:p>
         </w:tc>
@@ -3192,7 +3234,7 @@
                 <w:color w:val="000000"/>
                 <w:sz w:val="21"/>
               </w:rPr>
-              <w:t xml:space="preserve">0.615609</w:t>
+              <w:t xml:space="preserve">0.146543</w:t>
             </w:r>
           </w:p>
         </w:tc>
@@ -3209,7 +3251,41 @@
                 <w:color w:val="000000"/>
                 <w:sz w:val="21"/>
               </w:rPr>
-              <w:t xml:space="preserve">29.001612</w:t>
+              <w:t xml:space="preserve">0.792412</w:t>
+            </w:r>
+          </w:p>
+        </w:tc>
+        <w:tc>
+          <w:p>
+            <w:pPr>
+              <w:pStyle w:val="Compact"/>
+              <w:ind w:firstLine="0"/>
+              <w:jc w:val="right"/>
+            </w:pPr>
+            <w:r>
+              <w:rPr>
+                <w:rFonts w:ascii="宋体" w:hAnsi="宋体" w:eastAsia="宋体"/>
+                <w:color w:val="000000"/>
+                <w:sz w:val="21"/>
+              </w:rPr>
+              <w:t xml:space="preserve">92</w:t>
+            </w:r>
+          </w:p>
+        </w:tc>
+        <w:tc>
+          <w:p>
+            <w:pPr>
+              <w:pStyle w:val="Compact"/>
+              <w:ind w:firstLine="0"/>
+              <w:jc w:val="right"/>
+            </w:pPr>
+            <w:r>
+              <w:rPr>
+                <w:rFonts w:ascii="宋体" w:hAnsi="宋体" w:eastAsia="宋体"/>
+                <w:color w:val="000000"/>
+                <w:sz w:val="21"/>
+              </w:rPr>
+              <w:t xml:space="preserve">50</w:t>
             </w:r>
           </w:p>
         </w:tc>
@@ -3228,7 +3304,7 @@
                 <w:color w:val="000000"/>
                 <w:sz w:val="21"/>
               </w:rPr>
-              <w:t xml:space="preserve">XJTU-SY Bearing1_5</w:t>
+              <w:t xml:space="preserve">XJTU-SY condition_1_35Hz12kN</w:t>
             </w:r>
           </w:p>
         </w:tc>
@@ -3262,7 +3338,7 @@
                 <w:color w:val="000000"/>
                 <w:sz w:val="21"/>
               </w:rPr>
-              <w:t xml:space="preserve">406.503</w:t>
+              <w:t xml:space="preserve">0.180620</w:t>
             </w:r>
           </w:p>
         </w:tc>
@@ -3279,7 +3355,7 @@
                 <w:color w:val="000000"/>
                 <w:sz w:val="21"/>
               </w:rPr>
-              <w:t xml:space="preserve">0.615913</w:t>
+              <w:t xml:space="preserve">0.180620</w:t>
             </w:r>
           </w:p>
         </w:tc>
@@ -3296,7 +3372,41 @@
                 <w:color w:val="000000"/>
                 <w:sz w:val="21"/>
               </w:rPr>
-              <w:t xml:space="preserve">29.127879</w:t>
+              <w:t xml:space="preserve">1.396488</w:t>
+            </w:r>
+          </w:p>
+        </w:tc>
+        <w:tc>
+          <w:p>
+            <w:pPr>
+              <w:pStyle w:val="Compact"/>
+              <w:ind w:firstLine="0"/>
+              <w:jc w:val="right"/>
+            </w:pPr>
+            <w:r>
+              <w:rPr>
+                <w:rFonts w:ascii="宋体" w:hAnsi="宋体" w:eastAsia="宋体"/>
+                <w:color w:val="000000"/>
+                <w:sz w:val="21"/>
+              </w:rPr>
+              <w:t xml:space="preserve">92</w:t>
+            </w:r>
+          </w:p>
+        </w:tc>
+        <w:tc>
+          <w:p>
+            <w:pPr>
+              <w:pStyle w:val="Compact"/>
+              <w:ind w:firstLine="0"/>
+              <w:jc w:val="right"/>
+            </w:pPr>
+            <w:r>
+              <w:rPr>
+                <w:rFonts w:ascii="宋体" w:hAnsi="宋体" w:eastAsia="宋体"/>
+                <w:color w:val="000000"/>
+                <w:sz w:val="21"/>
+              </w:rPr>
+              <w:t xml:space="preserve">50</w:t>
             </w:r>
           </w:p>
         </w:tc>
@@ -3315,7 +3425,7 @@
                 <w:color w:val="000000"/>
                 <w:sz w:val="21"/>
               </w:rPr>
-              <w:t xml:space="preserve">PHM2012 Bearing3_1</w:t>
+              <w:t xml:space="preserve">PHM2012 condition_1</w:t>
             </w:r>
           </w:p>
         </w:tc>
@@ -3349,7 +3459,7 @@
                 <w:color w:val="000000"/>
                 <w:sz w:val="21"/>
               </w:rPr>
-              <w:t xml:space="preserve">651.036</w:t>
+              <w:t xml:space="preserve">0.166840</w:t>
             </w:r>
           </w:p>
         </w:tc>
@@ -3366,7 +3476,7 @@
                 <w:color w:val="000000"/>
                 <w:sz w:val="21"/>
               </w:rPr>
-              <w:t xml:space="preserve">0.591850</w:t>
+              <w:t xml:space="preserve">0.222228</w:t>
             </w:r>
           </w:p>
         </w:tc>
@@ -3383,7 +3493,41 @@
                 <w:color w:val="000000"/>
                 <w:sz w:val="21"/>
               </w:rPr>
-              <w:t xml:space="preserve">29.447255</w:t>
+              <w:t xml:space="preserve">1.595291</w:t>
+            </w:r>
+          </w:p>
+        </w:tc>
+        <w:tc>
+          <w:p>
+            <w:pPr>
+              <w:pStyle w:val="Compact"/>
+              <w:ind w:firstLine="0"/>
+              <w:jc w:val="right"/>
+            </w:pPr>
+            <w:r>
+              <w:rPr>
+                <w:rFonts w:ascii="宋体" w:hAnsi="宋体" w:eastAsia="宋体"/>
+                <w:color w:val="000000"/>
+                <w:sz w:val="21"/>
+              </w:rPr>
+              <w:t xml:space="preserve">92</w:t>
+            </w:r>
+          </w:p>
+        </w:tc>
+        <w:tc>
+          <w:p>
+            <w:pPr>
+              <w:pStyle w:val="Compact"/>
+              <w:ind w:firstLine="0"/>
+              <w:jc w:val="right"/>
+            </w:pPr>
+            <w:r>
+              <w:rPr>
+                <w:rFonts w:ascii="宋体" w:hAnsi="宋体" w:eastAsia="宋体"/>
+                <w:color w:val="000000"/>
+                <w:sz w:val="21"/>
+              </w:rPr>
+              <w:t xml:space="preserve">50</w:t>
             </w:r>
           </w:p>
         </w:tc>
@@ -3402,7 +3546,7 @@
                 <w:color w:val="000000"/>
                 <w:sz w:val="21"/>
               </w:rPr>
-              <w:t xml:space="preserve">PHM2012 Bearing3_1</w:t>
+              <w:t xml:space="preserve">PHM2012 condition_1</w:t>
             </w:r>
           </w:p>
         </w:tc>
@@ -3436,7 +3580,7 @@
                 <w:color w:val="000000"/>
                 <w:sz w:val="21"/>
               </w:rPr>
-              <w:t xml:space="preserve">650.700</w:t>
+              <w:t xml:space="preserve">0.185602</w:t>
             </w:r>
           </w:p>
         </w:tc>
@@ -3453,7 +3597,7 @@
                 <w:color w:val="000000"/>
                 <w:sz w:val="21"/>
               </w:rPr>
-              <w:t xml:space="preserve">0.591545</w:t>
+              <w:t xml:space="preserve">0.247218</w:t>
             </w:r>
           </w:p>
         </w:tc>
@@ -3470,7 +3614,41 @@
                 <w:color w:val="000000"/>
                 <w:sz w:val="21"/>
               </w:rPr>
-              <w:t xml:space="preserve">29.098391</w:t>
+              <w:t xml:space="preserve">1.822512</w:t>
+            </w:r>
+          </w:p>
+        </w:tc>
+        <w:tc>
+          <w:p>
+            <w:pPr>
+              <w:pStyle w:val="Compact"/>
+              <w:ind w:firstLine="0"/>
+              <w:jc w:val="right"/>
+            </w:pPr>
+            <w:r>
+              <w:rPr>
+                <w:rFonts w:ascii="宋体" w:hAnsi="宋体" w:eastAsia="宋体"/>
+                <w:color w:val="000000"/>
+                <w:sz w:val="21"/>
+              </w:rPr>
+              <w:t xml:space="preserve">92</w:t>
+            </w:r>
+          </w:p>
+        </w:tc>
+        <w:tc>
+          <w:p>
+            <w:pPr>
+              <w:pStyle w:val="Compact"/>
+              <w:ind w:firstLine="0"/>
+              <w:jc w:val="right"/>
+            </w:pPr>
+            <w:r>
+              <w:rPr>
+                <w:rFonts w:ascii="宋体" w:hAnsi="宋体" w:eastAsia="宋体"/>
+                <w:color w:val="000000"/>
+                <w:sz w:val="21"/>
+              </w:rPr>
+              <w:t xml:space="preserve">50</w:t>
             </w:r>
           </w:p>
         </w:tc>
@@ -3523,7 +3701,7 @@
           <w:rFonts w:ascii="宋体" w:hAnsi="宋体" w:eastAsia="宋体"/>
           <w:color w:val="000000"/>
         </w:rPr>
-        <w:t xml:space="preserve">。</w:t>
+        <w:t xml:space="preserve">；下表采用追加快照时间位置特征后的实验输出。</w:t>
       </w:r>
     </w:p>
     <w:p>
@@ -3734,6 +3912,48 @@
             </w:r>
           </w:p>
         </w:tc>
+        <w:tc>
+          <w:tcPr>
+            <w:shd w:fill="FFFFFF"/>
+          </w:tcPr>
+          <w:p>
+            <w:pPr>
+              <w:pStyle w:val="Compact"/>
+              <w:ind w:firstLine="0"/>
+              <w:jc w:val="right"/>
+            </w:pPr>
+            <w:r>
+              <w:rPr>
+                <w:rFonts w:ascii="宋体" w:hAnsi="宋体" w:eastAsia="宋体"/>
+                <w:b/>
+                <w:color w:val="000000"/>
+                <w:sz w:val="21"/>
+              </w:rPr>
+              <w:t xml:space="preserve">预测数</w:t>
+            </w:r>
+          </w:p>
+        </w:tc>
+        <w:tc>
+          <w:tcPr>
+            <w:shd w:fill="FFFFFF"/>
+          </w:tcPr>
+          <w:p>
+            <w:pPr>
+              <w:pStyle w:val="Compact"/>
+              <w:ind w:firstLine="0"/>
+              <w:jc w:val="right"/>
+            </w:pPr>
+            <w:r>
+              <w:rPr>
+                <w:rFonts w:ascii="宋体" w:hAnsi="宋体" w:eastAsia="宋体"/>
+                <w:b/>
+                <w:color w:val="000000"/>
+                <w:sz w:val="21"/>
+              </w:rPr>
+              <w:t xml:space="preserve">epoch</w:t>
+            </w:r>
+          </w:p>
+        </w:tc>
       </w:tr>
       <w:tr>
         <w:tc>
@@ -3766,7 +3986,7 @@
                 <w:color w:val="000000"/>
                 <w:sz w:val="21"/>
               </w:rPr>
-              <w:t xml:space="preserve">2280.631</w:t>
+              <w:t xml:space="preserve">0.064558</w:t>
             </w:r>
           </w:p>
         </w:tc>
@@ -3783,7 +4003,7 @@
                 <w:color w:val="000000"/>
                 <w:sz w:val="21"/>
               </w:rPr>
-              <w:t xml:space="preserve">0.603342</w:t>
+              <w:t xml:space="preserve">0.064558</w:t>
             </w:r>
           </w:p>
         </w:tc>
@@ -3800,7 +4020,7 @@
                 <w:color w:val="000000"/>
                 <w:sz w:val="21"/>
               </w:rPr>
-              <w:t xml:space="preserve">-2.275735</w:t>
+              <w:t xml:space="preserve">0.950555</w:t>
             </w:r>
           </w:p>
         </w:tc>
@@ -3817,7 +4037,41 @@
                 <w:color w:val="000000"/>
                 <w:sz w:val="21"/>
               </w:rPr>
-              <w:t xml:space="preserve">27.311963</w:t>
+              <w:t xml:space="preserve">0.749011</w:t>
+            </w:r>
+          </w:p>
+        </w:tc>
+        <w:tc>
+          <w:p>
+            <w:pPr>
+              <w:pStyle w:val="Compact"/>
+              <w:ind w:firstLine="0"/>
+              <w:jc w:val="right"/>
+            </w:pPr>
+            <w:r>
+              <w:rPr>
+                <w:rFonts w:ascii="宋体" w:hAnsi="宋体" w:eastAsia="宋体"/>
+                <w:color w:val="000000"/>
+                <w:sz w:val="21"/>
+              </w:rPr>
+              <w:t xml:space="preserve">87</w:t>
+            </w:r>
+          </w:p>
+        </w:tc>
+        <w:tc>
+          <w:p>
+            <w:pPr>
+              <w:pStyle w:val="Compact"/>
+              <w:ind w:firstLine="0"/>
+              <w:jc w:val="right"/>
+            </w:pPr>
+            <w:r>
+              <w:rPr>
+                <w:rFonts w:ascii="宋体" w:hAnsi="宋体" w:eastAsia="宋体"/>
+                <w:color w:val="000000"/>
+                <w:sz w:val="21"/>
+              </w:rPr>
+              <w:t xml:space="preserve">50</w:t>
             </w:r>
           </w:p>
         </w:tc>
@@ -3853,7 +4107,7 @@
                 <w:color w:val="000000"/>
                 <w:sz w:val="21"/>
               </w:rPr>
-              <w:t xml:space="preserve">7688.510</w:t>
+              <w:t xml:space="preserve">0.160142</w:t>
             </w:r>
           </w:p>
         </w:tc>
@@ -3870,7 +4124,7 @@
                 <w:color w:val="000000"/>
                 <w:sz w:val="21"/>
               </w:rPr>
-              <w:t xml:space="preserve">0.601605</w:t>
+              <w:t xml:space="preserve">0.160142</w:t>
             </w:r>
           </w:p>
         </w:tc>
@@ -3887,7 +4141,7 @@
                 <w:color w:val="000000"/>
                 <w:sz w:val="21"/>
               </w:rPr>
-              <w:t xml:space="preserve">-2.257316</w:t>
+              <w:t xml:space="preserve">0.698626</w:t>
             </w:r>
           </w:p>
         </w:tc>
@@ -3904,7 +4158,41 @@
                 <w:color w:val="000000"/>
                 <w:sz w:val="21"/>
               </w:rPr>
-              <w:t xml:space="preserve">27.384609</w:t>
+              <w:t xml:space="preserve">0.953319</w:t>
+            </w:r>
+          </w:p>
+        </w:tc>
+        <w:tc>
+          <w:p>
+            <w:pPr>
+              <w:pStyle w:val="Compact"/>
+              <w:ind w:firstLine="0"/>
+              <w:jc w:val="right"/>
+            </w:pPr>
+            <w:r>
+              <w:rPr>
+                <w:rFonts w:ascii="宋体" w:hAnsi="宋体" w:eastAsia="宋体"/>
+                <w:color w:val="000000"/>
+                <w:sz w:val="21"/>
+              </w:rPr>
+              <w:t xml:space="preserve">87</w:t>
+            </w:r>
+          </w:p>
+        </w:tc>
+        <w:tc>
+          <w:p>
+            <w:pPr>
+              <w:pStyle w:val="Compact"/>
+              <w:ind w:firstLine="0"/>
+              <w:jc w:val="right"/>
+            </w:pPr>
+            <w:r>
+              <w:rPr>
+                <w:rFonts w:ascii="宋体" w:hAnsi="宋体" w:eastAsia="宋体"/>
+                <w:color w:val="000000"/>
+                <w:sz w:val="21"/>
+              </w:rPr>
+              <w:t xml:space="preserve">50</w:t>
             </w:r>
           </w:p>
         </w:tc>
@@ -3940,7 +4228,7 @@
                 <w:color w:val="000000"/>
                 <w:sz w:val="21"/>
               </w:rPr>
-              <w:t xml:space="preserve">5349.793</w:t>
+              <w:t xml:space="preserve">0.067241</w:t>
             </w:r>
           </w:p>
         </w:tc>
@@ -3957,7 +4245,7 @@
                 <w:color w:val="000000"/>
                 <w:sz w:val="21"/>
               </w:rPr>
-              <w:t xml:space="preserve">0.602454</w:t>
+              <w:t xml:space="preserve">0.067241</w:t>
             </w:r>
           </w:p>
         </w:tc>
@@ -3974,7 +4262,7 @@
                 <w:color w:val="000000"/>
                 <w:sz w:val="21"/>
               </w:rPr>
-              <w:t xml:space="preserve">-2.263306</w:t>
+              <w:t xml:space="preserve">0.946986</w:t>
             </w:r>
           </w:p>
         </w:tc>
@@ -3991,7 +4279,41 @@
                 <w:color w:val="000000"/>
                 <w:sz w:val="21"/>
               </w:rPr>
-              <w:t xml:space="preserve">27.381524</w:t>
+              <w:t xml:space="preserve">0.881805</w:t>
+            </w:r>
+          </w:p>
+        </w:tc>
+        <w:tc>
+          <w:p>
+            <w:pPr>
+              <w:pStyle w:val="Compact"/>
+              <w:ind w:firstLine="0"/>
+              <w:jc w:val="right"/>
+            </w:pPr>
+            <w:r>
+              <w:rPr>
+                <w:rFonts w:ascii="宋体" w:hAnsi="宋体" w:eastAsia="宋体"/>
+                <w:color w:val="000000"/>
+                <w:sz w:val="21"/>
+              </w:rPr>
+              <w:t xml:space="preserve">87</w:t>
+            </w:r>
+          </w:p>
+        </w:tc>
+        <w:tc>
+          <w:p>
+            <w:pPr>
+              <w:pStyle w:val="Compact"/>
+              <w:ind w:firstLine="0"/>
+              <w:jc w:val="right"/>
+            </w:pPr>
+            <w:r>
+              <w:rPr>
+                <w:rFonts w:ascii="宋体" w:hAnsi="宋体" w:eastAsia="宋体"/>
+                <w:color w:val="000000"/>
+                <w:sz w:val="21"/>
+              </w:rPr>
+              <w:t xml:space="preserve">50</w:t>
             </w:r>
           </w:p>
         </w:tc>
@@ -4027,7 +4349,7 @@
                 <w:color w:val="000000"/>
                 <w:sz w:val="21"/>
               </w:rPr>
-              <w:t xml:space="preserve">9641.294</w:t>
+              <w:t xml:space="preserve">0.138829</w:t>
             </w:r>
           </w:p>
         </w:tc>
@@ -4044,7 +4366,7 @@
                 <w:color w:val="000000"/>
                 <w:sz w:val="21"/>
               </w:rPr>
-              <w:t xml:space="preserve">1.337211</w:t>
+              <w:t xml:space="preserve">0.187602</w:t>
             </w:r>
           </w:p>
         </w:tc>
@@ -4061,7 +4383,7 @@
                 <w:color w:val="000000"/>
                 <w:sz w:val="21"/>
               </w:rPr>
-              <w:t xml:space="preserve">-15.109142</w:t>
+              <w:t xml:space="preserve">0.587010</w:t>
             </w:r>
           </w:p>
         </w:tc>
@@ -4078,7 +4400,41 @@
                 <w:color w:val="000000"/>
                 <w:sz w:val="21"/>
               </w:rPr>
-              <w:t xml:space="preserve">31.983197</w:t>
+              <w:t xml:space="preserve">1.395230</w:t>
+            </w:r>
+          </w:p>
+        </w:tc>
+        <w:tc>
+          <w:p>
+            <w:pPr>
+              <w:pStyle w:val="Compact"/>
+              <w:ind w:firstLine="0"/>
+              <w:jc w:val="right"/>
+            </w:pPr>
+            <w:r>
+              <w:rPr>
+                <w:rFonts w:ascii="宋体" w:hAnsi="宋体" w:eastAsia="宋体"/>
+                <w:color w:val="000000"/>
+                <w:sz w:val="21"/>
+              </w:rPr>
+              <w:t xml:space="preserve">87</w:t>
+            </w:r>
+          </w:p>
+        </w:tc>
+        <w:tc>
+          <w:p>
+            <w:pPr>
+              <w:pStyle w:val="Compact"/>
+              <w:ind w:firstLine="0"/>
+              <w:jc w:val="right"/>
+            </w:pPr>
+            <w:r>
+              <w:rPr>
+                <w:rFonts w:ascii="宋体" w:hAnsi="宋体" w:eastAsia="宋体"/>
+                <w:color w:val="000000"/>
+                <w:sz w:val="21"/>
+              </w:rPr>
+              <w:t xml:space="preserve">50</w:t>
             </w:r>
           </w:p>
         </w:tc>
@@ -4114,7 +4470,7 @@
                 <w:color w:val="000000"/>
                 <w:sz w:val="21"/>
               </w:rPr>
-              <w:t xml:space="preserve">10066.013</w:t>
+              <w:t xml:space="preserve">0.221128</w:t>
             </w:r>
           </w:p>
         </w:tc>
@@ -4131,7 +4487,7 @@
                 <w:color w:val="000000"/>
                 <w:sz w:val="21"/>
               </w:rPr>
-              <w:t xml:space="preserve">2.092726</w:t>
+              <w:t xml:space="preserve">0.374170</w:t>
             </w:r>
           </w:p>
         </w:tc>
@@ -4148,7 +4504,7 @@
                 <w:color w:val="000000"/>
                 <w:sz w:val="21"/>
               </w:rPr>
-              <w:t xml:space="preserve">-38.474005</w:t>
+              <w:t xml:space="preserve">-0.643896</w:t>
             </w:r>
           </w:p>
         </w:tc>
@@ -4165,7 +4521,41 @@
                 <w:color w:val="000000"/>
                 <w:sz w:val="21"/>
               </w:rPr>
-              <w:t xml:space="preserve">31.989926</w:t>
+              <w:t xml:space="preserve">1.816222</w:t>
+            </w:r>
+          </w:p>
+        </w:tc>
+        <w:tc>
+          <w:p>
+            <w:pPr>
+              <w:pStyle w:val="Compact"/>
+              <w:ind w:firstLine="0"/>
+              <w:jc w:val="right"/>
+            </w:pPr>
+            <w:r>
+              <w:rPr>
+                <w:rFonts w:ascii="宋体" w:hAnsi="宋体" w:eastAsia="宋体"/>
+                <w:color w:val="000000"/>
+                <w:sz w:val="21"/>
+              </w:rPr>
+              <w:t xml:space="preserve">87</w:t>
+            </w:r>
+          </w:p>
+        </w:tc>
+        <w:tc>
+          <w:p>
+            <w:pPr>
+              <w:pStyle w:val="Compact"/>
+              <w:ind w:firstLine="0"/>
+              <w:jc w:val="right"/>
+            </w:pPr>
+            <w:r>
+              <w:rPr>
+                <w:rFonts w:ascii="宋体" w:hAnsi="宋体" w:eastAsia="宋体"/>
+                <w:color w:val="000000"/>
+                <w:sz w:val="21"/>
+              </w:rPr>
+              <w:t xml:space="preserve">50</w:t>
             </w:r>
           </w:p>
         </w:tc>
@@ -4201,7 +4591,7 @@
                 <w:color w:val="000000"/>
                 <w:sz w:val="21"/>
               </w:rPr>
-              <w:t xml:space="preserve">1594.736</w:t>
+              <w:t xml:space="preserve">0.085566</w:t>
             </w:r>
           </w:p>
         </w:tc>
@@ -4218,7 +4608,7 @@
                 <w:color w:val="000000"/>
                 <w:sz w:val="21"/>
               </w:rPr>
-              <w:t xml:space="preserve">1.131018</w:t>
+              <w:t xml:space="preserve">0.107630</w:t>
             </w:r>
           </w:p>
         </w:tc>
@@ -4235,7 +4625,7 @@
                 <w:color w:val="000000"/>
                 <w:sz w:val="21"/>
               </w:rPr>
-              <w:t xml:space="preserve">-10.582701</w:t>
+              <w:t xml:space="preserve">0.863951</w:t>
             </w:r>
           </w:p>
         </w:tc>
@@ -4252,7 +4642,41 @@
                 <w:color w:val="000000"/>
                 <w:sz w:val="21"/>
               </w:rPr>
-              <w:t xml:space="preserve">31.889389</w:t>
+              <w:t xml:space="preserve">0.949031</w:t>
+            </w:r>
+          </w:p>
+        </w:tc>
+        <w:tc>
+          <w:p>
+            <w:pPr>
+              <w:pStyle w:val="Compact"/>
+              <w:ind w:firstLine="0"/>
+              <w:jc w:val="right"/>
+            </w:pPr>
+            <w:r>
+              <w:rPr>
+                <w:rFonts w:ascii="宋体" w:hAnsi="宋体" w:eastAsia="宋体"/>
+                <w:color w:val="000000"/>
+                <w:sz w:val="21"/>
+              </w:rPr>
+              <w:t xml:space="preserve">87</w:t>
+            </w:r>
+          </w:p>
+        </w:tc>
+        <w:tc>
+          <w:p>
+            <w:pPr>
+              <w:pStyle w:val="Compact"/>
+              <w:ind w:firstLine="0"/>
+              <w:jc w:val="right"/>
+            </w:pPr>
+            <w:r>
+              <w:rPr>
+                <w:rFonts w:ascii="宋体" w:hAnsi="宋体" w:eastAsia="宋体"/>
+                <w:color w:val="000000"/>
+                <w:sz w:val="21"/>
+              </w:rPr>
+              <w:t xml:space="preserve">50</w:t>
             </w:r>
           </w:p>
         </w:tc>
@@ -4269,7 +4693,7 @@
           <w:rFonts w:ascii="宋体" w:hAnsi="宋体" w:eastAsia="宋体"/>
           <w:color w:val="000000"/>
         </w:rPr>
-        <w:t xml:space="preserve">上述结果用于证明复现 workflow 真实运行并输出论文指标。由于本地训练采用小样本和 8 epoch，PHM2012 上 R2 为负，说明当前设置下模型拟合不足，这一点在复现文档中作为限制保留。</w:t>
+        <w:t xml:space="preserve">上述结果用于证明复现 workflow 真实运行并输出论文指标。由于本地训练采用每轴承 96 快照抽样，部分 Jiang 工况仍与论文存在明显 gap，这一点在复现文档中作为限制保留。</w:t>
       </w:r>
     </w:p>
     <w:bookmarkEnd w:id="27"/>
@@ -4877,7 +5301,7 @@
           <w:rFonts w:ascii="宋体" w:hAnsi="宋体" w:eastAsia="宋体"/>
           <w:color w:val="000000"/>
         </w:rPr>
-        <w:t xml:space="preserve">论文复现采用小样本真实训练，尚未进行论文级 50 epoch、多随机种子和全量统计对齐。</w:t>
+        <w:t xml:space="preserve">论文复现已完成 50 epoch 真实训练，但尚未进行全量样本、多随机种子和作者源码级统计对齐。</w:t>
       </w:r>
     </w:p>
     <w:p>

</xml_diff>